<commit_message>
Contract template: hidden anchors for every template field; phones anchored; template field restore actions
Co-Authored-By: Claude Opus 5.5 <noreply@anthropic.com>
Claude-Session: https://claude.ai/code/session_01USozer2zpKfGeBovA7GUQw
</commit_message>
<xml_diff>
--- a/docs/contracts/IRep_Property_Management_Contract.docx
+++ b/docs/contracts/IRep_Property_Management_Contract.docx
@@ -103,7 +103,7 @@
       <w:tr>
         <w:trPr>
           <w:cantSplit/>
-          <w:trHeight w:val="780" w:hRule="exact"/>
+          <w:trHeight w:val="680" w:hRule="atLeast"/>
         </w:trPr>
         <w:tc>
           <w:tcPr>
@@ -165,10 +165,36 @@
             <w:r>
               <w:rPr>
                 <w:rFonts w:ascii="Calibri" w:cs="Calibri" w:eastAsia="Calibri" w:hAnsi="Calibri"/>
+                <w:color w:val="FFFFFF"/>
+                <w:sz w:val="2"/>
+                <w:szCs w:val="2"/>
+              </w:rPr>
+              <w:t xml:space="preserve">/pmeng1/</w:t>
+            </w:r>
+            <w:r>
+              <w:rPr>
+                <w:rFonts w:ascii="Calibri" w:cs="Calibri" w:eastAsia="Calibri" w:hAnsi="Calibri"/>
                 <w:sz w:val="21"/>
                 <w:szCs w:val="21"/>
               </w:rPr>
-              <w:t xml:space="preserve">New engagement — 12-month Initial Term applies (s. 2.1)	Re-signing an existing landlord (s. 2.10)</w:t>
+              <w:t xml:space="preserve">New engagement — 12-month Initial Term applies (s. 2.1)	</w:t>
+            </w:r>
+            <w:r>
+              <w:rPr>
+                <w:rFonts w:ascii="Calibri" w:cs="Calibri" w:eastAsia="Calibri" w:hAnsi="Calibri"/>
+                <w:color w:val="FFFFFF"/>
+                <w:sz w:val="2"/>
+                <w:szCs w:val="2"/>
+              </w:rPr>
+              <w:t xml:space="preserve">/pmeng2/</w:t>
+            </w:r>
+            <w:r>
+              <w:rPr>
+                <w:rFonts w:ascii="Calibri" w:cs="Calibri" w:eastAsia="Calibri" w:hAnsi="Calibri"/>
+                <w:sz w:val="21"/>
+                <w:szCs w:val="21"/>
+              </w:rPr>
+              <w:t xml:space="preserve">Re-signing an existing landlord (s. 2.10)</w:t>
             </w:r>
           </w:p>
         </w:tc>
@@ -176,7 +202,7 @@
       <w:tr>
         <w:trPr>
           <w:cantSplit/>
-          <w:trHeight w:val="620" w:hRule="exact"/>
+          <w:trHeight w:val="520" w:hRule="atLeast"/>
         </w:trPr>
         <w:tc>
           <w:tcPr>
@@ -293,7 +319,7 @@
       <w:tr>
         <w:trPr>
           <w:cantSplit/>
-          <w:trHeight w:val="560" w:hRule="exact"/>
+          <w:trHeight w:val="480" w:hRule="atLeast"/>
         </w:trPr>
         <w:tc>
           <w:tcPr>
@@ -349,13 +375,21 @@
             <w:pPr>
               <w:spacing w:after="0" w:line="240"/>
             </w:pPr>
+            <w:r>
+              <w:rPr>
+                <w:rFonts w:ascii="Calibri" w:cs="Calibri" w:eastAsia="Calibri" w:hAnsi="Calibri"/>
+                <w:color w:val="FFFFFF"/>
+                <w:sz w:val="2"/>
+                <w:szCs w:val="2"/>
+              </w:rPr>
+              <w:t xml:space="preserve">/pmlis/</w:t>
+            </w:r>
           </w:p>
         </w:tc>
       </w:tr>
       <w:tr>
         <w:trPr>
           <w:cantSplit/>
-          <w:trHeight w:val="400" w:hRule="exact"/>
         </w:trPr>
         <w:tc>
           <w:tcPr>
@@ -496,7 +530,6 @@
       <w:tr>
         <w:trPr>
           <w:cantSplit/>
-          <w:trHeight w:val="400" w:hRule="exact"/>
         </w:trPr>
         <w:tc>
           <w:tcPr>
@@ -566,7 +599,7 @@
     </w:tbl>
     <w:p>
       <w:pPr>
-        <w:spacing w:after="100" w:before="360"/>
+        <w:spacing w:after="100" w:before="240"/>
       </w:pPr>
       <w:r>
         <w:rPr>
@@ -599,7 +632,6 @@
       <w:tr>
         <w:trPr>
           <w:cantSplit/>
-          <w:trHeight w:val="660" w:hRule="exact"/>
         </w:trPr>
         <w:tc>
           <w:tcPr>
@@ -745,7 +777,7 @@
       <w:tr>
         <w:trPr>
           <w:cantSplit/>
-          <w:trHeight w:val="636" w:hRule="exact"/>
+          <w:trHeight w:val="520" w:hRule="atLeast"/>
         </w:trPr>
         <w:tc>
           <w:tcPr>
@@ -768,6 +800,15 @@
             <w:pPr>
               <w:spacing w:after="0" w:line="240"/>
             </w:pPr>
+            <w:r>
+              <w:rPr>
+                <w:rFonts w:ascii="Calibri" w:cs="Calibri" w:eastAsia="Calibri" w:hAnsi="Calibri"/>
+                <w:color w:val="FFFFFF"/>
+                <w:sz w:val="2"/>
+                <w:szCs w:val="2"/>
+              </w:rPr>
+              <w:t xml:space="preserve">/pmo1n/</w:t>
+            </w:r>
           </w:p>
         </w:tc>
         <w:tc>
@@ -791,6 +832,15 @@
             <w:pPr>
               <w:spacing w:after="0" w:line="240"/>
             </w:pPr>
+            <w:r>
+              <w:rPr>
+                <w:rFonts w:ascii="Calibri" w:cs="Calibri" w:eastAsia="Calibri" w:hAnsi="Calibri"/>
+                <w:color w:val="FFFFFF"/>
+                <w:sz w:val="2"/>
+                <w:szCs w:val="2"/>
+              </w:rPr>
+              <w:t xml:space="preserve">/pmo1p/</w:t>
+            </w:r>
           </w:p>
         </w:tc>
         <w:tc>
@@ -814,6 +864,15 @@
             <w:pPr>
               <w:spacing w:after="0" w:line="240"/>
             </w:pPr>
+            <w:r>
+              <w:rPr>
+                <w:rFonts w:ascii="Calibri" w:cs="Calibri" w:eastAsia="Calibri" w:hAnsi="Calibri"/>
+                <w:color w:val="FFFFFF"/>
+                <w:sz w:val="2"/>
+                <w:szCs w:val="2"/>
+              </w:rPr>
+              <w:t xml:space="preserve">/pmo1t/</w:t>
+            </w:r>
             <w:r>
               <w:rPr>
                 <w:rFonts w:ascii="Calibri" w:cs="Calibri" w:eastAsia="Calibri" w:hAnsi="Calibri"/>
@@ -845,13 +904,22 @@
             <w:pPr>
               <w:spacing w:after="0" w:line="240"/>
             </w:pPr>
+            <w:r>
+              <w:rPr>
+                <w:rFonts w:ascii="Calibri" w:cs="Calibri" w:eastAsia="Calibri" w:hAnsi="Calibri"/>
+                <w:color w:val="FFFFFF"/>
+                <w:sz w:val="2"/>
+                <w:szCs w:val="2"/>
+              </w:rPr>
+              <w:t xml:space="preserve">/pmo1e/</w:t>
+            </w:r>
           </w:p>
         </w:tc>
       </w:tr>
       <w:tr>
         <w:trPr>
           <w:cantSplit/>
-          <w:trHeight w:val="636" w:hRule="exact"/>
+          <w:trHeight w:val="520" w:hRule="atLeast"/>
         </w:trPr>
         <w:tc>
           <w:tcPr>
@@ -874,6 +942,15 @@
             <w:pPr>
               <w:spacing w:after="0" w:line="240"/>
             </w:pPr>
+            <w:r>
+              <w:rPr>
+                <w:rFonts w:ascii="Calibri" w:cs="Calibri" w:eastAsia="Calibri" w:hAnsi="Calibri"/>
+                <w:color w:val="FFFFFF"/>
+                <w:sz w:val="2"/>
+                <w:szCs w:val="2"/>
+              </w:rPr>
+              <w:t xml:space="preserve">/pmo2n/</w:t>
+            </w:r>
           </w:p>
         </w:tc>
         <w:tc>
@@ -897,6 +974,15 @@
             <w:pPr>
               <w:spacing w:after="0" w:line="240"/>
             </w:pPr>
+            <w:r>
+              <w:rPr>
+                <w:rFonts w:ascii="Calibri" w:cs="Calibri" w:eastAsia="Calibri" w:hAnsi="Calibri"/>
+                <w:color w:val="FFFFFF"/>
+                <w:sz w:val="2"/>
+                <w:szCs w:val="2"/>
+              </w:rPr>
+              <w:t xml:space="preserve">/pmo2p/</w:t>
+            </w:r>
           </w:p>
         </w:tc>
         <w:tc>
@@ -920,6 +1006,15 @@
             <w:pPr>
               <w:spacing w:after="0" w:line="240"/>
             </w:pPr>
+            <w:r>
+              <w:rPr>
+                <w:rFonts w:ascii="Calibri" w:cs="Calibri" w:eastAsia="Calibri" w:hAnsi="Calibri"/>
+                <w:color w:val="FFFFFF"/>
+                <w:sz w:val="2"/>
+                <w:szCs w:val="2"/>
+              </w:rPr>
+              <w:t xml:space="preserve">/pmo2t/</w:t>
+            </w:r>
             <w:r>
               <w:rPr>
                 <w:rFonts w:ascii="Calibri" w:cs="Calibri" w:eastAsia="Calibri" w:hAnsi="Calibri"/>
@@ -951,13 +1046,22 @@
             <w:pPr>
               <w:spacing w:after="0" w:line="240"/>
             </w:pPr>
+            <w:r>
+              <w:rPr>
+                <w:rFonts w:ascii="Calibri" w:cs="Calibri" w:eastAsia="Calibri" w:hAnsi="Calibri"/>
+                <w:color w:val="FFFFFF"/>
+                <w:sz w:val="2"/>
+                <w:szCs w:val="2"/>
+              </w:rPr>
+              <w:t xml:space="preserve">/pmo2e/</w:t>
+            </w:r>
           </w:p>
         </w:tc>
       </w:tr>
       <w:tr>
         <w:trPr>
           <w:cantSplit/>
-          <w:trHeight w:val="636" w:hRule="exact"/>
+          <w:trHeight w:val="520" w:hRule="atLeast"/>
         </w:trPr>
         <w:tc>
           <w:tcPr>
@@ -980,6 +1084,15 @@
             <w:pPr>
               <w:spacing w:after="0" w:line="240"/>
             </w:pPr>
+            <w:r>
+              <w:rPr>
+                <w:rFonts w:ascii="Calibri" w:cs="Calibri" w:eastAsia="Calibri" w:hAnsi="Calibri"/>
+                <w:color w:val="FFFFFF"/>
+                <w:sz w:val="2"/>
+                <w:szCs w:val="2"/>
+              </w:rPr>
+              <w:t xml:space="preserve">/pmo3n/</w:t>
+            </w:r>
           </w:p>
         </w:tc>
         <w:tc>
@@ -1003,6 +1116,15 @@
             <w:pPr>
               <w:spacing w:after="0" w:line="240"/>
             </w:pPr>
+            <w:r>
+              <w:rPr>
+                <w:rFonts w:ascii="Calibri" w:cs="Calibri" w:eastAsia="Calibri" w:hAnsi="Calibri"/>
+                <w:color w:val="FFFFFF"/>
+                <w:sz w:val="2"/>
+                <w:szCs w:val="2"/>
+              </w:rPr>
+              <w:t xml:space="preserve">/pmo3p/</w:t>
+            </w:r>
           </w:p>
         </w:tc>
         <w:tc>
@@ -1026,6 +1148,15 @@
             <w:pPr>
               <w:spacing w:after="0" w:line="240"/>
             </w:pPr>
+            <w:r>
+              <w:rPr>
+                <w:rFonts w:ascii="Calibri" w:cs="Calibri" w:eastAsia="Calibri" w:hAnsi="Calibri"/>
+                <w:color w:val="FFFFFF"/>
+                <w:sz w:val="2"/>
+                <w:szCs w:val="2"/>
+              </w:rPr>
+              <w:t xml:space="preserve">/pmo3t/</w:t>
+            </w:r>
             <w:r>
               <w:rPr>
                 <w:rFonts w:ascii="Calibri" w:cs="Calibri" w:eastAsia="Calibri" w:hAnsi="Calibri"/>
@@ -1057,13 +1188,22 @@
             <w:pPr>
               <w:spacing w:after="0" w:line="240"/>
             </w:pPr>
+            <w:r>
+              <w:rPr>
+                <w:rFonts w:ascii="Calibri" w:cs="Calibri" w:eastAsia="Calibri" w:hAnsi="Calibri"/>
+                <w:color w:val="FFFFFF"/>
+                <w:sz w:val="2"/>
+                <w:szCs w:val="2"/>
+              </w:rPr>
+              <w:t xml:space="preserve">/pmo3e/</w:t>
+            </w:r>
           </w:p>
         </w:tc>
       </w:tr>
       <w:tr>
         <w:trPr>
           <w:cantSplit/>
-          <w:trHeight w:val="636" w:hRule="exact"/>
+          <w:trHeight w:val="520" w:hRule="atLeast"/>
         </w:trPr>
         <w:tc>
           <w:tcPr>
@@ -1086,6 +1226,15 @@
             <w:pPr>
               <w:spacing w:after="0" w:line="240"/>
             </w:pPr>
+            <w:r>
+              <w:rPr>
+                <w:rFonts w:ascii="Calibri" w:cs="Calibri" w:eastAsia="Calibri" w:hAnsi="Calibri"/>
+                <w:color w:val="FFFFFF"/>
+                <w:sz w:val="2"/>
+                <w:szCs w:val="2"/>
+              </w:rPr>
+              <w:t xml:space="preserve">/pmo4n/</w:t>
+            </w:r>
           </w:p>
         </w:tc>
         <w:tc>
@@ -1109,6 +1258,15 @@
             <w:pPr>
               <w:spacing w:after="0" w:line="240"/>
             </w:pPr>
+            <w:r>
+              <w:rPr>
+                <w:rFonts w:ascii="Calibri" w:cs="Calibri" w:eastAsia="Calibri" w:hAnsi="Calibri"/>
+                <w:color w:val="FFFFFF"/>
+                <w:sz w:val="2"/>
+                <w:szCs w:val="2"/>
+              </w:rPr>
+              <w:t xml:space="preserve">/pmo4p/</w:t>
+            </w:r>
           </w:p>
         </w:tc>
         <w:tc>
@@ -1132,6 +1290,15 @@
             <w:pPr>
               <w:spacing w:after="0" w:line="240"/>
             </w:pPr>
+            <w:r>
+              <w:rPr>
+                <w:rFonts w:ascii="Calibri" w:cs="Calibri" w:eastAsia="Calibri" w:hAnsi="Calibri"/>
+                <w:color w:val="FFFFFF"/>
+                <w:sz w:val="2"/>
+                <w:szCs w:val="2"/>
+              </w:rPr>
+              <w:t xml:space="preserve">/pmo4t/</w:t>
+            </w:r>
             <w:r>
               <w:rPr>
                 <w:rFonts w:ascii="Calibri" w:cs="Calibri" w:eastAsia="Calibri" w:hAnsi="Calibri"/>
@@ -1163,13 +1330,22 @@
             <w:pPr>
               <w:spacing w:after="0" w:line="240"/>
             </w:pPr>
+            <w:r>
+              <w:rPr>
+                <w:rFonts w:ascii="Calibri" w:cs="Calibri" w:eastAsia="Calibri" w:hAnsi="Calibri"/>
+                <w:color w:val="FFFFFF"/>
+                <w:sz w:val="2"/>
+                <w:szCs w:val="2"/>
+              </w:rPr>
+              <w:t xml:space="preserve">/pmo4e/</w:t>
+            </w:r>
           </w:p>
         </w:tc>
       </w:tr>
       <w:tr>
         <w:trPr>
           <w:cantSplit/>
-          <w:trHeight w:val="636" w:hRule="exact"/>
+          <w:trHeight w:val="520" w:hRule="atLeast"/>
         </w:trPr>
         <w:tc>
           <w:tcPr>
@@ -1192,6 +1368,15 @@
             <w:pPr>
               <w:spacing w:after="0" w:line="240"/>
             </w:pPr>
+            <w:r>
+              <w:rPr>
+                <w:rFonts w:ascii="Calibri" w:cs="Calibri" w:eastAsia="Calibri" w:hAnsi="Calibri"/>
+                <w:color w:val="FFFFFF"/>
+                <w:sz w:val="2"/>
+                <w:szCs w:val="2"/>
+              </w:rPr>
+              <w:t xml:space="preserve">/pmo5n/</w:t>
+            </w:r>
           </w:p>
         </w:tc>
         <w:tc>
@@ -1215,6 +1400,15 @@
             <w:pPr>
               <w:spacing w:after="0" w:line="240"/>
             </w:pPr>
+            <w:r>
+              <w:rPr>
+                <w:rFonts w:ascii="Calibri" w:cs="Calibri" w:eastAsia="Calibri" w:hAnsi="Calibri"/>
+                <w:color w:val="FFFFFF"/>
+                <w:sz w:val="2"/>
+                <w:szCs w:val="2"/>
+              </w:rPr>
+              <w:t xml:space="preserve">/pmo5p/</w:t>
+            </w:r>
           </w:p>
         </w:tc>
         <w:tc>
@@ -1238,6 +1432,15 @@
             <w:pPr>
               <w:spacing w:after="0" w:line="240"/>
             </w:pPr>
+            <w:r>
+              <w:rPr>
+                <w:rFonts w:ascii="Calibri" w:cs="Calibri" w:eastAsia="Calibri" w:hAnsi="Calibri"/>
+                <w:color w:val="FFFFFF"/>
+                <w:sz w:val="2"/>
+                <w:szCs w:val="2"/>
+              </w:rPr>
+              <w:t xml:space="preserve">/pmo5t/</w:t>
+            </w:r>
             <w:r>
               <w:rPr>
                 <w:rFonts w:ascii="Calibri" w:cs="Calibri" w:eastAsia="Calibri" w:hAnsi="Calibri"/>
@@ -1269,13 +1472,22 @@
             <w:pPr>
               <w:spacing w:after="0" w:line="240"/>
             </w:pPr>
+            <w:r>
+              <w:rPr>
+                <w:rFonts w:ascii="Calibri" w:cs="Calibri" w:eastAsia="Calibri" w:hAnsi="Calibri"/>
+                <w:color w:val="FFFFFF"/>
+                <w:sz w:val="2"/>
+                <w:szCs w:val="2"/>
+              </w:rPr>
+              <w:t xml:space="preserve">/pmo5e/</w:t>
+            </w:r>
           </w:p>
         </w:tc>
       </w:tr>
       <w:tr>
         <w:trPr>
           <w:cantSplit/>
-          <w:trHeight w:val="636" w:hRule="exact"/>
+          <w:trHeight w:val="520" w:hRule="atLeast"/>
         </w:trPr>
         <w:tc>
           <w:tcPr>
@@ -1298,6 +1510,15 @@
             <w:pPr>
               <w:spacing w:after="0" w:line="240"/>
             </w:pPr>
+            <w:r>
+              <w:rPr>
+                <w:rFonts w:ascii="Calibri" w:cs="Calibri" w:eastAsia="Calibri" w:hAnsi="Calibri"/>
+                <w:color w:val="FFFFFF"/>
+                <w:sz w:val="2"/>
+                <w:szCs w:val="2"/>
+              </w:rPr>
+              <w:t xml:space="preserve">/pmo6n/</w:t>
+            </w:r>
           </w:p>
         </w:tc>
         <w:tc>
@@ -1321,6 +1542,15 @@
             <w:pPr>
               <w:spacing w:after="0" w:line="240"/>
             </w:pPr>
+            <w:r>
+              <w:rPr>
+                <w:rFonts w:ascii="Calibri" w:cs="Calibri" w:eastAsia="Calibri" w:hAnsi="Calibri"/>
+                <w:color w:val="FFFFFF"/>
+                <w:sz w:val="2"/>
+                <w:szCs w:val="2"/>
+              </w:rPr>
+              <w:t xml:space="preserve">/pmo6p/</w:t>
+            </w:r>
           </w:p>
         </w:tc>
         <w:tc>
@@ -1344,6 +1574,15 @@
             <w:pPr>
               <w:spacing w:after="0" w:line="240"/>
             </w:pPr>
+            <w:r>
+              <w:rPr>
+                <w:rFonts w:ascii="Calibri" w:cs="Calibri" w:eastAsia="Calibri" w:hAnsi="Calibri"/>
+                <w:color w:val="FFFFFF"/>
+                <w:sz w:val="2"/>
+                <w:szCs w:val="2"/>
+              </w:rPr>
+              <w:t xml:space="preserve">/pmo6t/</w:t>
+            </w:r>
             <w:r>
               <w:rPr>
                 <w:rFonts w:ascii="Calibri" w:cs="Calibri" w:eastAsia="Calibri" w:hAnsi="Calibri"/>
@@ -1375,13 +1614,22 @@
             <w:pPr>
               <w:spacing w:after="0" w:line="240"/>
             </w:pPr>
+            <w:r>
+              <w:rPr>
+                <w:rFonts w:ascii="Calibri" w:cs="Calibri" w:eastAsia="Calibri" w:hAnsi="Calibri"/>
+                <w:color w:val="FFFFFF"/>
+                <w:sz w:val="2"/>
+                <w:szCs w:val="2"/>
+              </w:rPr>
+              <w:t xml:space="preserve">/pmo6e/</w:t>
+            </w:r>
           </w:p>
         </w:tc>
       </w:tr>
     </w:tbl>
     <w:p>
       <w:pPr>
-        <w:spacing w:after="80" w:before="360"/>
+        <w:spacing w:after="80" w:before="240"/>
       </w:pPr>
       <w:r>
         <w:rPr>
@@ -1424,7 +1672,7 @@
       <w:tr>
         <w:trPr>
           <w:cantSplit/>
-          <w:trHeight w:val="560" w:hRule="exact"/>
+          <w:trHeight w:val="480" w:hRule="atLeast"/>
         </w:trPr>
         <w:tc>
           <w:tcPr>
@@ -1480,13 +1728,22 @@
             <w:pPr>
               <w:spacing w:after="0" w:line="240"/>
             </w:pPr>
+            <w:r>
+              <w:rPr>
+                <w:rFonts w:ascii="Calibri" w:cs="Calibri" w:eastAsia="Calibri" w:hAnsi="Calibri"/>
+                <w:color w:val="FFFFFF"/>
+                <w:sz w:val="2"/>
+                <w:szCs w:val="2"/>
+              </w:rPr>
+              <w:t xml:space="preserve">/pmsn/</w:t>
+            </w:r>
           </w:p>
         </w:tc>
       </w:tr>
       <w:tr>
         <w:trPr>
           <w:cantSplit/>
-          <w:trHeight w:val="560" w:hRule="exact"/>
+          <w:trHeight w:val="480" w:hRule="atLeast"/>
         </w:trPr>
         <w:tc>
           <w:tcPr>
@@ -1542,13 +1799,22 @@
             <w:pPr>
               <w:spacing w:after="0" w:line="240"/>
             </w:pPr>
+            <w:r>
+              <w:rPr>
+                <w:rFonts w:ascii="Calibri" w:cs="Calibri" w:eastAsia="Calibri" w:hAnsi="Calibri"/>
+                <w:color w:val="FFFFFF"/>
+                <w:sz w:val="2"/>
+                <w:szCs w:val="2"/>
+              </w:rPr>
+              <w:t xml:space="preserve">/pmsc/</w:t>
+            </w:r>
           </w:p>
         </w:tc>
       </w:tr>
       <w:tr>
         <w:trPr>
           <w:cantSplit/>
-          <w:trHeight w:val="560" w:hRule="exact"/>
+          <w:trHeight w:val="480" w:hRule="atLeast"/>
         </w:trPr>
         <w:tc>
           <w:tcPr>
@@ -1606,6 +1872,15 @@
             <w:r>
               <w:rPr>
                 <w:rFonts w:ascii="Calibri" w:cs="Calibri" w:eastAsia="Calibri" w:hAnsi="Calibri"/>
+                <w:color w:val="FFFFFF"/>
+                <w:sz w:val="2"/>
+                <w:szCs w:val="2"/>
+              </w:rPr>
+              <w:t xml:space="preserve">/pmst/</w:t>
+            </w:r>
+            <w:r>
+              <w:rPr>
+                <w:rFonts w:ascii="Calibri" w:cs="Calibri" w:eastAsia="Calibri" w:hAnsi="Calibri"/>
                 <w:sz w:val="21"/>
                 <w:szCs w:val="21"/>
               </w:rPr>
@@ -1666,15 +1941,23 @@
             <w:pPr>
               <w:spacing w:after="0" w:line="240"/>
             </w:pPr>
+            <w:r>
+              <w:rPr>
+                <w:rFonts w:ascii="Calibri" w:cs="Calibri" w:eastAsia="Calibri" w:hAnsi="Calibri"/>
+                <w:color w:val="FFFFFF"/>
+                <w:sz w:val="2"/>
+                <w:szCs w:val="2"/>
+              </w:rPr>
+              <w:t xml:space="preserve">/pmse/</w:t>
+            </w:r>
           </w:p>
         </w:tc>
       </w:tr>
     </w:tbl>
     <w:p>
-      <w:pPr>
-        <w:pageBreakBefore/>
-        <w:spacing w:after="0" w:line="600" w:lineRule="exact"/>
-      </w:pPr>
+      <w:r>
+        <w:br w:type="page"/>
+      </w:r>
     </w:p>
     <w:p>
       <w:pPr>
@@ -1718,7 +2001,6 @@
       <w:tr>
         <w:trPr>
           <w:cantSplit/>
-          <w:trHeight w:val="400" w:hRule="exact"/>
         </w:trPr>
         <w:tc>
           <w:tcPr>
@@ -1852,7 +2134,6 @@
       <w:tr>
         <w:trPr>
           <w:cantSplit/>
-          <w:trHeight w:val="400" w:hRule="exact"/>
         </w:trPr>
         <w:tc>
           <w:tcPr>
@@ -1984,7 +2265,6 @@
       <w:tr>
         <w:trPr>
           <w:cantSplit/>
-          <w:trHeight w:val="400" w:hRule="exact"/>
         </w:trPr>
         <w:tc>
           <w:tcPr>
@@ -2103,7 +2383,7 @@
         <w:pBdr>
           <w:bottom w:val="single" w:color="BFC9D9" w:sz="4" w:space="2"/>
         </w:pBdr>
-        <w:spacing w:after="120" w:before="580"/>
+        <w:spacing w:after="120" w:before="320"/>
       </w:pPr>
       <w:r>
         <w:rPr>
@@ -2137,7 +2417,6 @@
       <w:tr>
         <w:trPr>
           <w:cantSplit/>
-          <w:trHeight w:val="400" w:hRule="exact"/>
         </w:trPr>
         <w:tc>
           <w:tcPr>
@@ -2206,7 +2485,6 @@
       <w:tr>
         <w:trPr>
           <w:cantSplit/>
-          <w:trHeight w:val="400" w:hRule="exact"/>
         </w:trPr>
         <w:tc>
           <w:tcPr>
@@ -2275,7 +2553,7 @@
       <w:tr>
         <w:trPr>
           <w:cantSplit/>
-          <w:trHeight w:val="560" w:hRule="exact"/>
+          <w:trHeight w:val="480" w:hRule="atLeast"/>
         </w:trPr>
         <w:tc>
           <w:tcPr>
@@ -2330,13 +2608,22 @@
             <w:pPr>
               <w:spacing w:after="0" w:line="240"/>
             </w:pPr>
+            <w:r>
+              <w:rPr>
+                <w:rFonts w:ascii="Calibri" w:cs="Calibri" w:eastAsia="Calibri" w:hAnsi="Calibri"/>
+                <w:color w:val="FFFFFF"/>
+                <w:sz w:val="2"/>
+                <w:szCs w:val="2"/>
+              </w:rPr>
+              <w:t xml:space="preserve">/pmptype/</w:t>
+            </w:r>
           </w:p>
         </w:tc>
       </w:tr>
       <w:tr>
         <w:trPr>
           <w:cantSplit/>
-          <w:trHeight w:val="560" w:hRule="exact"/>
+          <w:trHeight w:val="480" w:hRule="atLeast"/>
         </w:trPr>
         <w:tc>
           <w:tcPr>
@@ -2391,13 +2678,22 @@
             <w:pPr>
               <w:spacing w:after="0" w:line="240"/>
             </w:pPr>
+            <w:r>
+              <w:rPr>
+                <w:rFonts w:ascii="Calibri" w:cs="Calibri" w:eastAsia="Calibri" w:hAnsi="Calibri"/>
+                <w:color w:val="FFFFFF"/>
+                <w:sz w:val="2"/>
+                <w:szCs w:val="2"/>
+              </w:rPr>
+              <w:t xml:space="preserve">/pmunits/</w:t>
+            </w:r>
           </w:p>
         </w:tc>
       </w:tr>
       <w:tr>
         <w:trPr>
           <w:cantSplit/>
-          <w:trHeight w:val="560" w:hRule="exact"/>
+          <w:trHeight w:val="480" w:hRule="atLeast"/>
         </w:trPr>
         <w:tc>
           <w:tcPr>
@@ -2452,13 +2748,21 @@
             <w:pPr>
               <w:spacing w:after="0" w:line="240"/>
             </w:pPr>
+            <w:r>
+              <w:rPr>
+                <w:rFonts w:ascii="Calibri" w:cs="Calibri" w:eastAsia="Calibri" w:hAnsi="Calibri"/>
+                <w:color w:val="FFFFFF"/>
+                <w:sz w:val="2"/>
+                <w:szCs w:val="2"/>
+              </w:rPr>
+              <w:t xml:space="preserve">/pmleases/</w:t>
+            </w:r>
           </w:p>
         </w:tc>
       </w:tr>
       <w:tr>
         <w:trPr>
           <w:cantSplit/>
-          <w:trHeight w:val="400" w:hRule="exact"/>
         </w:trPr>
         <w:tc>
           <w:tcPr>
@@ -2528,7 +2832,7 @@
     <w:p>
       <w:pPr>
         <w:keepNext/>
-        <w:spacing w:after="120" w:before="300"/>
+        <w:spacing w:after="120" w:before="240"/>
       </w:pPr>
       <w:r>
         <w:rPr>
@@ -7912,12 +8216,21 @@
               <w:bottom w:type="dxa" w:w="60"/>
               <w:right w:type="dxa" w:w="120"/>
             </w:tcMar>
-            <w:vAlign w:val="top"/>
-          </w:tcPr>
-          <w:p>
-            <w:pPr>
-              <w:spacing w:after="0" w:line="240"/>
-            </w:pPr>
+            <w:vAlign w:val="bottom"/>
+          </w:tcPr>
+          <w:p>
+            <w:pPr>
+              <w:spacing w:after="0" w:line="240"/>
+            </w:pPr>
+            <w:r>
+              <w:rPr>
+                <w:rFonts w:ascii="Calibri" w:cs="Calibri" w:eastAsia="Calibri" w:hAnsi="Calibri"/>
+                <w:color w:val="FFFFFF"/>
+                <w:sz w:val="2"/>
+                <w:szCs w:val="2"/>
+              </w:rPr>
+              <w:t xml:space="preserve">/pmsig1/</w:t>
+            </w:r>
           </w:p>
         </w:tc>
         <w:tc>
@@ -7958,12 +8271,21 @@
               <w:bottom w:type="dxa" w:w="60"/>
               <w:right w:type="dxa" w:w="120"/>
             </w:tcMar>
-            <w:vAlign w:val="top"/>
-          </w:tcPr>
-          <w:p>
-            <w:pPr>
-              <w:spacing w:after="0" w:line="240"/>
-            </w:pPr>
+            <w:vAlign w:val="bottom"/>
+          </w:tcPr>
+          <w:p>
+            <w:pPr>
+              <w:spacing w:after="0" w:line="240"/>
+            </w:pPr>
+            <w:r>
+              <w:rPr>
+                <w:rFonts w:ascii="Calibri" w:cs="Calibri" w:eastAsia="Calibri" w:hAnsi="Calibri"/>
+                <w:color w:val="FFFFFF"/>
+                <w:sz w:val="2"/>
+                <w:szCs w:val="2"/>
+              </w:rPr>
+              <w:t xml:space="preserve">/pmsig2/</w:t>
+            </w:r>
           </w:p>
         </w:tc>
       </w:tr>
@@ -8080,12 +8402,21 @@
               <w:bottom w:type="dxa" w:w="60"/>
               <w:right w:type="dxa" w:w="120"/>
             </w:tcMar>
-            <w:vAlign w:val="top"/>
-          </w:tcPr>
-          <w:p>
-            <w:pPr>
-              <w:spacing w:after="0" w:line="240"/>
-            </w:pPr>
+            <w:vAlign w:val="bottom"/>
+          </w:tcPr>
+          <w:p>
+            <w:pPr>
+              <w:spacing w:after="0" w:line="240"/>
+            </w:pPr>
+            <w:r>
+              <w:rPr>
+                <w:rFonts w:ascii="Calibri" w:cs="Calibri" w:eastAsia="Calibri" w:hAnsi="Calibri"/>
+                <w:color w:val="FFFFFF"/>
+                <w:sz w:val="2"/>
+                <w:szCs w:val="2"/>
+              </w:rPr>
+              <w:t xml:space="preserve">/pmpn1/</w:t>
+            </w:r>
           </w:p>
         </w:tc>
         <w:tc>
@@ -8126,12 +8457,21 @@
               <w:bottom w:type="dxa" w:w="60"/>
               <w:right w:type="dxa" w:w="120"/>
             </w:tcMar>
-            <w:vAlign w:val="top"/>
-          </w:tcPr>
-          <w:p>
-            <w:pPr>
-              <w:spacing w:after="0" w:line="240"/>
-            </w:pPr>
+            <w:vAlign w:val="bottom"/>
+          </w:tcPr>
+          <w:p>
+            <w:pPr>
+              <w:spacing w:after="0" w:line="240"/>
+            </w:pPr>
+            <w:r>
+              <w:rPr>
+                <w:rFonts w:ascii="Calibri" w:cs="Calibri" w:eastAsia="Calibri" w:hAnsi="Calibri"/>
+                <w:color w:val="FFFFFF"/>
+                <w:sz w:val="2"/>
+                <w:szCs w:val="2"/>
+              </w:rPr>
+              <w:t xml:space="preserve">/pmpn2/</w:t>
+            </w:r>
           </w:p>
         </w:tc>
       </w:tr>
@@ -8248,12 +8588,21 @@
               <w:bottom w:type="dxa" w:w="60"/>
               <w:right w:type="dxa" w:w="120"/>
             </w:tcMar>
-            <w:vAlign w:val="top"/>
-          </w:tcPr>
-          <w:p>
-            <w:pPr>
-              <w:spacing w:after="0" w:line="240"/>
-            </w:pPr>
+            <w:vAlign w:val="bottom"/>
+          </w:tcPr>
+          <w:p>
+            <w:pPr>
+              <w:spacing w:after="0" w:line="240"/>
+            </w:pPr>
+            <w:r>
+              <w:rPr>
+                <w:rFonts w:ascii="Calibri" w:cs="Calibri" w:eastAsia="Calibri" w:hAnsi="Calibri"/>
+                <w:color w:val="FFFFFF"/>
+                <w:sz w:val="2"/>
+                <w:szCs w:val="2"/>
+              </w:rPr>
+              <w:t xml:space="preserve">/pmcap1/</w:t>
+            </w:r>
           </w:p>
         </w:tc>
         <w:tc>
@@ -8294,12 +8643,21 @@
               <w:bottom w:type="dxa" w:w="60"/>
               <w:right w:type="dxa" w:w="120"/>
             </w:tcMar>
-            <w:vAlign w:val="top"/>
-          </w:tcPr>
-          <w:p>
-            <w:pPr>
-              <w:spacing w:after="0" w:line="240"/>
-            </w:pPr>
+            <w:vAlign w:val="bottom"/>
+          </w:tcPr>
+          <w:p>
+            <w:pPr>
+              <w:spacing w:after="0" w:line="240"/>
+            </w:pPr>
+            <w:r>
+              <w:rPr>
+                <w:rFonts w:ascii="Calibri" w:cs="Calibri" w:eastAsia="Calibri" w:hAnsi="Calibri"/>
+                <w:color w:val="FFFFFF"/>
+                <w:sz w:val="2"/>
+                <w:szCs w:val="2"/>
+              </w:rPr>
+              <w:t xml:space="preserve">/pmttl2/</w:t>
+            </w:r>
           </w:p>
         </w:tc>
       </w:tr>
@@ -8416,12 +8774,21 @@
               <w:bottom w:type="dxa" w:w="60"/>
               <w:right w:type="dxa" w:w="120"/>
             </w:tcMar>
-            <w:vAlign w:val="top"/>
-          </w:tcPr>
-          <w:p>
-            <w:pPr>
-              <w:spacing w:after="0" w:line="240"/>
-            </w:pPr>
+            <w:vAlign w:val="bottom"/>
+          </w:tcPr>
+          <w:p>
+            <w:pPr>
+              <w:spacing w:after="0" w:line="240"/>
+            </w:pPr>
+            <w:r>
+              <w:rPr>
+                <w:rFonts w:ascii="Calibri" w:cs="Calibri" w:eastAsia="Calibri" w:hAnsi="Calibri"/>
+                <w:color w:val="FFFFFF"/>
+                <w:sz w:val="2"/>
+                <w:szCs w:val="2"/>
+              </w:rPr>
+              <w:t xml:space="preserve">/pmdt1/</w:t>
+            </w:r>
           </w:p>
         </w:tc>
         <w:tc>
@@ -8462,12 +8829,21 @@
               <w:bottom w:type="dxa" w:w="60"/>
               <w:right w:type="dxa" w:w="120"/>
             </w:tcMar>
-            <w:vAlign w:val="top"/>
-          </w:tcPr>
-          <w:p>
-            <w:pPr>
-              <w:spacing w:after="0" w:line="240"/>
-            </w:pPr>
+            <w:vAlign w:val="bottom"/>
+          </w:tcPr>
+          <w:p>
+            <w:pPr>
+              <w:spacing w:after="0" w:line="240"/>
+            </w:pPr>
+            <w:r>
+              <w:rPr>
+                <w:rFonts w:ascii="Calibri" w:cs="Calibri" w:eastAsia="Calibri" w:hAnsi="Calibri"/>
+                <w:color w:val="FFFFFF"/>
+                <w:sz w:val="2"/>
+                <w:szCs w:val="2"/>
+              </w:rPr>
+              <w:t xml:space="preserve">/pmdt2/</w:t>
+            </w:r>
           </w:p>
         </w:tc>
       </w:tr>
@@ -11577,7 +11953,7 @@
       <w:tr>
         <w:trPr>
           <w:cantSplit/>
-          <w:trHeight w:val="636" w:hRule="exact"/>
+          <w:trHeight w:val="560" w:hRule="atLeast"/>
         </w:trPr>
         <w:tc>
           <w:tcPr>
@@ -11631,6 +12007,15 @@
             <w:pPr>
               <w:spacing w:after="0" w:line="240"/>
             </w:pPr>
+            <w:r>
+              <w:rPr>
+                <w:rFonts w:ascii="Calibri" w:cs="Calibri" w:eastAsia="Calibri" w:hAnsi="Calibri"/>
+                <w:color w:val="FFFFFF"/>
+                <w:sz w:val="2"/>
+                <w:szCs w:val="2"/>
+              </w:rPr>
+              <w:t xml:space="preserve">/pmL1c1/</w:t>
+            </w:r>
           </w:p>
         </w:tc>
         <w:tc>
@@ -11654,6 +12039,15 @@
             <w:pPr>
               <w:spacing w:after="0" w:line="240"/>
             </w:pPr>
+            <w:r>
+              <w:rPr>
+                <w:rFonts w:ascii="Calibri" w:cs="Calibri" w:eastAsia="Calibri" w:hAnsi="Calibri"/>
+                <w:color w:val="FFFFFF"/>
+                <w:sz w:val="2"/>
+                <w:szCs w:val="2"/>
+              </w:rPr>
+              <w:t xml:space="preserve">/pmL1c2/</w:t>
+            </w:r>
           </w:p>
         </w:tc>
         <w:tc>
@@ -11677,6 +12071,15 @@
             <w:pPr>
               <w:spacing w:after="0" w:line="240"/>
             </w:pPr>
+            <w:r>
+              <w:rPr>
+                <w:rFonts w:ascii="Calibri" w:cs="Calibri" w:eastAsia="Calibri" w:hAnsi="Calibri"/>
+                <w:color w:val="FFFFFF"/>
+                <w:sz w:val="2"/>
+                <w:szCs w:val="2"/>
+              </w:rPr>
+              <w:t xml:space="preserve">/pmL1c3/</w:t>
+            </w:r>
           </w:p>
         </w:tc>
         <w:tc>
@@ -11700,6 +12103,15 @@
             <w:pPr>
               <w:spacing w:after="0" w:line="240"/>
             </w:pPr>
+            <w:r>
+              <w:rPr>
+                <w:rFonts w:ascii="Calibri" w:cs="Calibri" w:eastAsia="Calibri" w:hAnsi="Calibri"/>
+                <w:color w:val="FFFFFF"/>
+                <w:sz w:val="2"/>
+                <w:szCs w:val="2"/>
+              </w:rPr>
+              <w:t xml:space="preserve">/pmL1c4/</w:t>
+            </w:r>
           </w:p>
         </w:tc>
         <w:tc>
@@ -11723,13 +12135,22 @@
             <w:pPr>
               <w:spacing w:after="0" w:line="240"/>
             </w:pPr>
+            <w:r>
+              <w:rPr>
+                <w:rFonts w:ascii="Calibri" w:cs="Calibri" w:eastAsia="Calibri" w:hAnsi="Calibri"/>
+                <w:color w:val="FFFFFF"/>
+                <w:sz w:val="2"/>
+                <w:szCs w:val="2"/>
+              </w:rPr>
+              <w:t xml:space="preserve">/pmL1c5/</w:t>
+            </w:r>
           </w:p>
         </w:tc>
       </w:tr>
       <w:tr>
         <w:trPr>
           <w:cantSplit/>
-          <w:trHeight w:val="636" w:hRule="exact"/>
+          <w:trHeight w:val="560" w:hRule="atLeast"/>
         </w:trPr>
         <w:tc>
           <w:tcPr>
@@ -11783,6 +12204,15 @@
             <w:pPr>
               <w:spacing w:after="0" w:line="240"/>
             </w:pPr>
+            <w:r>
+              <w:rPr>
+                <w:rFonts w:ascii="Calibri" w:cs="Calibri" w:eastAsia="Calibri" w:hAnsi="Calibri"/>
+                <w:color w:val="FFFFFF"/>
+                <w:sz w:val="2"/>
+                <w:szCs w:val="2"/>
+              </w:rPr>
+              <w:t xml:space="preserve">/pmL2c1/</w:t>
+            </w:r>
           </w:p>
         </w:tc>
         <w:tc>
@@ -11806,6 +12236,15 @@
             <w:pPr>
               <w:spacing w:after="0" w:line="240"/>
             </w:pPr>
+            <w:r>
+              <w:rPr>
+                <w:rFonts w:ascii="Calibri" w:cs="Calibri" w:eastAsia="Calibri" w:hAnsi="Calibri"/>
+                <w:color w:val="FFFFFF"/>
+                <w:sz w:val="2"/>
+                <w:szCs w:val="2"/>
+              </w:rPr>
+              <w:t xml:space="preserve">/pmL2c2/</w:t>
+            </w:r>
           </w:p>
         </w:tc>
         <w:tc>
@@ -11829,6 +12268,15 @@
             <w:pPr>
               <w:spacing w:after="0" w:line="240"/>
             </w:pPr>
+            <w:r>
+              <w:rPr>
+                <w:rFonts w:ascii="Calibri" w:cs="Calibri" w:eastAsia="Calibri" w:hAnsi="Calibri"/>
+                <w:color w:val="FFFFFF"/>
+                <w:sz w:val="2"/>
+                <w:szCs w:val="2"/>
+              </w:rPr>
+              <w:t xml:space="preserve">/pmL2c3/</w:t>
+            </w:r>
           </w:p>
         </w:tc>
         <w:tc>
@@ -11852,6 +12300,15 @@
             <w:pPr>
               <w:spacing w:after="0" w:line="240"/>
             </w:pPr>
+            <w:r>
+              <w:rPr>
+                <w:rFonts w:ascii="Calibri" w:cs="Calibri" w:eastAsia="Calibri" w:hAnsi="Calibri"/>
+                <w:color w:val="FFFFFF"/>
+                <w:sz w:val="2"/>
+                <w:szCs w:val="2"/>
+              </w:rPr>
+              <w:t xml:space="preserve">/pmL2c4/</w:t>
+            </w:r>
           </w:p>
         </w:tc>
         <w:tc>
@@ -11875,13 +12332,22 @@
             <w:pPr>
               <w:spacing w:after="0" w:line="240"/>
             </w:pPr>
+            <w:r>
+              <w:rPr>
+                <w:rFonts w:ascii="Calibri" w:cs="Calibri" w:eastAsia="Calibri" w:hAnsi="Calibri"/>
+                <w:color w:val="FFFFFF"/>
+                <w:sz w:val="2"/>
+                <w:szCs w:val="2"/>
+              </w:rPr>
+              <w:t xml:space="preserve">/pmL2c5/</w:t>
+            </w:r>
           </w:p>
         </w:tc>
       </w:tr>
       <w:tr>
         <w:trPr>
           <w:cantSplit/>
-          <w:trHeight w:val="636" w:hRule="exact"/>
+          <w:trHeight w:val="560" w:hRule="atLeast"/>
         </w:trPr>
         <w:tc>
           <w:tcPr>
@@ -11935,6 +12401,15 @@
             <w:pPr>
               <w:spacing w:after="0" w:line="240"/>
             </w:pPr>
+            <w:r>
+              <w:rPr>
+                <w:rFonts w:ascii="Calibri" w:cs="Calibri" w:eastAsia="Calibri" w:hAnsi="Calibri"/>
+                <w:color w:val="FFFFFF"/>
+                <w:sz w:val="2"/>
+                <w:szCs w:val="2"/>
+              </w:rPr>
+              <w:t xml:space="preserve">/pmL3c1/</w:t>
+            </w:r>
           </w:p>
         </w:tc>
         <w:tc>
@@ -11958,6 +12433,15 @@
             <w:pPr>
               <w:spacing w:after="0" w:line="240"/>
             </w:pPr>
+            <w:r>
+              <w:rPr>
+                <w:rFonts w:ascii="Calibri" w:cs="Calibri" w:eastAsia="Calibri" w:hAnsi="Calibri"/>
+                <w:color w:val="FFFFFF"/>
+                <w:sz w:val="2"/>
+                <w:szCs w:val="2"/>
+              </w:rPr>
+              <w:t xml:space="preserve">/pmL3c2/</w:t>
+            </w:r>
           </w:p>
         </w:tc>
         <w:tc>
@@ -11981,6 +12465,15 @@
             <w:pPr>
               <w:spacing w:after="0" w:line="240"/>
             </w:pPr>
+            <w:r>
+              <w:rPr>
+                <w:rFonts w:ascii="Calibri" w:cs="Calibri" w:eastAsia="Calibri" w:hAnsi="Calibri"/>
+                <w:color w:val="FFFFFF"/>
+                <w:sz w:val="2"/>
+                <w:szCs w:val="2"/>
+              </w:rPr>
+              <w:t xml:space="preserve">/pmL3c3/</w:t>
+            </w:r>
           </w:p>
         </w:tc>
         <w:tc>
@@ -12004,6 +12497,15 @@
             <w:pPr>
               <w:spacing w:after="0" w:line="240"/>
             </w:pPr>
+            <w:r>
+              <w:rPr>
+                <w:rFonts w:ascii="Calibri" w:cs="Calibri" w:eastAsia="Calibri" w:hAnsi="Calibri"/>
+                <w:color w:val="FFFFFF"/>
+                <w:sz w:val="2"/>
+                <w:szCs w:val="2"/>
+              </w:rPr>
+              <w:t xml:space="preserve">/pmL3c4/</w:t>
+            </w:r>
           </w:p>
         </w:tc>
         <w:tc>
@@ -12027,13 +12529,22 @@
             <w:pPr>
               <w:spacing w:after="0" w:line="240"/>
             </w:pPr>
+            <w:r>
+              <w:rPr>
+                <w:rFonts w:ascii="Calibri" w:cs="Calibri" w:eastAsia="Calibri" w:hAnsi="Calibri"/>
+                <w:color w:val="FFFFFF"/>
+                <w:sz w:val="2"/>
+                <w:szCs w:val="2"/>
+              </w:rPr>
+              <w:t xml:space="preserve">/pmL3c5/</w:t>
+            </w:r>
           </w:p>
         </w:tc>
       </w:tr>
       <w:tr>
         <w:trPr>
           <w:cantSplit/>
-          <w:trHeight w:val="636" w:hRule="exact"/>
+          <w:trHeight w:val="560" w:hRule="atLeast"/>
         </w:trPr>
         <w:tc>
           <w:tcPr>
@@ -12087,6 +12598,15 @@
             <w:pPr>
               <w:spacing w:after="0" w:line="240"/>
             </w:pPr>
+            <w:r>
+              <w:rPr>
+                <w:rFonts w:ascii="Calibri" w:cs="Calibri" w:eastAsia="Calibri" w:hAnsi="Calibri"/>
+                <w:color w:val="FFFFFF"/>
+                <w:sz w:val="2"/>
+                <w:szCs w:val="2"/>
+              </w:rPr>
+              <w:t xml:space="preserve">/pmL4c1/</w:t>
+            </w:r>
           </w:p>
         </w:tc>
         <w:tc>
@@ -12110,6 +12630,15 @@
             <w:pPr>
               <w:spacing w:after="0" w:line="240"/>
             </w:pPr>
+            <w:r>
+              <w:rPr>
+                <w:rFonts w:ascii="Calibri" w:cs="Calibri" w:eastAsia="Calibri" w:hAnsi="Calibri"/>
+                <w:color w:val="FFFFFF"/>
+                <w:sz w:val="2"/>
+                <w:szCs w:val="2"/>
+              </w:rPr>
+              <w:t xml:space="preserve">/pmL4c2/</w:t>
+            </w:r>
           </w:p>
         </w:tc>
         <w:tc>
@@ -12133,6 +12662,15 @@
             <w:pPr>
               <w:spacing w:after="0" w:line="240"/>
             </w:pPr>
+            <w:r>
+              <w:rPr>
+                <w:rFonts w:ascii="Calibri" w:cs="Calibri" w:eastAsia="Calibri" w:hAnsi="Calibri"/>
+                <w:color w:val="FFFFFF"/>
+                <w:sz w:val="2"/>
+                <w:szCs w:val="2"/>
+              </w:rPr>
+              <w:t xml:space="preserve">/pmL4c3/</w:t>
+            </w:r>
           </w:p>
         </w:tc>
         <w:tc>
@@ -12156,6 +12694,15 @@
             <w:pPr>
               <w:spacing w:after="0" w:line="240"/>
             </w:pPr>
+            <w:r>
+              <w:rPr>
+                <w:rFonts w:ascii="Calibri" w:cs="Calibri" w:eastAsia="Calibri" w:hAnsi="Calibri"/>
+                <w:color w:val="FFFFFF"/>
+                <w:sz w:val="2"/>
+                <w:szCs w:val="2"/>
+              </w:rPr>
+              <w:t xml:space="preserve">/pmL4c4/</w:t>
+            </w:r>
           </w:p>
         </w:tc>
         <w:tc>
@@ -12179,13 +12726,22 @@
             <w:pPr>
               <w:spacing w:after="0" w:line="240"/>
             </w:pPr>
+            <w:r>
+              <w:rPr>
+                <w:rFonts w:ascii="Calibri" w:cs="Calibri" w:eastAsia="Calibri" w:hAnsi="Calibri"/>
+                <w:color w:val="FFFFFF"/>
+                <w:sz w:val="2"/>
+                <w:szCs w:val="2"/>
+              </w:rPr>
+              <w:t xml:space="preserve">/pmL4c5/</w:t>
+            </w:r>
           </w:p>
         </w:tc>
       </w:tr>
       <w:tr>
         <w:trPr>
           <w:cantSplit/>
-          <w:trHeight w:val="636" w:hRule="exact"/>
+          <w:trHeight w:val="560" w:hRule="atLeast"/>
         </w:trPr>
         <w:tc>
           <w:tcPr>
@@ -12239,6 +12795,15 @@
             <w:pPr>
               <w:spacing w:after="0" w:line="240"/>
             </w:pPr>
+            <w:r>
+              <w:rPr>
+                <w:rFonts w:ascii="Calibri" w:cs="Calibri" w:eastAsia="Calibri" w:hAnsi="Calibri"/>
+                <w:color w:val="FFFFFF"/>
+                <w:sz w:val="2"/>
+                <w:szCs w:val="2"/>
+              </w:rPr>
+              <w:t xml:space="preserve">/pmL5c1/</w:t>
+            </w:r>
           </w:p>
         </w:tc>
         <w:tc>
@@ -12262,6 +12827,15 @@
             <w:pPr>
               <w:spacing w:after="0" w:line="240"/>
             </w:pPr>
+            <w:r>
+              <w:rPr>
+                <w:rFonts w:ascii="Calibri" w:cs="Calibri" w:eastAsia="Calibri" w:hAnsi="Calibri"/>
+                <w:color w:val="FFFFFF"/>
+                <w:sz w:val="2"/>
+                <w:szCs w:val="2"/>
+              </w:rPr>
+              <w:t xml:space="preserve">/pmL5c2/</w:t>
+            </w:r>
           </w:p>
         </w:tc>
         <w:tc>
@@ -12285,6 +12859,15 @@
             <w:pPr>
               <w:spacing w:after="0" w:line="240"/>
             </w:pPr>
+            <w:r>
+              <w:rPr>
+                <w:rFonts w:ascii="Calibri" w:cs="Calibri" w:eastAsia="Calibri" w:hAnsi="Calibri"/>
+                <w:color w:val="FFFFFF"/>
+                <w:sz w:val="2"/>
+                <w:szCs w:val="2"/>
+              </w:rPr>
+              <w:t xml:space="preserve">/pmL5c3/</w:t>
+            </w:r>
           </w:p>
         </w:tc>
         <w:tc>
@@ -12308,6 +12891,15 @@
             <w:pPr>
               <w:spacing w:after="0" w:line="240"/>
             </w:pPr>
+            <w:r>
+              <w:rPr>
+                <w:rFonts w:ascii="Calibri" w:cs="Calibri" w:eastAsia="Calibri" w:hAnsi="Calibri"/>
+                <w:color w:val="FFFFFF"/>
+                <w:sz w:val="2"/>
+                <w:szCs w:val="2"/>
+              </w:rPr>
+              <w:t xml:space="preserve">/pmL5c4/</w:t>
+            </w:r>
           </w:p>
         </w:tc>
         <w:tc>
@@ -12331,13 +12923,22 @@
             <w:pPr>
               <w:spacing w:after="0" w:line="240"/>
             </w:pPr>
+            <w:r>
+              <w:rPr>
+                <w:rFonts w:ascii="Calibri" w:cs="Calibri" w:eastAsia="Calibri" w:hAnsi="Calibri"/>
+                <w:color w:val="FFFFFF"/>
+                <w:sz w:val="2"/>
+                <w:szCs w:val="2"/>
+              </w:rPr>
+              <w:t xml:space="preserve">/pmL5c5/</w:t>
+            </w:r>
           </w:p>
         </w:tc>
       </w:tr>
       <w:tr>
         <w:trPr>
           <w:cantSplit/>
-          <w:trHeight w:val="636" w:hRule="exact"/>
+          <w:trHeight w:val="560" w:hRule="atLeast"/>
         </w:trPr>
         <w:tc>
           <w:tcPr>
@@ -12391,6 +12992,15 @@
             <w:pPr>
               <w:spacing w:after="0" w:line="240"/>
             </w:pPr>
+            <w:r>
+              <w:rPr>
+                <w:rFonts w:ascii="Calibri" w:cs="Calibri" w:eastAsia="Calibri" w:hAnsi="Calibri"/>
+                <w:color w:val="FFFFFF"/>
+                <w:sz w:val="2"/>
+                <w:szCs w:val="2"/>
+              </w:rPr>
+              <w:t xml:space="preserve">/pmL6c1/</w:t>
+            </w:r>
           </w:p>
         </w:tc>
         <w:tc>
@@ -12414,6 +13024,15 @@
             <w:pPr>
               <w:spacing w:after="0" w:line="240"/>
             </w:pPr>
+            <w:r>
+              <w:rPr>
+                <w:rFonts w:ascii="Calibri" w:cs="Calibri" w:eastAsia="Calibri" w:hAnsi="Calibri"/>
+                <w:color w:val="FFFFFF"/>
+                <w:sz w:val="2"/>
+                <w:szCs w:val="2"/>
+              </w:rPr>
+              <w:t xml:space="preserve">/pmL6c2/</w:t>
+            </w:r>
           </w:p>
         </w:tc>
         <w:tc>
@@ -12437,6 +13056,15 @@
             <w:pPr>
               <w:spacing w:after="0" w:line="240"/>
             </w:pPr>
+            <w:r>
+              <w:rPr>
+                <w:rFonts w:ascii="Calibri" w:cs="Calibri" w:eastAsia="Calibri" w:hAnsi="Calibri"/>
+                <w:color w:val="FFFFFF"/>
+                <w:sz w:val="2"/>
+                <w:szCs w:val="2"/>
+              </w:rPr>
+              <w:t xml:space="preserve">/pmL6c3/</w:t>
+            </w:r>
           </w:p>
         </w:tc>
         <w:tc>
@@ -12460,6 +13088,15 @@
             <w:pPr>
               <w:spacing w:after="0" w:line="240"/>
             </w:pPr>
+            <w:r>
+              <w:rPr>
+                <w:rFonts w:ascii="Calibri" w:cs="Calibri" w:eastAsia="Calibri" w:hAnsi="Calibri"/>
+                <w:color w:val="FFFFFF"/>
+                <w:sz w:val="2"/>
+                <w:szCs w:val="2"/>
+              </w:rPr>
+              <w:t xml:space="preserve">/pmL6c4/</w:t>
+            </w:r>
           </w:p>
         </w:tc>
         <w:tc>
@@ -12483,13 +13120,22 @@
             <w:pPr>
               <w:spacing w:after="0" w:line="240"/>
             </w:pPr>
+            <w:r>
+              <w:rPr>
+                <w:rFonts w:ascii="Calibri" w:cs="Calibri" w:eastAsia="Calibri" w:hAnsi="Calibri"/>
+                <w:color w:val="FFFFFF"/>
+                <w:sz w:val="2"/>
+                <w:szCs w:val="2"/>
+              </w:rPr>
+              <w:t xml:space="preserve">/pmL6c5/</w:t>
+            </w:r>
           </w:p>
         </w:tc>
       </w:tr>
       <w:tr>
         <w:trPr>
           <w:cantSplit/>
-          <w:trHeight w:val="636" w:hRule="exact"/>
+          <w:trHeight w:val="560" w:hRule="atLeast"/>
         </w:trPr>
         <w:tc>
           <w:tcPr>
@@ -12543,6 +13189,15 @@
             <w:pPr>
               <w:spacing w:after="0" w:line="240"/>
             </w:pPr>
+            <w:r>
+              <w:rPr>
+                <w:rFonts w:ascii="Calibri" w:cs="Calibri" w:eastAsia="Calibri" w:hAnsi="Calibri"/>
+                <w:color w:val="FFFFFF"/>
+                <w:sz w:val="2"/>
+                <w:szCs w:val="2"/>
+              </w:rPr>
+              <w:t xml:space="preserve">/pmL7c1/</w:t>
+            </w:r>
           </w:p>
         </w:tc>
         <w:tc>
@@ -12566,6 +13221,15 @@
             <w:pPr>
               <w:spacing w:after="0" w:line="240"/>
             </w:pPr>
+            <w:r>
+              <w:rPr>
+                <w:rFonts w:ascii="Calibri" w:cs="Calibri" w:eastAsia="Calibri" w:hAnsi="Calibri"/>
+                <w:color w:val="FFFFFF"/>
+                <w:sz w:val="2"/>
+                <w:szCs w:val="2"/>
+              </w:rPr>
+              <w:t xml:space="preserve">/pmL7c2/</w:t>
+            </w:r>
           </w:p>
         </w:tc>
         <w:tc>
@@ -12589,6 +13253,15 @@
             <w:pPr>
               <w:spacing w:after="0" w:line="240"/>
             </w:pPr>
+            <w:r>
+              <w:rPr>
+                <w:rFonts w:ascii="Calibri" w:cs="Calibri" w:eastAsia="Calibri" w:hAnsi="Calibri"/>
+                <w:color w:val="FFFFFF"/>
+                <w:sz w:val="2"/>
+                <w:szCs w:val="2"/>
+              </w:rPr>
+              <w:t xml:space="preserve">/pmL7c3/</w:t>
+            </w:r>
           </w:p>
         </w:tc>
         <w:tc>
@@ -12612,6 +13285,15 @@
             <w:pPr>
               <w:spacing w:after="0" w:line="240"/>
             </w:pPr>
+            <w:r>
+              <w:rPr>
+                <w:rFonts w:ascii="Calibri" w:cs="Calibri" w:eastAsia="Calibri" w:hAnsi="Calibri"/>
+                <w:color w:val="FFFFFF"/>
+                <w:sz w:val="2"/>
+                <w:szCs w:val="2"/>
+              </w:rPr>
+              <w:t xml:space="preserve">/pmL7c4/</w:t>
+            </w:r>
           </w:p>
         </w:tc>
         <w:tc>
@@ -12635,13 +13317,22 @@
             <w:pPr>
               <w:spacing w:after="0" w:line="240"/>
             </w:pPr>
+            <w:r>
+              <w:rPr>
+                <w:rFonts w:ascii="Calibri" w:cs="Calibri" w:eastAsia="Calibri" w:hAnsi="Calibri"/>
+                <w:color w:val="FFFFFF"/>
+                <w:sz w:val="2"/>
+                <w:szCs w:val="2"/>
+              </w:rPr>
+              <w:t xml:space="preserve">/pmL7c5/</w:t>
+            </w:r>
           </w:p>
         </w:tc>
       </w:tr>
       <w:tr>
         <w:trPr>
           <w:cantSplit/>
-          <w:trHeight w:val="636" w:hRule="exact"/>
+          <w:trHeight w:val="560" w:hRule="atLeast"/>
         </w:trPr>
         <w:tc>
           <w:tcPr>
@@ -12695,6 +13386,15 @@
             <w:pPr>
               <w:spacing w:after="0" w:line="240"/>
             </w:pPr>
+            <w:r>
+              <w:rPr>
+                <w:rFonts w:ascii="Calibri" w:cs="Calibri" w:eastAsia="Calibri" w:hAnsi="Calibri"/>
+                <w:color w:val="FFFFFF"/>
+                <w:sz w:val="2"/>
+                <w:szCs w:val="2"/>
+              </w:rPr>
+              <w:t xml:space="preserve">/pmL8c1/</w:t>
+            </w:r>
           </w:p>
         </w:tc>
         <w:tc>
@@ -12718,6 +13418,15 @@
             <w:pPr>
               <w:spacing w:after="0" w:line="240"/>
             </w:pPr>
+            <w:r>
+              <w:rPr>
+                <w:rFonts w:ascii="Calibri" w:cs="Calibri" w:eastAsia="Calibri" w:hAnsi="Calibri"/>
+                <w:color w:val="FFFFFF"/>
+                <w:sz w:val="2"/>
+                <w:szCs w:val="2"/>
+              </w:rPr>
+              <w:t xml:space="preserve">/pmL8c2/</w:t>
+            </w:r>
           </w:p>
         </w:tc>
         <w:tc>
@@ -12741,6 +13450,15 @@
             <w:pPr>
               <w:spacing w:after="0" w:line="240"/>
             </w:pPr>
+            <w:r>
+              <w:rPr>
+                <w:rFonts w:ascii="Calibri" w:cs="Calibri" w:eastAsia="Calibri" w:hAnsi="Calibri"/>
+                <w:color w:val="FFFFFF"/>
+                <w:sz w:val="2"/>
+                <w:szCs w:val="2"/>
+              </w:rPr>
+              <w:t xml:space="preserve">/pmL8c3/</w:t>
+            </w:r>
           </w:p>
         </w:tc>
         <w:tc>
@@ -12764,6 +13482,15 @@
             <w:pPr>
               <w:spacing w:after="0" w:line="240"/>
             </w:pPr>
+            <w:r>
+              <w:rPr>
+                <w:rFonts w:ascii="Calibri" w:cs="Calibri" w:eastAsia="Calibri" w:hAnsi="Calibri"/>
+                <w:color w:val="FFFFFF"/>
+                <w:sz w:val="2"/>
+                <w:szCs w:val="2"/>
+              </w:rPr>
+              <w:t xml:space="preserve">/pmL8c4/</w:t>
+            </w:r>
           </w:p>
         </w:tc>
         <w:tc>
@@ -12787,13 +13514,22 @@
             <w:pPr>
               <w:spacing w:after="0" w:line="240"/>
             </w:pPr>
+            <w:r>
+              <w:rPr>
+                <w:rFonts w:ascii="Calibri" w:cs="Calibri" w:eastAsia="Calibri" w:hAnsi="Calibri"/>
+                <w:color w:val="FFFFFF"/>
+                <w:sz w:val="2"/>
+                <w:szCs w:val="2"/>
+              </w:rPr>
+              <w:t xml:space="preserve">/pmL8c5/</w:t>
+            </w:r>
           </w:p>
         </w:tc>
       </w:tr>
       <w:tr>
         <w:trPr>
           <w:cantSplit/>
-          <w:trHeight w:val="636" w:hRule="exact"/>
+          <w:trHeight w:val="560" w:hRule="atLeast"/>
         </w:trPr>
         <w:tc>
           <w:tcPr>
@@ -12847,6 +13583,15 @@
             <w:pPr>
               <w:spacing w:after="0" w:line="240"/>
             </w:pPr>
+            <w:r>
+              <w:rPr>
+                <w:rFonts w:ascii="Calibri" w:cs="Calibri" w:eastAsia="Calibri" w:hAnsi="Calibri"/>
+                <w:color w:val="FFFFFF"/>
+                <w:sz w:val="2"/>
+                <w:szCs w:val="2"/>
+              </w:rPr>
+              <w:t xml:space="preserve">/pmL9c1/</w:t>
+            </w:r>
           </w:p>
         </w:tc>
         <w:tc>
@@ -12870,6 +13615,15 @@
             <w:pPr>
               <w:spacing w:after="0" w:line="240"/>
             </w:pPr>
+            <w:r>
+              <w:rPr>
+                <w:rFonts w:ascii="Calibri" w:cs="Calibri" w:eastAsia="Calibri" w:hAnsi="Calibri"/>
+                <w:color w:val="FFFFFF"/>
+                <w:sz w:val="2"/>
+                <w:szCs w:val="2"/>
+              </w:rPr>
+              <w:t xml:space="preserve">/pmL9c2/</w:t>
+            </w:r>
           </w:p>
         </w:tc>
         <w:tc>
@@ -12893,6 +13647,15 @@
             <w:pPr>
               <w:spacing w:after="0" w:line="240"/>
             </w:pPr>
+            <w:r>
+              <w:rPr>
+                <w:rFonts w:ascii="Calibri" w:cs="Calibri" w:eastAsia="Calibri" w:hAnsi="Calibri"/>
+                <w:color w:val="FFFFFF"/>
+                <w:sz w:val="2"/>
+                <w:szCs w:val="2"/>
+              </w:rPr>
+              <w:t xml:space="preserve">/pmL9c3/</w:t>
+            </w:r>
           </w:p>
         </w:tc>
         <w:tc>
@@ -12916,6 +13679,15 @@
             <w:pPr>
               <w:spacing w:after="0" w:line="240"/>
             </w:pPr>
+            <w:r>
+              <w:rPr>
+                <w:rFonts w:ascii="Calibri" w:cs="Calibri" w:eastAsia="Calibri" w:hAnsi="Calibri"/>
+                <w:color w:val="FFFFFF"/>
+                <w:sz w:val="2"/>
+                <w:szCs w:val="2"/>
+              </w:rPr>
+              <w:t xml:space="preserve">/pmL9c4/</w:t>
+            </w:r>
           </w:p>
         </w:tc>
         <w:tc>
@@ -12939,13 +13711,22 @@
             <w:pPr>
               <w:spacing w:after="0" w:line="240"/>
             </w:pPr>
+            <w:r>
+              <w:rPr>
+                <w:rFonts w:ascii="Calibri" w:cs="Calibri" w:eastAsia="Calibri" w:hAnsi="Calibri"/>
+                <w:color w:val="FFFFFF"/>
+                <w:sz w:val="2"/>
+                <w:szCs w:val="2"/>
+              </w:rPr>
+              <w:t xml:space="preserve">/pmL9c5/</w:t>
+            </w:r>
           </w:p>
         </w:tc>
       </w:tr>
       <w:tr>
         <w:trPr>
           <w:cantSplit/>
-          <w:trHeight w:val="636" w:hRule="exact"/>
+          <w:trHeight w:val="560" w:hRule="atLeast"/>
         </w:trPr>
         <w:tc>
           <w:tcPr>
@@ -12999,6 +13780,15 @@
             <w:pPr>
               <w:spacing w:after="0" w:line="240"/>
             </w:pPr>
+            <w:r>
+              <w:rPr>
+                <w:rFonts w:ascii="Calibri" w:cs="Calibri" w:eastAsia="Calibri" w:hAnsi="Calibri"/>
+                <w:color w:val="FFFFFF"/>
+                <w:sz w:val="2"/>
+                <w:szCs w:val="2"/>
+              </w:rPr>
+              <w:t xml:space="preserve">/pmL10c1/</w:t>
+            </w:r>
           </w:p>
         </w:tc>
         <w:tc>
@@ -13022,6 +13812,15 @@
             <w:pPr>
               <w:spacing w:after="0" w:line="240"/>
             </w:pPr>
+            <w:r>
+              <w:rPr>
+                <w:rFonts w:ascii="Calibri" w:cs="Calibri" w:eastAsia="Calibri" w:hAnsi="Calibri"/>
+                <w:color w:val="FFFFFF"/>
+                <w:sz w:val="2"/>
+                <w:szCs w:val="2"/>
+              </w:rPr>
+              <w:t xml:space="preserve">/pmL10c2/</w:t>
+            </w:r>
           </w:p>
         </w:tc>
         <w:tc>
@@ -13045,6 +13844,15 @@
             <w:pPr>
               <w:spacing w:after="0" w:line="240"/>
             </w:pPr>
+            <w:r>
+              <w:rPr>
+                <w:rFonts w:ascii="Calibri" w:cs="Calibri" w:eastAsia="Calibri" w:hAnsi="Calibri"/>
+                <w:color w:val="FFFFFF"/>
+                <w:sz w:val="2"/>
+                <w:szCs w:val="2"/>
+              </w:rPr>
+              <w:t xml:space="preserve">/pmL10c3/</w:t>
+            </w:r>
           </w:p>
         </w:tc>
         <w:tc>
@@ -13068,6 +13876,15 @@
             <w:pPr>
               <w:spacing w:after="0" w:line="240"/>
             </w:pPr>
+            <w:r>
+              <w:rPr>
+                <w:rFonts w:ascii="Calibri" w:cs="Calibri" w:eastAsia="Calibri" w:hAnsi="Calibri"/>
+                <w:color w:val="FFFFFF"/>
+                <w:sz w:val="2"/>
+                <w:szCs w:val="2"/>
+              </w:rPr>
+              <w:t xml:space="preserve">/pmL10c4/</w:t>
+            </w:r>
           </w:p>
         </w:tc>
         <w:tc>
@@ -13091,13 +13908,22 @@
             <w:pPr>
               <w:spacing w:after="0" w:line="240"/>
             </w:pPr>
+            <w:r>
+              <w:rPr>
+                <w:rFonts w:ascii="Calibri" w:cs="Calibri" w:eastAsia="Calibri" w:hAnsi="Calibri"/>
+                <w:color w:val="FFFFFF"/>
+                <w:sz w:val="2"/>
+                <w:szCs w:val="2"/>
+              </w:rPr>
+              <w:t xml:space="preserve">/pmL10c5/</w:t>
+            </w:r>
           </w:p>
         </w:tc>
       </w:tr>
       <w:tr>
         <w:trPr>
           <w:cantSplit/>
-          <w:trHeight w:val="636" w:hRule="exact"/>
+          <w:trHeight w:val="560" w:hRule="atLeast"/>
         </w:trPr>
         <w:tc>
           <w:tcPr>
@@ -13151,6 +13977,15 @@
             <w:pPr>
               <w:spacing w:after="0" w:line="240"/>
             </w:pPr>
+            <w:r>
+              <w:rPr>
+                <w:rFonts w:ascii="Calibri" w:cs="Calibri" w:eastAsia="Calibri" w:hAnsi="Calibri"/>
+                <w:color w:val="FFFFFF"/>
+                <w:sz w:val="2"/>
+                <w:szCs w:val="2"/>
+              </w:rPr>
+              <w:t xml:space="preserve">/pmL11c1/</w:t>
+            </w:r>
           </w:p>
         </w:tc>
         <w:tc>
@@ -13174,6 +14009,15 @@
             <w:pPr>
               <w:spacing w:after="0" w:line="240"/>
             </w:pPr>
+            <w:r>
+              <w:rPr>
+                <w:rFonts w:ascii="Calibri" w:cs="Calibri" w:eastAsia="Calibri" w:hAnsi="Calibri"/>
+                <w:color w:val="FFFFFF"/>
+                <w:sz w:val="2"/>
+                <w:szCs w:val="2"/>
+              </w:rPr>
+              <w:t xml:space="preserve">/pmL11c2/</w:t>
+            </w:r>
           </w:p>
         </w:tc>
         <w:tc>
@@ -13197,6 +14041,15 @@
             <w:pPr>
               <w:spacing w:after="0" w:line="240"/>
             </w:pPr>
+            <w:r>
+              <w:rPr>
+                <w:rFonts w:ascii="Calibri" w:cs="Calibri" w:eastAsia="Calibri" w:hAnsi="Calibri"/>
+                <w:color w:val="FFFFFF"/>
+                <w:sz w:val="2"/>
+                <w:szCs w:val="2"/>
+              </w:rPr>
+              <w:t xml:space="preserve">/pmL11c3/</w:t>
+            </w:r>
           </w:p>
         </w:tc>
         <w:tc>
@@ -13220,6 +14073,15 @@
             <w:pPr>
               <w:spacing w:after="0" w:line="240"/>
             </w:pPr>
+            <w:r>
+              <w:rPr>
+                <w:rFonts w:ascii="Calibri" w:cs="Calibri" w:eastAsia="Calibri" w:hAnsi="Calibri"/>
+                <w:color w:val="FFFFFF"/>
+                <w:sz w:val="2"/>
+                <w:szCs w:val="2"/>
+              </w:rPr>
+              <w:t xml:space="preserve">/pmL11c4/</w:t>
+            </w:r>
           </w:p>
         </w:tc>
         <w:tc>
@@ -13243,13 +14105,22 @@
             <w:pPr>
               <w:spacing w:after="0" w:line="240"/>
             </w:pPr>
+            <w:r>
+              <w:rPr>
+                <w:rFonts w:ascii="Calibri" w:cs="Calibri" w:eastAsia="Calibri" w:hAnsi="Calibri"/>
+                <w:color w:val="FFFFFF"/>
+                <w:sz w:val="2"/>
+                <w:szCs w:val="2"/>
+              </w:rPr>
+              <w:t xml:space="preserve">/pmL11c5/</w:t>
+            </w:r>
           </w:p>
         </w:tc>
       </w:tr>
       <w:tr>
         <w:trPr>
           <w:cantSplit/>
-          <w:trHeight w:val="636" w:hRule="exact"/>
+          <w:trHeight w:val="560" w:hRule="atLeast"/>
         </w:trPr>
         <w:tc>
           <w:tcPr>
@@ -13303,6 +14174,15 @@
             <w:pPr>
               <w:spacing w:after="0" w:line="240"/>
             </w:pPr>
+            <w:r>
+              <w:rPr>
+                <w:rFonts w:ascii="Calibri" w:cs="Calibri" w:eastAsia="Calibri" w:hAnsi="Calibri"/>
+                <w:color w:val="FFFFFF"/>
+                <w:sz w:val="2"/>
+                <w:szCs w:val="2"/>
+              </w:rPr>
+              <w:t xml:space="preserve">/pmL12c1/</w:t>
+            </w:r>
           </w:p>
         </w:tc>
         <w:tc>
@@ -13326,6 +14206,15 @@
             <w:pPr>
               <w:spacing w:after="0" w:line="240"/>
             </w:pPr>
+            <w:r>
+              <w:rPr>
+                <w:rFonts w:ascii="Calibri" w:cs="Calibri" w:eastAsia="Calibri" w:hAnsi="Calibri"/>
+                <w:color w:val="FFFFFF"/>
+                <w:sz w:val="2"/>
+                <w:szCs w:val="2"/>
+              </w:rPr>
+              <w:t xml:space="preserve">/pmL12c2/</w:t>
+            </w:r>
           </w:p>
         </w:tc>
         <w:tc>
@@ -13349,6 +14238,15 @@
             <w:pPr>
               <w:spacing w:after="0" w:line="240"/>
             </w:pPr>
+            <w:r>
+              <w:rPr>
+                <w:rFonts w:ascii="Calibri" w:cs="Calibri" w:eastAsia="Calibri" w:hAnsi="Calibri"/>
+                <w:color w:val="FFFFFF"/>
+                <w:sz w:val="2"/>
+                <w:szCs w:val="2"/>
+              </w:rPr>
+              <w:t xml:space="preserve">/pmL12c3/</w:t>
+            </w:r>
           </w:p>
         </w:tc>
         <w:tc>
@@ -13372,6 +14270,15 @@
             <w:pPr>
               <w:spacing w:after="0" w:line="240"/>
             </w:pPr>
+            <w:r>
+              <w:rPr>
+                <w:rFonts w:ascii="Calibri" w:cs="Calibri" w:eastAsia="Calibri" w:hAnsi="Calibri"/>
+                <w:color w:val="FFFFFF"/>
+                <w:sz w:val="2"/>
+                <w:szCs w:val="2"/>
+              </w:rPr>
+              <w:t xml:space="preserve">/pmL12c4/</w:t>
+            </w:r>
           </w:p>
         </w:tc>
         <w:tc>
@@ -13395,6 +14302,15 @@
             <w:pPr>
               <w:spacing w:after="0" w:line="240"/>
             </w:pPr>
+            <w:r>
+              <w:rPr>
+                <w:rFonts w:ascii="Calibri" w:cs="Calibri" w:eastAsia="Calibri" w:hAnsi="Calibri"/>
+                <w:color w:val="FFFFFF"/>
+                <w:sz w:val="2"/>
+                <w:szCs w:val="2"/>
+              </w:rPr>
+              <w:t xml:space="preserve">/pmL12c5/</w:t>
+            </w:r>
           </w:p>
         </w:tc>
       </w:tr>

</xml_diff>

<commit_message>
Contract template: page 1 fits in DocuSign's layout
Co-Authored-By: Claude Opus 5.5 <noreply@anthropic.com>
Claude-Session: https://claude.ai/code/session_01USozer2zpKfGeBovA7GUQw
</commit_message>
<xml_diff>
--- a/docs/contracts/IRep_Property_Management_Contract.docx
+++ b/docs/contracts/IRep_Property_Management_Contract.docx
@@ -283,7 +283,7 @@
         <w:pBdr>
           <w:bottom w:val="single" w:color="BFC9D9" w:sz="4" w:space="2"/>
         </w:pBdr>
-        <w:spacing w:after="120" w:before="260"/>
+        <w:spacing w:after="100" w:before="180"/>
       </w:pPr>
       <w:r>
         <w:rPr>
@@ -599,7 +599,7 @@
     </w:tbl>
     <w:p>
       <w:pPr>
-        <w:spacing w:after="100" w:before="240"/>
+        <w:spacing w:after="80" w:before="160"/>
       </w:pPr>
       <w:r>
         <w:rPr>
@@ -1629,7 +1629,7 @@
     </w:tbl>
     <w:p>
       <w:pPr>
-        <w:spacing w:after="80" w:before="240"/>
+        <w:spacing w:after="80" w:before="160"/>
       </w:pPr>
       <w:r>
         <w:rPr>
@@ -1708,8 +1708,7 @@
         </w:tc>
         <w:tc>
           <w:tcPr>
-            <w:tcW w:type="dxa" w:w="7020"/>
-            <w:gridSpan w:val="3"/>
+            <w:tcW w:type="dxa" w:w="2880"/>
             <w:tcBorders>
               <w:top w:val="single" w:color="BFC9D9" w:sz="4"/>
               <w:left w:val="single" w:color="BFC9D9" w:sz="4"/>
@@ -1736,6 +1735,78 @@
                 <w:szCs w:val="2"/>
               </w:rPr>
               <w:t xml:space="preserve">/pmsn/</w:t>
+            </w:r>
+          </w:p>
+        </w:tc>
+        <w:tc>
+          <w:tcPr>
+            <w:tcW w:type="dxa" w:w="1460"/>
+            <w:tcBorders>
+              <w:top w:val="single" w:color="BFC9D9" w:sz="4"/>
+              <w:left w:val="single" w:color="BFC9D9" w:sz="4"/>
+              <w:bottom w:val="single" w:color="BFC9D9" w:sz="4"/>
+              <w:right w:val="single" w:color="BFC9D9" w:sz="4"/>
+            </w:tcBorders>
+            <w:shd w:fill="F3F5F9" w:color="auto" w:val="clear"/>
+            <w:tcMar>
+              <w:top w:type="dxa" w:w="60"/>
+              <w:left w:type="dxa" w:w="120"/>
+              <w:bottom w:type="dxa" w:w="60"/>
+              <w:right w:type="dxa" w:w="120"/>
+            </w:tcMar>
+            <w:vAlign w:val="top"/>
+          </w:tcPr>
+          <w:p>
+            <w:pPr>
+              <w:spacing w:after="0" w:line="240"/>
+            </w:pPr>
+            <w:r>
+              <w:rPr>
+                <w:rFonts w:ascii="Calibri" w:cs="Calibri" w:eastAsia="Calibri" w:hAnsi="Calibri"/>
+                <w:sz w:val="21"/>
+                <w:szCs w:val="21"/>
+              </w:rPr>
+              <w:t xml:space="preserve">Phone</w:t>
+            </w:r>
+          </w:p>
+        </w:tc>
+        <w:tc>
+          <w:tcPr>
+            <w:tcW w:type="dxa" w:w="2680"/>
+            <w:tcBorders>
+              <w:top w:val="single" w:color="BFC9D9" w:sz="4"/>
+              <w:left w:val="single" w:color="BFC9D9" w:sz="4"/>
+              <w:bottom w:val="single" w:color="BFC9D9" w:sz="4"/>
+              <w:right w:val="single" w:color="BFC9D9" w:sz="4"/>
+            </w:tcBorders>
+            <w:tcMar>
+              <w:top w:type="dxa" w:w="60"/>
+              <w:left w:type="dxa" w:w="120"/>
+              <w:bottom w:type="dxa" w:w="60"/>
+              <w:right w:type="dxa" w:w="120"/>
+            </w:tcMar>
+            <w:vAlign w:val="top"/>
+          </w:tcPr>
+          <w:p>
+            <w:pPr>
+              <w:spacing w:after="0" w:line="240"/>
+            </w:pPr>
+            <w:r>
+              <w:rPr>
+                <w:rFonts w:ascii="Calibri" w:cs="Calibri" w:eastAsia="Calibri" w:hAnsi="Calibri"/>
+                <w:color w:val="FFFFFF"/>
+                <w:sz w:val="2"/>
+                <w:szCs w:val="2"/>
+              </w:rPr>
+              <w:t xml:space="preserve">/pmst/</w:t>
+            </w:r>
+            <w:r>
+              <w:rPr>
+                <w:rFonts w:ascii="Calibri" w:cs="Calibri" w:eastAsia="Calibri" w:hAnsi="Calibri"/>
+                <w:sz w:val="21"/>
+                <w:szCs w:val="21"/>
+              </w:rPr>
+              <w:t xml:space="preserve">{{ Phone Number }}</w:t>
             </w:r>
           </w:p>
         </w:tc>
@@ -1779,8 +1850,7 @@
         </w:tc>
         <w:tc>
           <w:tcPr>
-            <w:tcW w:type="dxa" w:w="7020"/>
-            <w:gridSpan w:val="3"/>
+            <w:tcW w:type="dxa" w:w="2880"/>
             <w:tcBorders>
               <w:top w:val="single" w:color="BFC9D9" w:sz="4"/>
               <w:left w:val="single" w:color="BFC9D9" w:sz="4"/>
@@ -1807,84 +1877,6 @@
                 <w:szCs w:val="2"/>
               </w:rPr>
               <w:t xml:space="preserve">/pmsc/</w:t>
-            </w:r>
-          </w:p>
-        </w:tc>
-      </w:tr>
-      <w:tr>
-        <w:trPr>
-          <w:cantSplit/>
-          <w:trHeight w:val="480" w:hRule="atLeast"/>
-        </w:trPr>
-        <w:tc>
-          <w:tcPr>
-            <w:tcW w:type="dxa" w:w="2340"/>
-            <w:tcBorders>
-              <w:top w:val="single" w:color="BFC9D9" w:sz="4"/>
-              <w:left w:val="single" w:color="BFC9D9" w:sz="4"/>
-              <w:bottom w:val="single" w:color="BFC9D9" w:sz="4"/>
-              <w:right w:val="single" w:color="BFC9D9" w:sz="4"/>
-            </w:tcBorders>
-            <w:shd w:fill="F3F5F9" w:color="auto" w:val="clear"/>
-            <w:tcMar>
-              <w:top w:type="dxa" w:w="60"/>
-              <w:left w:type="dxa" w:w="120"/>
-              <w:bottom w:type="dxa" w:w="60"/>
-              <w:right w:type="dxa" w:w="120"/>
-            </w:tcMar>
-            <w:vAlign w:val="top"/>
-          </w:tcPr>
-          <w:p>
-            <w:pPr>
-              <w:spacing w:after="0" w:line="240"/>
-            </w:pPr>
-            <w:r>
-              <w:rPr>
-                <w:rFonts w:ascii="Calibri" w:cs="Calibri" w:eastAsia="Calibri" w:hAnsi="Calibri"/>
-                <w:sz w:val="21"/>
-                <w:szCs w:val="21"/>
-              </w:rPr>
-              <w:t xml:space="preserve">Phone</w:t>
-            </w:r>
-          </w:p>
-        </w:tc>
-        <w:tc>
-          <w:tcPr>
-            <w:tcW w:type="dxa" w:w="2880"/>
-            <w:tcBorders>
-              <w:top w:val="single" w:color="BFC9D9" w:sz="4"/>
-              <w:left w:val="single" w:color="BFC9D9" w:sz="4"/>
-              <w:bottom w:val="single" w:color="BFC9D9" w:sz="4"/>
-              <w:right w:val="single" w:color="BFC9D9" w:sz="4"/>
-            </w:tcBorders>
-            <w:tcMar>
-              <w:top w:type="dxa" w:w="60"/>
-              <w:left w:type="dxa" w:w="120"/>
-              <w:bottom w:type="dxa" w:w="60"/>
-              <w:right w:type="dxa" w:w="120"/>
-            </w:tcMar>
-            <w:vAlign w:val="top"/>
-          </w:tcPr>
-          <w:p>
-            <w:pPr>
-              <w:spacing w:after="0" w:line="240"/>
-            </w:pPr>
-            <w:r>
-              <w:rPr>
-                <w:rFonts w:ascii="Calibri" w:cs="Calibri" w:eastAsia="Calibri" w:hAnsi="Calibri"/>
-                <w:color w:val="FFFFFF"/>
-                <w:sz w:val="2"/>
-                <w:szCs w:val="2"/>
-              </w:rPr>
-              <w:t xml:space="preserve">/pmst/</w:t>
-            </w:r>
-            <w:r>
-              <w:rPr>
-                <w:rFonts w:ascii="Calibri" w:cs="Calibri" w:eastAsia="Calibri" w:hAnsi="Calibri"/>
-                <w:sz w:val="21"/>
-                <w:szCs w:val="21"/>
-              </w:rPr>
-              <w:t xml:space="preserve">{{ Phone Number }}</w:t>
             </w:r>
           </w:p>
         </w:tc>

</xml_diff>

<commit_message>
Management contract: the website prints the contract's details (dates, addresses, fees) into the DocuSign draft; no more field data to type in DocuSign
Co-Authored-By: Claude Opus 5.5 <noreply@anthropic.com>
Claude-Session: https://claude.ai/code/session_01USozer2zpKfGeBovA7GUQw
</commit_message>
<xml_diff>
--- a/docs/contracts/IRep_Property_Management_Contract.docx
+++ b/docs/contracts/IRep_Property_Management_Contract.docx
@@ -62,7 +62,24 @@
           <w:sz w:val="21"/>
           <w:szCs w:val="21"/>
         </w:rPr>
-        <w:t xml:space="preserve">) is made as of {{ Effective Date }} (the </w:t>
+        <w:t xml:space="preserve">) is made as of </w:t>
+      </w:r>
+      <w:r>
+        <w:rPr>
+          <w:rFonts w:ascii="Calibri" w:cs="Calibri" w:eastAsia="Calibri" w:hAnsi="Calibri"/>
+          <w:color w:val="FFFFFF"/>
+          <w:sz w:val="2"/>
+          <w:szCs w:val="2"/>
+        </w:rPr>
+        <w:t xml:space="preserve">/pmfeff/</w:t>
+      </w:r>
+      <w:r>
+        <w:rPr>
+          <w:rFonts w:ascii="Calibri" w:cs="Calibri" w:eastAsia="Calibri" w:hAnsi="Calibri"/>
+          <w:sz w:val="21"/>
+          <w:szCs w:val="21"/>
+        </w:rPr>
+        <w:t xml:space="preserve">______________________ (the </w:t>
       </w:r>
       <w:r>
         <w:rPr>
@@ -255,15 +272,27 @@
           </w:tcPr>
           <w:p>
             <w:pPr>
-              <w:spacing w:after="0" w:line="240"/>
-            </w:pPr>
+              <w:tabs>
+                <w:tab w:val="left" w:pos="1800"/>
+              </w:tabs>
+              <w:spacing w:after="0" w:line="240"/>
+            </w:pPr>
+            <w:r>
+              <w:rPr>
+                <w:rFonts w:ascii="Calibri" w:cs="Calibri" w:eastAsia="Calibri" w:hAnsi="Calibri"/>
+                <w:color w:val="FFFFFF"/>
+                <w:sz w:val="2"/>
+                <w:szCs w:val="2"/>
+              </w:rPr>
+              <w:t xml:space="preserve">/pmfms/</w:t>
+            </w:r>
             <w:r>
               <w:rPr>
                 <w:rFonts w:ascii="Calibri" w:cs="Calibri" w:eastAsia="Calibri" w:hAnsi="Calibri"/>
                 <w:sz w:val="21"/>
                 <w:szCs w:val="21"/>
               </w:rPr>
-              <w:t xml:space="preserve">{{ Managed Since }} </w:t>
+              <w:t xml:space="preserve">	</w:t>
             </w:r>
             <w:r>
               <w:rPr>
@@ -456,41 +485,42 @@
             <w:r>
               <w:rPr>
                 <w:rFonts w:ascii="Calibri" w:cs="Calibri" w:eastAsia="Calibri" w:hAnsi="Calibri"/>
+                <w:color w:val="FFFFFF"/>
+                <w:sz w:val="2"/>
+                <w:szCs w:val="2"/>
+              </w:rPr>
+              <w:t xml:space="preserve">/pmfcorp/</w:t>
+            </w:r>
+          </w:p>
+        </w:tc>
+        <w:tc>
+          <w:tcPr>
+            <w:tcW w:type="dxa" w:w="1460"/>
+            <w:tcBorders>
+              <w:top w:val="single" w:color="BFC9D9" w:sz="4"/>
+              <w:left w:val="single" w:color="BFC9D9" w:sz="4"/>
+              <w:bottom w:val="single" w:color="BFC9D9" w:sz="4"/>
+              <w:right w:val="single" w:color="BFC9D9" w:sz="4"/>
+            </w:tcBorders>
+            <w:shd w:fill="F3F5F9" w:color="auto" w:val="clear"/>
+            <w:tcMar>
+              <w:top w:type="dxa" w:w="60"/>
+              <w:left w:type="dxa" w:w="120"/>
+              <w:bottom w:type="dxa" w:w="60"/>
+              <w:right w:type="dxa" w:w="120"/>
+            </w:tcMar>
+            <w:vAlign w:val="top"/>
+          </w:tcPr>
+          <w:p>
+            <w:pPr>
+              <w:spacing w:after="0" w:line="240"/>
+            </w:pPr>
+            <w:r>
+              <w:rPr>
+                <w:rFonts w:ascii="Calibri" w:cs="Calibri" w:eastAsia="Calibri" w:hAnsi="Calibri"/>
                 <w:sz w:val="21"/>
                 <w:szCs w:val="21"/>
               </w:rPr>
-              <w:t xml:space="preserve">{{ Corporation Name }}</w:t>
-            </w:r>
-          </w:p>
-        </w:tc>
-        <w:tc>
-          <w:tcPr>
-            <w:tcW w:type="dxa" w:w="1460"/>
-            <w:tcBorders>
-              <w:top w:val="single" w:color="BFC9D9" w:sz="4"/>
-              <w:left w:val="single" w:color="BFC9D9" w:sz="4"/>
-              <w:bottom w:val="single" w:color="BFC9D9" w:sz="4"/>
-              <w:right w:val="single" w:color="BFC9D9" w:sz="4"/>
-            </w:tcBorders>
-            <w:shd w:fill="F3F5F9" w:color="auto" w:val="clear"/>
-            <w:tcMar>
-              <w:top w:type="dxa" w:w="60"/>
-              <w:left w:type="dxa" w:w="120"/>
-              <w:bottom w:type="dxa" w:w="60"/>
-              <w:right w:type="dxa" w:w="120"/>
-            </w:tcMar>
-            <w:vAlign w:val="top"/>
-          </w:tcPr>
-          <w:p>
-            <w:pPr>
-              <w:spacing w:after="0" w:line="240"/>
-            </w:pPr>
-            <w:r>
-              <w:rPr>
-                <w:rFonts w:ascii="Calibri" w:cs="Calibri" w:eastAsia="Calibri" w:hAnsi="Calibri"/>
-                <w:sz w:val="21"/>
-                <w:szCs w:val="21"/>
-              </w:rPr>
               <w:t xml:space="preserve">Corp. number</w:t>
             </w:r>
           </w:p>
@@ -519,10 +549,11 @@
             <w:r>
               <w:rPr>
                 <w:rFonts w:ascii="Calibri" w:cs="Calibri" w:eastAsia="Calibri" w:hAnsi="Calibri"/>
-                <w:sz w:val="21"/>
-                <w:szCs w:val="21"/>
-              </w:rPr>
-              <w:t xml:space="preserve">{{ Corporation Number }}</w:t>
+                <w:color w:val="FFFFFF"/>
+                <w:sz w:val="2"/>
+                <w:szCs w:val="2"/>
+              </w:rPr>
+              <w:t xml:space="preserve">/pmfcorpno/</w:t>
             </w:r>
           </w:p>
         </w:tc>
@@ -588,10 +619,11 @@
             <w:r>
               <w:rPr>
                 <w:rFonts w:ascii="Calibri" w:cs="Calibri" w:eastAsia="Calibri" w:hAnsi="Calibri"/>
-                <w:sz w:val="21"/>
-                <w:szCs w:val="21"/>
-              </w:rPr>
-              <w:t xml:space="preserve">{{ Address for Notices }}</w:t>
+                <w:color w:val="FFFFFF"/>
+                <w:sz w:val="2"/>
+                <w:szCs w:val="2"/>
+              </w:rPr>
+              <w:t xml:space="preserve">/pmfnotice/</w:t>
             </w:r>
           </w:p>
         </w:tc>
@@ -873,14 +905,6 @@
               </w:rPr>
               <w:t xml:space="preserve">/pmo1t/</w:t>
             </w:r>
-            <w:r>
-              <w:rPr>
-                <w:rFonts w:ascii="Calibri" w:cs="Calibri" w:eastAsia="Calibri" w:hAnsi="Calibri"/>
-                <w:sz w:val="21"/>
-                <w:szCs w:val="21"/>
-              </w:rPr>
-              <w:t xml:space="preserve">{{ Phone Number }}</w:t>
-            </w:r>
           </w:p>
         </w:tc>
         <w:tc>
@@ -1015,14 +1039,6 @@
               </w:rPr>
               <w:t xml:space="preserve">/pmo2t/</w:t>
             </w:r>
-            <w:r>
-              <w:rPr>
-                <w:rFonts w:ascii="Calibri" w:cs="Calibri" w:eastAsia="Calibri" w:hAnsi="Calibri"/>
-                <w:sz w:val="21"/>
-                <w:szCs w:val="21"/>
-              </w:rPr>
-              <w:t xml:space="preserve">{{ Phone Number }}</w:t>
-            </w:r>
           </w:p>
         </w:tc>
         <w:tc>
@@ -1157,14 +1173,6 @@
               </w:rPr>
               <w:t xml:space="preserve">/pmo3t/</w:t>
             </w:r>
-            <w:r>
-              <w:rPr>
-                <w:rFonts w:ascii="Calibri" w:cs="Calibri" w:eastAsia="Calibri" w:hAnsi="Calibri"/>
-                <w:sz w:val="21"/>
-                <w:szCs w:val="21"/>
-              </w:rPr>
-              <w:t xml:space="preserve">{{ Phone Number }}</w:t>
-            </w:r>
           </w:p>
         </w:tc>
         <w:tc>
@@ -1299,14 +1307,6 @@
               </w:rPr>
               <w:t xml:space="preserve">/pmo4t/</w:t>
             </w:r>
-            <w:r>
-              <w:rPr>
-                <w:rFonts w:ascii="Calibri" w:cs="Calibri" w:eastAsia="Calibri" w:hAnsi="Calibri"/>
-                <w:sz w:val="21"/>
-                <w:szCs w:val="21"/>
-              </w:rPr>
-              <w:t xml:space="preserve">{{ Phone Number }}</w:t>
-            </w:r>
           </w:p>
         </w:tc>
         <w:tc>
@@ -1441,14 +1441,6 @@
               </w:rPr>
               <w:t xml:space="preserve">/pmo5t/</w:t>
             </w:r>
-            <w:r>
-              <w:rPr>
-                <w:rFonts w:ascii="Calibri" w:cs="Calibri" w:eastAsia="Calibri" w:hAnsi="Calibri"/>
-                <w:sz w:val="21"/>
-                <w:szCs w:val="21"/>
-              </w:rPr>
-              <w:t xml:space="preserve">{{ Phone Number }}</w:t>
-            </w:r>
           </w:p>
         </w:tc>
         <w:tc>
@@ -1582,14 +1574,6 @@
                 <w:szCs w:val="2"/>
               </w:rPr>
               <w:t xml:space="preserve">/pmo6t/</w:t>
-            </w:r>
-            <w:r>
-              <w:rPr>
-                <w:rFonts w:ascii="Calibri" w:cs="Calibri" w:eastAsia="Calibri" w:hAnsi="Calibri"/>
-                <w:sz w:val="21"/>
-                <w:szCs w:val="21"/>
-              </w:rPr>
-              <w:t xml:space="preserve">{{ Phone Number }}</w:t>
             </w:r>
           </w:p>
         </w:tc>
@@ -1800,14 +1784,6 @@
               </w:rPr>
               <w:t xml:space="preserve">/pmst/</w:t>
             </w:r>
-            <w:r>
-              <w:rPr>
-                <w:rFonts w:ascii="Calibri" w:cs="Calibri" w:eastAsia="Calibri" w:hAnsi="Calibri"/>
-                <w:sz w:val="21"/>
-                <w:szCs w:val="21"/>
-              </w:rPr>
-              <w:t xml:space="preserve">{{ Phone Number }}</w:t>
-            </w:r>
           </w:p>
         </w:tc>
       </w:tr>
@@ -2186,7 +2162,7 @@
                 <w:sz w:val="21"/>
                 <w:szCs w:val="21"/>
               </w:rPr>
-              <w:t xml:space="preserve">{{ IRep Address }}</w:t>
+              <w:t xml:space="preserve">6-2557 Dougall Ave, Suite 223, Windsor, ON N8X 1T5</w:t>
             </w:r>
           </w:p>
         </w:tc>
@@ -2466,10 +2442,11 @@
             <w:r>
               <w:rPr>
                 <w:rFonts w:ascii="Calibri" w:cs="Calibri" w:eastAsia="Calibri" w:hAnsi="Calibri"/>
-                <w:sz w:val="21"/>
-                <w:szCs w:val="21"/>
-              </w:rPr>
-              <w:t xml:space="preserve">{{ Property Address }}</w:t>
+                <w:color w:val="FFFFFF"/>
+                <w:sz w:val="2"/>
+                <w:szCs w:val="2"/>
+              </w:rPr>
+              <w:t xml:space="preserve">/pmfaddr/</w:t>
             </w:r>
           </w:p>
         </w:tc>
@@ -2534,10 +2511,11 @@
             <w:r>
               <w:rPr>
                 <w:rFonts w:ascii="Calibri" w:cs="Calibri" w:eastAsia="Calibri" w:hAnsi="Calibri"/>
-                <w:sz w:val="21"/>
-                <w:szCs w:val="21"/>
-              </w:rPr>
-              <w:t xml:space="preserve">{{ City and Postal Code }}</w:t>
+                <w:color w:val="FFFFFF"/>
+                <w:sz w:val="2"/>
+                <w:szCs w:val="2"/>
+              </w:rPr>
+              <w:t xml:space="preserve">/pmfcity/</w:t>
             </w:r>
           </w:p>
         </w:tc>
@@ -2812,10 +2790,11 @@
             <w:r>
               <w:rPr>
                 <w:rFonts w:ascii="Calibri" w:cs="Calibri" w:eastAsia="Calibri" w:hAnsi="Calibri"/>
-                <w:sz w:val="21"/>
-                <w:szCs w:val="21"/>
-              </w:rPr>
-              <w:t xml:space="preserve">{{ Execution Date }}</w:t>
+                <w:color w:val="FFFFFF"/>
+                <w:sz w:val="2"/>
+                <w:szCs w:val="2"/>
+              </w:rPr>
+              <w:t xml:space="preserve">/pmfstart/</w:t>
             </w:r>
           </w:p>
         </w:tc>
@@ -5402,7 +5381,41 @@
           <w:sz w:val="21"/>
           <w:szCs w:val="21"/>
         </w:rPr>
-        <w:t xml:space="preserve"> A total discount of {{ Annual Discount.value }} {{ Annual Discount.currencyCode }} is granted, applied as {{ Monthly Discount.value }} {{ Monthly Discount.currencyCode }} per month for the twelve (12) months following the Effective Date. This includes an existing landlord moved to this Agreement as a new engagement under section 2.10(a). The discount ends automatically after those twelve months without further notice, does not apply to Schedule A optional service fees, and ends early if this Agreement ends.</w:t>
+        <w:t xml:space="preserve"> A total discount of </w:t>
+      </w:r>
+      <w:r>
+        <w:rPr>
+          <w:rFonts w:ascii="Calibri" w:cs="Calibri" w:eastAsia="Calibri" w:hAnsi="Calibri"/>
+          <w:color w:val="FFFFFF"/>
+          <w:sz w:val="2"/>
+          <w:szCs w:val="2"/>
+        </w:rPr>
+        <w:t xml:space="preserve">/pmfdisca/</w:t>
+      </w:r>
+      <w:r>
+        <w:rPr>
+          <w:rFonts w:ascii="Calibri" w:cs="Calibri" w:eastAsia="Calibri" w:hAnsi="Calibri"/>
+          <w:sz w:val="21"/>
+          <w:szCs w:val="21"/>
+        </w:rPr>
+        <w:t xml:space="preserve">________________ is granted, applied as </w:t>
+      </w:r>
+      <w:r>
+        <w:rPr>
+          <w:rFonts w:ascii="Calibri" w:cs="Calibri" w:eastAsia="Calibri" w:hAnsi="Calibri"/>
+          <w:color w:val="FFFFFF"/>
+          <w:sz w:val="2"/>
+          <w:szCs w:val="2"/>
+        </w:rPr>
+        <w:t xml:space="preserve">/pmfdiscm/</w:t>
+      </w:r>
+      <w:r>
+        <w:rPr>
+          <w:rFonts w:ascii="Calibri" w:cs="Calibri" w:eastAsia="Calibri" w:hAnsi="Calibri"/>
+          <w:sz w:val="21"/>
+          <w:szCs w:val="21"/>
+        </w:rPr>
+        <w:t xml:space="preserve">______________ per month for the twelve (12) months following the Effective Date. This includes an existing landlord moved to this Agreement as a new engagement under section 2.10(a). The discount ends automatically after those twelve months without further notice, does not apply to Schedule A optional service fees, and ends early if this Agreement ends.</w:t>
       </w:r>
     </w:p>
     <w:p>
@@ -5781,7 +5794,24 @@
           <w:sz w:val="21"/>
           <w:szCs w:val="21"/>
         </w:rPr>
-        <w:t xml:space="preserve">The Landlord shall respond to any request for approval from the Manager within {{ Response Time (Maintenance) }} (if left blank, forty-eight (48) hours). If the Landlord does not respond in time, the Manager is not obliged to carry out the work and is not liable for any consequence of the delay.</w:t>
+        <w:t xml:space="preserve">The Landlord shall respond to any request for approval from the Manager within </w:t>
+      </w:r>
+      <w:r>
+        <w:rPr>
+          <w:rFonts w:ascii="Calibri" w:cs="Calibri" w:eastAsia="Calibri" w:hAnsi="Calibri"/>
+          <w:color w:val="FFFFFF"/>
+          <w:sz w:val="2"/>
+          <w:szCs w:val="2"/>
+        </w:rPr>
+        <w:t xml:space="preserve">/pmfresp/</w:t>
+      </w:r>
+      <w:r>
+        <w:rPr>
+          <w:rFonts w:ascii="Calibri" w:cs="Calibri" w:eastAsia="Calibri" w:hAnsi="Calibri"/>
+          <w:sz w:val="21"/>
+          <w:szCs w:val="21"/>
+        </w:rPr>
+        <w:t xml:space="preserve">________________ (if left blank, forty-eight (48) hours). If the Landlord does not respond in time, the Manager is not obliged to carry out the work and is not liable for any consequence of the delay.</w:t>
       </w:r>
     </w:p>
     <w:p>
@@ -9365,15 +9395,15 @@
           <w:p>
             <w:pPr>
               <w:spacing w:after="0" w:line="240"/>
-              <w:jc w:val="center"/>
-            </w:pPr>
-            <w:r>
-              <w:rPr>
-                <w:rFonts w:ascii="Calibri" w:cs="Calibri" w:eastAsia="Calibri" w:hAnsi="Calibri"/>
-                <w:sz w:val="21"/>
-                <w:szCs w:val="21"/>
-              </w:rPr>
-              <w:t xml:space="preserve">{{ Additional Lease Cost.value }} {{ Additional Lease Cost.currencyCode }}</w:t>
+            </w:pPr>
+            <w:r>
+              <w:rPr>
+                <w:rFonts w:ascii="Calibri" w:cs="Calibri" w:eastAsia="Calibri" w:hAnsi="Calibri"/>
+                <w:color w:val="FFFFFF"/>
+                <w:sz w:val="2"/>
+                <w:szCs w:val="2"/>
+              </w:rPr>
+              <w:t xml:space="preserve">/pmfaddl/</w:t>
             </w:r>
           </w:p>
         </w:tc>
@@ -9462,6 +9492,15 @@
             <w:pPr>
               <w:spacing w:after="0" w:line="240"/>
             </w:pPr>
+            <w:r>
+              <w:rPr>
+                <w:rFonts w:ascii="Calibri" w:cs="Calibri" w:eastAsia="Calibri" w:hAnsi="Calibri"/>
+                <w:color w:val="FFFFFF"/>
+                <w:sz w:val="2"/>
+                <w:szCs w:val="2"/>
+              </w:rPr>
+              <w:t xml:space="preserve">/pmfmgmt/</w:t>
+            </w:r>
           </w:p>
         </w:tc>
       </w:tr>
@@ -9848,15 +9887,15 @@
           <w:p>
             <w:pPr>
               <w:spacing w:after="0" w:line="240"/>
-              <w:jc w:val="center"/>
-            </w:pPr>
-            <w:r>
-              <w:rPr>
-                <w:rFonts w:ascii="Calibri" w:cs="Calibri" w:eastAsia="Calibri" w:hAnsi="Calibri"/>
-                <w:sz w:val="21"/>
-                <w:szCs w:val="21"/>
-              </w:rPr>
-              <w:t xml:space="preserve">{{ Lawn/Snow Cost.value }} {{ Lawn/Snow Cost.currencyCode }}</w:t>
+            </w:pPr>
+            <w:r>
+              <w:rPr>
+                <w:rFonts w:ascii="Calibri" w:cs="Calibri" w:eastAsia="Calibri" w:hAnsi="Calibri"/>
+                <w:color w:val="FFFFFF"/>
+                <w:sz w:val="2"/>
+                <w:szCs w:val="2"/>
+              </w:rPr>
+              <w:t xml:space="preserve">/pmfsnow/</w:t>
             </w:r>
           </w:p>
         </w:tc>
@@ -10194,15 +10233,15 @@
           <w:p>
             <w:pPr>
               <w:spacing w:after="0" w:line="240"/>
-              <w:jc w:val="center"/>
-            </w:pPr>
-            <w:r>
-              <w:rPr>
-                <w:rFonts w:ascii="Calibri" w:cs="Calibri" w:eastAsia="Calibri" w:hAnsi="Calibri"/>
-                <w:sz w:val="21"/>
-                <w:szCs w:val="21"/>
-              </w:rPr>
-              <w:t xml:space="preserve">{{ Security Cost.value }} {{ Security Cost.currencyCode }}</w:t>
+            </w:pPr>
+            <w:r>
+              <w:rPr>
+                <w:rFonts w:ascii="Calibri" w:cs="Calibri" w:eastAsia="Calibri" w:hAnsi="Calibri"/>
+                <w:color w:val="FFFFFF"/>
+                <w:sz w:val="2"/>
+                <w:szCs w:val="2"/>
+              </w:rPr>
+              <w:t xml:space="preserve">/pmfsec/</w:t>
             </w:r>
           </w:p>
         </w:tc>
@@ -10524,15 +10563,15 @@
           <w:p>
             <w:pPr>
               <w:spacing w:after="0" w:line="240"/>
-              <w:jc w:val="center"/>
-            </w:pPr>
-            <w:r>
-              <w:rPr>
-                <w:rFonts w:ascii="Calibri" w:cs="Calibri" w:eastAsia="Calibri" w:hAnsi="Calibri"/>
-                <w:sz w:val="21"/>
-                <w:szCs w:val="21"/>
-              </w:rPr>
-              <w:t xml:space="preserve">{{ Appliance Cost.value }} {{ Appliance Cost.currencyCode }}</w:t>
+            </w:pPr>
+            <w:r>
+              <w:rPr>
+                <w:rFonts w:ascii="Calibri" w:cs="Calibri" w:eastAsia="Calibri" w:hAnsi="Calibri"/>
+                <w:color w:val="FFFFFF"/>
+                <w:sz w:val="2"/>
+                <w:szCs w:val="2"/>
+              </w:rPr>
+              <w:t xml:space="preserve">/pmfapp/</w:t>
             </w:r>
           </w:p>
         </w:tc>
@@ -10697,15 +10736,15 @@
           <w:p>
             <w:pPr>
               <w:spacing w:after="0" w:line="240"/>
-              <w:jc w:val="center"/>
-            </w:pPr>
-            <w:r>
-              <w:rPr>
-                <w:rFonts w:ascii="Calibri" w:cs="Calibri" w:eastAsia="Calibri" w:hAnsi="Calibri"/>
-                <w:sz w:val="21"/>
-                <w:szCs w:val="21"/>
-              </w:rPr>
-              <w:t xml:space="preserve">{{ Plumbing Cost.value }} {{ Plumbing Cost.currencyCode }}</w:t>
+            </w:pPr>
+            <w:r>
+              <w:rPr>
+                <w:rFonts w:ascii="Calibri" w:cs="Calibri" w:eastAsia="Calibri" w:hAnsi="Calibri"/>
+                <w:color w:val="FFFFFF"/>
+                <w:sz w:val="2"/>
+                <w:szCs w:val="2"/>
+              </w:rPr>
+              <w:t xml:space="preserve">/pmfplumb/</w:t>
             </w:r>
           </w:p>
         </w:tc>
@@ -10870,15 +10909,15 @@
           <w:p>
             <w:pPr>
               <w:spacing w:after="0" w:line="240"/>
-              <w:jc w:val="center"/>
-            </w:pPr>
-            <w:r>
-              <w:rPr>
-                <w:rFonts w:ascii="Calibri" w:cs="Calibri" w:eastAsia="Calibri" w:hAnsi="Calibri"/>
-                <w:sz w:val="21"/>
-                <w:szCs w:val="21"/>
-              </w:rPr>
-              <w:t xml:space="preserve">{{ Cleaning Cost.value }} {{ Cleaning Cost.currencyCode }}</w:t>
+            </w:pPr>
+            <w:r>
+              <w:rPr>
+                <w:rFonts w:ascii="Calibri" w:cs="Calibri" w:eastAsia="Calibri" w:hAnsi="Calibri"/>
+                <w:color w:val="FFFFFF"/>
+                <w:sz w:val="2"/>
+                <w:szCs w:val="2"/>
+              </w:rPr>
+              <w:t xml:space="preserve">/pmfclean/</w:t>
             </w:r>
           </w:p>
         </w:tc>
@@ -11015,6 +11054,15 @@
             <w:pPr>
               <w:spacing w:after="0" w:line="240"/>
             </w:pPr>
+            <w:r>
+              <w:rPr>
+                <w:rFonts w:ascii="Calibri" w:cs="Calibri" w:eastAsia="Calibri" w:hAnsi="Calibri"/>
+                <w:color w:val="FFFFFF"/>
+                <w:sz w:val="2"/>
+                <w:szCs w:val="2"/>
+              </w:rPr>
+              <w:t xml:space="preserve">/pmfopt/</w:t>
+            </w:r>
           </w:p>
         </w:tc>
       </w:tr>
@@ -11253,6 +11301,7 @@
       <w:tr>
         <w:trPr>
           <w:cantSplit/>
+          <w:trHeight w:val="360" w:hRule="atLeast"/>
         </w:trPr>
         <w:tc>
           <w:tcPr>
@@ -11305,15 +11354,15 @@
           <w:p>
             <w:pPr>
               <w:spacing w:after="0" w:line="240"/>
-              <w:jc w:val="center"/>
-            </w:pPr>
-            <w:r>
-              <w:rPr>
-                <w:rFonts w:ascii="Calibri" w:cs="Calibri" w:eastAsia="Calibri" w:hAnsi="Calibri"/>
-                <w:sz w:val="21"/>
-                <w:szCs w:val="21"/>
-              </w:rPr>
-              <w:t xml:space="preserve">{{ Total Management Cost.value }} {{ Total Management Cost.currencyCode }}</w:t>
+            </w:pPr>
+            <w:r>
+              <w:rPr>
+                <w:rFonts w:ascii="Calibri" w:cs="Calibri" w:eastAsia="Calibri" w:hAnsi="Calibri"/>
+                <w:color w:val="FFFFFF"/>
+                <w:sz w:val="2"/>
+                <w:szCs w:val="2"/>
+              </w:rPr>
+              <w:t xml:space="preserve">/pmftmgmt/</w:t>
             </w:r>
           </w:p>
         </w:tc>
@@ -11321,6 +11370,7 @@
       <w:tr>
         <w:trPr>
           <w:cantSplit/>
+          <w:trHeight w:val="360" w:hRule="atLeast"/>
         </w:trPr>
         <w:tc>
           <w:tcPr>
@@ -11373,15 +11423,15 @@
           <w:p>
             <w:pPr>
               <w:spacing w:after="0" w:line="240"/>
-              <w:jc w:val="center"/>
-            </w:pPr>
-            <w:r>
-              <w:rPr>
-                <w:rFonts w:ascii="Calibri" w:cs="Calibri" w:eastAsia="Calibri" w:hAnsi="Calibri"/>
-                <w:sz w:val="21"/>
-                <w:szCs w:val="21"/>
-              </w:rPr>
-              <w:t xml:space="preserve">{{ Additional Services Cost.value }} {{ Additional Services Cost.currencyCode }}</w:t>
+            </w:pPr>
+            <w:r>
+              <w:rPr>
+                <w:rFonts w:ascii="Calibri" w:cs="Calibri" w:eastAsia="Calibri" w:hAnsi="Calibri"/>
+                <w:color w:val="FFFFFF"/>
+                <w:sz w:val="2"/>
+                <w:szCs w:val="2"/>
+              </w:rPr>
+              <w:t xml:space="preserve">/pmftopt/</w:t>
             </w:r>
           </w:p>
         </w:tc>
@@ -11389,6 +11439,7 @@
       <w:tr>
         <w:trPr>
           <w:cantSplit/>
+          <w:trHeight w:val="360" w:hRule="atLeast"/>
         </w:trPr>
         <w:tc>
           <w:tcPr>
@@ -11441,15 +11492,15 @@
           <w:p>
             <w:pPr>
               <w:spacing w:after="0" w:line="240"/>
-              <w:jc w:val="center"/>
-            </w:pPr>
-            <w:r>
-              <w:rPr>
-                <w:rFonts w:ascii="Calibri" w:cs="Calibri" w:eastAsia="Calibri" w:hAnsi="Calibri"/>
-                <w:sz w:val="21"/>
-                <w:szCs w:val="21"/>
-              </w:rPr>
-              <w:t xml:space="preserve">{{ Monthly Discount.value }} {{ Monthly Discount.currencyCode }}</w:t>
+            </w:pPr>
+            <w:r>
+              <w:rPr>
+                <w:rFonts w:ascii="Calibri" w:cs="Calibri" w:eastAsia="Calibri" w:hAnsi="Calibri"/>
+                <w:color w:val="FFFFFF"/>
+                <w:sz w:val="2"/>
+                <w:szCs w:val="2"/>
+              </w:rPr>
+              <w:t xml:space="preserve">/pmftdisc/</w:t>
             </w:r>
           </w:p>
         </w:tc>
@@ -11457,6 +11508,7 @@
       <w:tr>
         <w:trPr>
           <w:cantSplit/>
+          <w:trHeight w:val="360" w:hRule="atLeast"/>
         </w:trPr>
         <w:tc>
           <w:tcPr>
@@ -11511,15 +11563,15 @@
           <w:p>
             <w:pPr>
               <w:spacing w:after="0" w:line="240"/>
-              <w:jc w:val="center"/>
-            </w:pPr>
-            <w:r>
-              <w:rPr>
-                <w:rFonts w:ascii="Calibri" w:cs="Calibri" w:eastAsia="Calibri" w:hAnsi="Calibri"/>
-                <w:sz w:val="21"/>
-                <w:szCs w:val="21"/>
-              </w:rPr>
-              <w:t xml:space="preserve">{{ Subtotal Fee.value }} {{ Subtotal Fee.currencyCode }}</w:t>
+            </w:pPr>
+            <w:r>
+              <w:rPr>
+                <w:rFonts w:ascii="Calibri" w:cs="Calibri" w:eastAsia="Calibri" w:hAnsi="Calibri"/>
+                <w:color w:val="FFFFFF"/>
+                <w:sz w:val="2"/>
+                <w:szCs w:val="2"/>
+              </w:rPr>
+              <w:t xml:space="preserve">/pmftsub/</w:t>
             </w:r>
           </w:p>
         </w:tc>
@@ -11527,6 +11579,7 @@
       <w:tr>
         <w:trPr>
           <w:cantSplit/>
+          <w:trHeight w:val="360" w:hRule="atLeast"/>
         </w:trPr>
         <w:tc>
           <w:tcPr>
@@ -11579,15 +11632,15 @@
           <w:p>
             <w:pPr>
               <w:spacing w:after="0" w:line="240"/>
-              <w:jc w:val="center"/>
-            </w:pPr>
-            <w:r>
-              <w:rPr>
-                <w:rFonts w:ascii="Calibri" w:cs="Calibri" w:eastAsia="Calibri" w:hAnsi="Calibri"/>
-                <w:sz w:val="21"/>
-                <w:szCs w:val="21"/>
-              </w:rPr>
-              <w:t xml:space="preserve">{{ Fee HST.value }} {{ Fee HST.currencyCode }}</w:t>
+            </w:pPr>
+            <w:r>
+              <w:rPr>
+                <w:rFonts w:ascii="Calibri" w:cs="Calibri" w:eastAsia="Calibri" w:hAnsi="Calibri"/>
+                <w:color w:val="FFFFFF"/>
+                <w:sz w:val="2"/>
+                <w:szCs w:val="2"/>
+              </w:rPr>
+              <w:t xml:space="preserve">/pmfthst/</w:t>
             </w:r>
           </w:p>
         </w:tc>
@@ -11595,6 +11648,7 @@
       <w:tr>
         <w:trPr>
           <w:cantSplit/>
+          <w:trHeight w:val="360" w:hRule="atLeast"/>
         </w:trPr>
         <w:tc>
           <w:tcPr>
@@ -11649,15 +11703,15 @@
           <w:p>
             <w:pPr>
               <w:spacing w:after="0" w:line="240"/>
-              <w:jc w:val="center"/>
-            </w:pPr>
-            <w:r>
-              <w:rPr>
-                <w:rFonts w:ascii="Calibri" w:cs="Calibri" w:eastAsia="Calibri" w:hAnsi="Calibri"/>
-                <w:sz w:val="21"/>
-                <w:szCs w:val="21"/>
-              </w:rPr>
-              <w:t xml:space="preserve">{{ Total Fee Monthly.value }} {{ Total Fee Monthly.currencyCode }}</w:t>
+            </w:pPr>
+            <w:r>
+              <w:rPr>
+                <w:rFonts w:ascii="Calibri" w:cs="Calibri" w:eastAsia="Calibri" w:hAnsi="Calibri"/>
+                <w:color w:val="FFFFFF"/>
+                <w:sz w:val="2"/>
+                <w:szCs w:val="2"/>
+              </w:rPr>
+              <w:t xml:space="preserve">/pmfttot/</w:t>
             </w:r>
           </w:p>
         </w:tc>

</xml_diff>

<commit_message>
Contract: binds from the Effective Date (signing); management, the Initial Term and the switch from an earlier agreement start on the Commencement Date
Co-Authored-By: Claude Opus 5.5 <noreply@anthropic.com>
Claude-Session: https://claude.ai/code/session_01USozer2zpKfGeBovA7GUQw
</commit_message>
<xml_diff>
--- a/docs/contracts/IRep_Property_Management_Contract.docx
+++ b/docs/contracts/IRep_Property_Management_Contract.docx
@@ -3332,7 +3332,25 @@
           <w:sz w:val="21"/>
           <w:szCs w:val="21"/>
         </w:rPr>
-        <w:t xml:space="preserve">Subject to sections 2.10 and 2.11, the initial term of this Agreement is twelve (12) months beginning on the Commencement Date (the </w:t>
+        <w:t xml:space="preserve">This Agreement binds the parties from the Effective Date. The Manager begins providing services under it on the commencement date shown on page 2 (the </w:t>
+      </w:r>
+      <w:r>
+        <w:rPr>
+          <w:rFonts w:ascii="Calibri" w:cs="Calibri" w:eastAsia="Calibri" w:hAnsi="Calibri"/>
+          <w:b/>
+          <w:bCs/>
+          <w:sz w:val="21"/>
+          <w:szCs w:val="21"/>
+        </w:rPr>
+        <w:t xml:space="preserve">"Commencement Date"</w:t>
+      </w:r>
+      <w:r>
+        <w:rPr>
+          <w:rFonts w:ascii="Calibri" w:cs="Calibri" w:eastAsia="Calibri" w:hAnsi="Calibri"/>
+          <w:sz w:val="21"/>
+          <w:szCs w:val="21"/>
+        </w:rPr>
+        <w:t xml:space="preserve">). Subject to sections 2.10 and 2.11, the initial term of this Agreement is twelve (12) months beginning on the Commencement Date (the </w:t>
       </w:r>
       <w:r>
         <w:rPr>
@@ -4184,7 +4202,7 @@
           <w:sz w:val="21"/>
           <w:szCs w:val="21"/>
         </w:rPr>
-        <w:t xml:space="preserve"> this Agreement is treated as a new engagement from the Effective Date. The Initial Term, the first-year discount under section 5.7 and the early termination charge under section 2.8 apply as for a new client, despite the earlier management, and section 2.11 does not apply.</w:t>
+        <w:t xml:space="preserve"> this Agreement is treated as a new engagement from the Commencement Date. The Initial Term, the first-year discount under section 5.7 and the early termination charge under section 2.8 apply as for a new client, despite the earlier management, and section 2.11 does not apply.</w:t>
       </w:r>
     </w:p>
     <w:p>
@@ -4219,15 +4237,15 @@
           <w:sz w:val="21"/>
           <w:szCs w:val="21"/>
         </w:rPr>
-        <w:t xml:space="preserve">Re-signing, where the Manager has managed the Property continuously for twelve (12) months or more as at the Effective Date:</w:t>
-      </w:r>
-      <w:r>
-        <w:rPr>
-          <w:rFonts w:ascii="Calibri" w:cs="Calibri" w:eastAsia="Calibri" w:hAnsi="Calibri"/>
-          <w:sz w:val="21"/>
-          <w:szCs w:val="21"/>
-        </w:rPr>
-        <w:t xml:space="preserve"> no new Initial Term applies. This Agreement runs month to month from the Effective Date, the Landlord may end it on sixty (60) days’ written notice under section 2.3, and no early termination charge under section 2.8 is payable. Optional services already provided for twelve (12) months or more likewise continue month to month; an optional service newly added on or after the Effective Date carries its own minimum term under section 6.2.</w:t>
+        <w:t xml:space="preserve">Re-signing, where the Manager has managed the Property continuously for twelve (12) months or more as at the Commencement Date:</w:t>
+      </w:r>
+      <w:r>
+        <w:rPr>
+          <w:rFonts w:ascii="Calibri" w:cs="Calibri" w:eastAsia="Calibri" w:hAnsi="Calibri"/>
+          <w:sz w:val="21"/>
+          <w:szCs w:val="21"/>
+        </w:rPr>
+        <w:t xml:space="preserve"> no new Initial Term applies. This Agreement runs month to month from the Commencement Date, the Landlord may end it on sixty (60) days’ written notice under section 2.3, and no early termination charge under section 2.8 is payable. Optional services already provided for twelve (12) months or more likewise continue month to month; an optional service newly added on or after the Commencement Date carries its own minimum term under section 6.2.</w:t>
       </w:r>
     </w:p>
     <w:p>
@@ -4241,7 +4259,7 @@
           <w:sz w:val="21"/>
           <w:szCs w:val="21"/>
         </w:rPr>
-        <w:t xml:space="preserve">In either case, this Agreement replaces the earlier agreement from the Effective Date. Amounts owing under the earlier agreement remain payable.</w:t>
+        <w:t xml:space="preserve">In either case, this Agreement replaces the earlier agreement from the Commencement Date, and the earlier agreement continues to apply until then. Amounts owing under the earlier agreement remain payable.</w:t>
       </w:r>
     </w:p>
     <w:p>
@@ -4286,7 +4304,7 @@
           <w:sz w:val="21"/>
           <w:szCs w:val="21"/>
         </w:rPr>
-        <w:t xml:space="preserve"> Where page 1 shows a re-signing and the Manager has managed the Property for less than twelve (12) months as at the Effective Date, the Initial Term ends twelve (12) months after the date shown as “Managed since” on page 1, and not twelve months after the Effective Date. Signing this Agreement does not restart or extend the original twelve-month commitment.</w:t>
+        <w:t xml:space="preserve"> Where page 1 shows a re-signing and the Manager has managed the Property for less than twelve (12) months as at the Commencement Date, the Initial Term ends twelve (12) months after the date shown as “Managed since” on page 1, and not twelve months after the Commencement Date. Signing this Agreement does not restart or extend the original twelve-month commitment.</w:t>
       </w:r>
     </w:p>
     <w:p>

</xml_diff>

<commit_message>
Contract engagement types: new landlord or 12-month renewal (2.10(a)) vs existing landlord month to month (2.10(b))
Co-Authored-By: Claude Opus 5.5 <noreply@anthropic.com>
Claude-Session: https://claude.ai/code/session_01USozer2zpKfGeBovA7GUQw
</commit_message>
<xml_diff>
--- a/docs/contracts/IRep_Property_Management_Contract.docx
+++ b/docs/contracts/IRep_Property_Management_Contract.docx
@@ -169,15 +169,12 @@
               <w:bottom w:type="dxa" w:w="60"/>
               <w:right w:type="dxa" w:w="120"/>
             </w:tcMar>
-            <w:vAlign w:val="bottom"/>
-          </w:tcPr>
-          <w:p>
-            <w:pPr>
-              <w:tabs>
-                <w:tab w:val="left" w:pos="5740"/>
-              </w:tabs>
-              <w:spacing w:after="0" w:line="240"/>
-              <w:ind w:firstLine="380"/>
+            <w:vAlign w:val="top"/>
+          </w:tcPr>
+          <w:p>
+            <w:pPr>
+              <w:spacing w:after="40" w:line="240"/>
+              <w:ind w:left="380"/>
             </w:pPr>
             <w:r>
               <w:rPr>
@@ -194,8 +191,14 @@
                 <w:sz w:val="21"/>
                 <w:szCs w:val="21"/>
               </w:rPr>
-              <w:t xml:space="preserve">New engagement — 12-month Initial Term applies (s. 2.1)	</w:t>
-            </w:r>
+              <w:t xml:space="preserve">New landlord, or a renewal for a new 12-month term (s. 2.1, 2.10(a))</w:t>
+            </w:r>
+          </w:p>
+          <w:p>
+            <w:pPr>
+              <w:spacing w:after="40" w:line="240"/>
+              <w:ind w:left="380"/>
+            </w:pPr>
             <w:r>
               <w:rPr>
                 <w:rFonts w:ascii="Calibri" w:cs="Calibri" w:eastAsia="Calibri" w:hAnsi="Calibri"/>
@@ -211,7 +214,7 @@
                 <w:sz w:val="21"/>
                 <w:szCs w:val="21"/>
               </w:rPr>
-              <w:t xml:space="preserve">Re-signing an existing landlord (s. 2.10)</w:t>
+              <w:t xml:space="preserve">Existing landlord continuing month to month, no new term (s. 2.10(b))</w:t>
             </w:r>
           </w:p>
         </w:tc>
@@ -272,9 +275,6 @@
           </w:tcPr>
           <w:p>
             <w:pPr>
-              <w:tabs>
-                <w:tab w:val="left" w:pos="1800"/>
-              </w:tabs>
               <w:spacing w:after="0" w:line="240"/>
             </w:pPr>
             <w:r>
@@ -286,21 +286,19 @@
               </w:rPr>
               <w:t xml:space="preserve">/pmfms/</w:t>
             </w:r>
-            <w:r>
-              <w:rPr>
-                <w:rFonts w:ascii="Calibri" w:cs="Calibri" w:eastAsia="Calibri" w:hAnsi="Calibri"/>
-                <w:sz w:val="21"/>
-                <w:szCs w:val="21"/>
-              </w:rPr>
-              <w:t xml:space="preserve">	</w:t>
-            </w:r>
-            <w:r>
-              <w:rPr>
-                <w:rFonts w:ascii="Calibri" w:cs="Calibri" w:eastAsia="Calibri" w:hAnsi="Calibri"/>
+          </w:p>
+          <w:p>
+            <w:pPr>
+              <w:spacing w:after="0" w:line="240"/>
+            </w:pPr>
+            <w:r>
+              <w:rPr>
+                <w:rFonts w:ascii="Calibri" w:cs="Calibri" w:eastAsia="Calibri" w:hAnsi="Calibri"/>
+                <w:color w:val="595959"/>
                 <w:sz w:val="15"/>
                 <w:szCs w:val="15"/>
               </w:rPr>
-              <w:t xml:space="preserve">Complete only when re-signing. If 12 months or more, this Agreement runs month-to-month under s. 2.10.</w:t>
+              <w:t xml:space="preserve">Complete only for month to month. If under 12 months, the original term finishes first (s. 2.11).</w:t>
             </w:r>
           </w:p>
         </w:tc>
@@ -4194,15 +4192,15 @@
           <w:sz w:val="21"/>
           <w:szCs w:val="21"/>
         </w:rPr>
-        <w:t xml:space="preserve">New engagement:</w:t>
-      </w:r>
-      <w:r>
-        <w:rPr>
-          <w:rFonts w:ascii="Calibri" w:cs="Calibri" w:eastAsia="Calibri" w:hAnsi="Calibri"/>
-          <w:sz w:val="21"/>
-          <w:szCs w:val="21"/>
-        </w:rPr>
-        <w:t xml:space="preserve"> this Agreement is treated as a new engagement from the Commencement Date. The Initial Term, the first-year discount under section 5.7 and the early termination charge under section 2.8 apply as for a new client, despite the earlier management, and section 2.11 does not apply.</w:t>
+        <w:t xml:space="preserve">Renewal for a new term:</w:t>
+      </w:r>
+      <w:r>
+        <w:rPr>
+          <w:rFonts w:ascii="Calibri" w:cs="Calibri" w:eastAsia="Calibri" w:hAnsi="Calibri"/>
+          <w:sz w:val="21"/>
+          <w:szCs w:val="21"/>
+        </w:rPr>
+        <w:t xml:space="preserve"> this Agreement starts a new twelve (12) month Initial Term on the Commencement Date. The first-year discount under section 5.7 and the early termination charge under section 2.8 apply as for a new client, despite the earlier management, and section 2.11 does not apply.</w:t>
       </w:r>
     </w:p>
     <w:p>
@@ -4237,15 +4235,15 @@
           <w:sz w:val="21"/>
           <w:szCs w:val="21"/>
         </w:rPr>
-        <w:t xml:space="preserve">Re-signing, where the Manager has managed the Property continuously for twelve (12) months or more as at the Commencement Date:</w:t>
-      </w:r>
-      <w:r>
-        <w:rPr>
-          <w:rFonts w:ascii="Calibri" w:cs="Calibri" w:eastAsia="Calibri" w:hAnsi="Calibri"/>
-          <w:sz w:val="21"/>
-          <w:szCs w:val="21"/>
-        </w:rPr>
-        <w:t xml:space="preserve"> no new Initial Term applies. This Agreement runs month to month from the Commencement Date, the Landlord may end it on sixty (60) days’ written notice under section 2.3, and no early termination charge under section 2.8 is payable. Optional services already provided for twelve (12) months or more likewise continue month to month; an optional service newly added on or after the Commencement Date carries its own minimum term under section 6.2.</w:t>
+        <w:t xml:space="preserve">Continuing month to month:</w:t>
+      </w:r>
+      <w:r>
+        <w:rPr>
+          <w:rFonts w:ascii="Calibri" w:cs="Calibri" w:eastAsia="Calibri" w:hAnsi="Calibri"/>
+          <w:sz w:val="21"/>
+          <w:szCs w:val="21"/>
+        </w:rPr>
+        <w:t xml:space="preserve"> no new Initial Term applies. Where the Manager has managed the Property for twelve (12) months or more as at the Commencement Date, this Agreement runs month to month from the Commencement Date, the Landlord may end it on sixty (60) days’ written notice under section 2.3, and no early termination charge under section 2.8 is payable. Optional services already provided for twelve (12) months or more likewise continue month to month; an optional service newly added on or after the Commencement Date carries its own minimum term under section 6.2. Where the Manager has managed the Property for less than twelve (12) months, section 2.11 applies.</w:t>
       </w:r>
     </w:p>
     <w:p>
@@ -4296,15 +4294,15 @@
           <w:sz w:val="21"/>
           <w:szCs w:val="21"/>
         </w:rPr>
-        <w:t xml:space="preserve">Re-signing a landlord managed for less than twelve months.</w:t>
-      </w:r>
-      <w:r>
-        <w:rPr>
-          <w:rFonts w:ascii="Calibri" w:cs="Calibri" w:eastAsia="Calibri" w:hAnsi="Calibri"/>
-          <w:sz w:val="21"/>
-          <w:szCs w:val="21"/>
-        </w:rPr>
-        <w:t xml:space="preserve"> Where page 1 shows a re-signing and the Manager has managed the Property for less than twelve (12) months as at the Commencement Date, the Initial Term ends twelve (12) months after the date shown as “Managed since” on page 1, and not twelve months after the Commencement Date. Signing this Agreement does not restart or extend the original twelve-month commitment.</w:t>
+        <w:t xml:space="preserve">Month to month, managed for less than twelve months.</w:t>
+      </w:r>
+      <w:r>
+        <w:rPr>
+          <w:rFonts w:ascii="Calibri" w:cs="Calibri" w:eastAsia="Calibri" w:hAnsi="Calibri"/>
+          <w:sz w:val="21"/>
+          <w:szCs w:val="21"/>
+        </w:rPr>
+        <w:t xml:space="preserve"> Where page 1 shows an existing landlord continuing month to month and the Manager has managed the Property for less than twelve (12) months as at the Commencement Date, the Initial Term ends twelve (12) months after the date shown as “Managed since” on page 1, and not twelve months after the Commencement Date. Signing this Agreement does not restart or extend the original twelve-month commitment.</w:t>
       </w:r>
     </w:p>
     <w:p>
@@ -5433,7 +5431,7 @@
           <w:sz w:val="21"/>
           <w:szCs w:val="21"/>
         </w:rPr>
-        <w:t xml:space="preserve">______________ per month for the twelve (12) months following the Commencement Date. This includes an existing landlord moved to this Agreement as a new engagement under section 2.10(a). The discount ends automatically after those twelve months without further notice, does not apply to Schedule A optional service fees, and ends early if this Agreement ends.</w:t>
+        <w:t xml:space="preserve">______________ per month for the twelve (12) months following the Commencement Date. This includes an existing landlord renewing for a new term under section 2.10(a). The discount ends automatically after those twelve months without further notice, does not apply to Schedule A optional service fees, and ends early if this Agreement ends.</w:t>
       </w:r>
     </w:p>
     <w:p>

</xml_diff>

<commit_message>
Contract: only for new landlords and 12-month renewals; no month-to-month engagement type (non-renewing landlords stay on their old agreement)
Co-Authored-By: Claude Opus 5.5 <noreply@anthropic.com>
Claude-Session: https://claude.ai/code/session_01USozer2zpKfGeBovA7GUQw
</commit_message>
<xml_diff>
--- a/docs/contracts/IRep_Property_Management_Contract.docx
+++ b/docs/contracts/IRep_Property_Management_Contract.docx
@@ -100,210 +100,6 @@
         <w:t xml:space="preserve">) between the parties identified below.</w:t>
       </w:r>
     </w:p>
-    <w:tbl>
-      <w:tblPr>
-        <w:tblW w:type="dxa" w:w="9360"/>
-        <w:tblBorders>
-          <w:top w:val="single" w:color="auto" w:sz="4"/>
-          <w:left w:val="single" w:color="auto" w:sz="4"/>
-          <w:bottom w:val="single" w:color="auto" w:sz="4"/>
-          <w:right w:val="single" w:color="auto" w:sz="4"/>
-          <w:insideH w:val="single" w:color="auto" w:sz="4"/>
-          <w:insideV w:val="single" w:color="auto" w:sz="4"/>
-        </w:tblBorders>
-        <w:tblLayout w:type="fixed"/>
-      </w:tblPr>
-      <w:tblGrid>
-        <w:gridCol w:w="2340"/>
-        <w:gridCol w:w="7020"/>
-      </w:tblGrid>
-      <w:tr>
-        <w:trPr>
-          <w:cantSplit/>
-          <w:trHeight w:val="680" w:hRule="atLeast"/>
-        </w:trPr>
-        <w:tc>
-          <w:tcPr>
-            <w:tcW w:type="dxa" w:w="2340"/>
-            <w:tcBorders>
-              <w:top w:val="single" w:color="BFC9D9" w:sz="4"/>
-              <w:left w:val="single" w:color="BFC9D9" w:sz="4"/>
-              <w:bottom w:val="single" w:color="BFC9D9" w:sz="4"/>
-              <w:right w:val="single" w:color="BFC9D9" w:sz="4"/>
-            </w:tcBorders>
-            <w:shd w:fill="F3F5F9" w:color="auto" w:val="clear"/>
-            <w:tcMar>
-              <w:top w:type="dxa" w:w="60"/>
-              <w:left w:type="dxa" w:w="120"/>
-              <w:bottom w:type="dxa" w:w="60"/>
-              <w:right w:type="dxa" w:w="120"/>
-            </w:tcMar>
-            <w:vAlign w:val="top"/>
-          </w:tcPr>
-          <w:p>
-            <w:pPr>
-              <w:spacing w:after="0" w:line="240"/>
-            </w:pPr>
-            <w:r>
-              <w:rPr>
-                <w:rFonts w:ascii="Calibri" w:cs="Calibri" w:eastAsia="Calibri" w:hAnsi="Calibri"/>
-                <w:sz w:val="21"/>
-                <w:szCs w:val="21"/>
-              </w:rPr>
-              <w:t xml:space="preserve">Engagement type</w:t>
-            </w:r>
-          </w:p>
-        </w:tc>
-        <w:tc>
-          <w:tcPr>
-            <w:tcW w:type="dxa" w:w="7020"/>
-            <w:tcBorders>
-              <w:top w:val="single" w:color="BFC9D9" w:sz="4"/>
-              <w:left w:val="single" w:color="BFC9D9" w:sz="4"/>
-              <w:bottom w:val="single" w:color="BFC9D9" w:sz="4"/>
-              <w:right w:val="single" w:color="BFC9D9" w:sz="4"/>
-            </w:tcBorders>
-            <w:tcMar>
-              <w:top w:type="dxa" w:w="60"/>
-              <w:left w:type="dxa" w:w="120"/>
-              <w:bottom w:type="dxa" w:w="60"/>
-              <w:right w:type="dxa" w:w="120"/>
-            </w:tcMar>
-            <w:vAlign w:val="top"/>
-          </w:tcPr>
-          <w:p>
-            <w:pPr>
-              <w:spacing w:after="40" w:line="240"/>
-              <w:ind w:left="380"/>
-            </w:pPr>
-            <w:r>
-              <w:rPr>
-                <w:rFonts w:ascii="Calibri" w:cs="Calibri" w:eastAsia="Calibri" w:hAnsi="Calibri"/>
-                <w:color w:val="FFFFFF"/>
-                <w:sz w:val="2"/>
-                <w:szCs w:val="2"/>
-              </w:rPr>
-              <w:t xml:space="preserve">/pmeng1/</w:t>
-            </w:r>
-            <w:r>
-              <w:rPr>
-                <w:rFonts w:ascii="Calibri" w:cs="Calibri" w:eastAsia="Calibri" w:hAnsi="Calibri"/>
-                <w:sz w:val="21"/>
-                <w:szCs w:val="21"/>
-              </w:rPr>
-              <w:t xml:space="preserve">New landlord, or a renewal for a new 12-month term (s. 2.1, 2.10(a))</w:t>
-            </w:r>
-          </w:p>
-          <w:p>
-            <w:pPr>
-              <w:spacing w:after="40" w:line="240"/>
-              <w:ind w:left="380"/>
-            </w:pPr>
-            <w:r>
-              <w:rPr>
-                <w:rFonts w:ascii="Calibri" w:cs="Calibri" w:eastAsia="Calibri" w:hAnsi="Calibri"/>
-                <w:color w:val="FFFFFF"/>
-                <w:sz w:val="2"/>
-                <w:szCs w:val="2"/>
-              </w:rPr>
-              <w:t xml:space="preserve">/pmeng2/</w:t>
-            </w:r>
-            <w:r>
-              <w:rPr>
-                <w:rFonts w:ascii="Calibri" w:cs="Calibri" w:eastAsia="Calibri" w:hAnsi="Calibri"/>
-                <w:sz w:val="21"/>
-                <w:szCs w:val="21"/>
-              </w:rPr>
-              <w:t xml:space="preserve">Existing landlord continuing month to month, no new term (s. 2.10(b))</w:t>
-            </w:r>
-          </w:p>
-        </w:tc>
-      </w:tr>
-      <w:tr>
-        <w:trPr>
-          <w:cantSplit/>
-          <w:trHeight w:val="520" w:hRule="atLeast"/>
-        </w:trPr>
-        <w:tc>
-          <w:tcPr>
-            <w:tcW w:type="dxa" w:w="2340"/>
-            <w:tcBorders>
-              <w:top w:val="single" w:color="BFC9D9" w:sz="4"/>
-              <w:left w:val="single" w:color="BFC9D9" w:sz="4"/>
-              <w:bottom w:val="single" w:color="BFC9D9" w:sz="4"/>
-              <w:right w:val="single" w:color="BFC9D9" w:sz="4"/>
-            </w:tcBorders>
-            <w:shd w:fill="F3F5F9" w:color="auto" w:val="clear"/>
-            <w:tcMar>
-              <w:top w:type="dxa" w:w="60"/>
-              <w:left w:type="dxa" w:w="120"/>
-              <w:bottom w:type="dxa" w:w="60"/>
-              <w:right w:type="dxa" w:w="120"/>
-            </w:tcMar>
-            <w:vAlign w:val="top"/>
-          </w:tcPr>
-          <w:p>
-            <w:pPr>
-              <w:spacing w:after="0" w:line="240"/>
-            </w:pPr>
-            <w:r>
-              <w:rPr>
-                <w:rFonts w:ascii="Calibri" w:cs="Calibri" w:eastAsia="Calibri" w:hAnsi="Calibri"/>
-                <w:sz w:val="21"/>
-                <w:szCs w:val="21"/>
-              </w:rPr>
-              <w:t xml:space="preserve">Managed since</w:t>
-            </w:r>
-          </w:p>
-        </w:tc>
-        <w:tc>
-          <w:tcPr>
-            <w:tcW w:type="dxa" w:w="7020"/>
-            <w:tcBorders>
-              <w:top w:val="single" w:color="BFC9D9" w:sz="4"/>
-              <w:left w:val="single" w:color="BFC9D9" w:sz="4"/>
-              <w:bottom w:val="single" w:color="BFC9D9" w:sz="4"/>
-              <w:right w:val="single" w:color="BFC9D9" w:sz="4"/>
-            </w:tcBorders>
-            <w:tcMar>
-              <w:top w:type="dxa" w:w="60"/>
-              <w:left w:type="dxa" w:w="120"/>
-              <w:bottom w:type="dxa" w:w="60"/>
-              <w:right w:type="dxa" w:w="120"/>
-            </w:tcMar>
-            <w:vAlign w:val="top"/>
-          </w:tcPr>
-          <w:p>
-            <w:pPr>
-              <w:spacing w:after="0" w:line="240"/>
-            </w:pPr>
-            <w:r>
-              <w:rPr>
-                <w:rFonts w:ascii="Calibri" w:cs="Calibri" w:eastAsia="Calibri" w:hAnsi="Calibri"/>
-                <w:color w:val="FFFFFF"/>
-                <w:sz w:val="2"/>
-                <w:szCs w:val="2"/>
-              </w:rPr>
-              <w:t xml:space="preserve">/pmfms/</w:t>
-            </w:r>
-          </w:p>
-          <w:p>
-            <w:pPr>
-              <w:spacing w:after="0" w:line="240"/>
-            </w:pPr>
-            <w:r>
-              <w:rPr>
-                <w:rFonts w:ascii="Calibri" w:cs="Calibri" w:eastAsia="Calibri" w:hAnsi="Calibri"/>
-                <w:color w:val="595959"/>
-                <w:sz w:val="15"/>
-                <w:szCs w:val="15"/>
-              </w:rPr>
-              <w:t xml:space="preserve">Complete only for month to month. If under 12 months, the original term finishes first (s. 2.11).</w:t>
-            </w:r>
-          </w:p>
-        </w:tc>
-      </w:tr>
-    </w:tbl>
     <w:p>
       <w:pPr>
         <w:keepNext/>
@@ -3348,7 +3144,7 @@
           <w:sz w:val="21"/>
           <w:szCs w:val="21"/>
         </w:rPr>
-        <w:t xml:space="preserve">). Subject to sections 2.10 and 2.11, the initial term of this Agreement is twelve (12) months beginning on the Commencement Date (the </w:t>
+        <w:t xml:space="preserve">). The initial term of this Agreement is twelve (12) months beginning on the Commencement Date (the </w:t>
       </w:r>
       <w:r>
         <w:rPr>
@@ -3446,7 +3242,7 @@
           <w:sz w:val="21"/>
           <w:szCs w:val="21"/>
         </w:rPr>
-        <w:t xml:space="preserve"> After the Initial Term, or at any time where section 2.10(b) applies, the Landlord may terminate this Agreement by giving the Manager sixty (60) days’ written notice.</w:t>
+        <w:t xml:space="preserve"> After the Initial Term, the Landlord may terminate this Agreement by giving the Manager sixty (60) days’ written notice.</w:t>
       </w:r>
     </w:p>
     <w:p>
@@ -4149,32 +3945,97 @@
           <w:sz w:val="21"/>
           <w:szCs w:val="21"/>
         </w:rPr>
-        <w:t xml:space="preserve">Existing landlords.</w:t>
-      </w:r>
-      <w:r>
-        <w:rPr>
-          <w:rFonts w:ascii="Calibri" w:cs="Calibri" w:eastAsia="Calibri" w:hAnsi="Calibri"/>
-          <w:sz w:val="21"/>
-          <w:szCs w:val="21"/>
-        </w:rPr>
-        <w:t xml:space="preserve"> Where the Manager has managed the Property under an earlier agreement, the Engagement Type block on page 1 shows which of the following applies:</w:t>
+        <w:t xml:space="preserve">Existing landlords renewing.</w:t>
+      </w:r>
+      <w:r>
+        <w:rPr>
+          <w:rFonts w:ascii="Calibri" w:cs="Calibri" w:eastAsia="Calibri" w:hAnsi="Calibri"/>
+          <w:sz w:val="21"/>
+          <w:szCs w:val="21"/>
+        </w:rPr>
+        <w:t xml:space="preserve"> Where the Manager has managed the Property under an earlier agreement, this Agreement is a renewal for a new twelve (12) month Initial Term starting on the Commencement Date. The first-year discount under section 5.7 (if any) and the early termination charge under section 2.8 apply as for a new client, despite the earlier management. This Agreement replaces the earlier agreement from the Commencement Date, and the earlier agreement continues to apply until then. Amounts owing under the earlier agreement remain payable.</w:t>
+      </w:r>
+    </w:p>
+    <w:p>
+      <w:pPr>
+        <w:keepNext/>
+        <w:spacing w:after="120" w:before="200"/>
+      </w:pPr>
+      <w:r>
+        <w:rPr>
+          <w:rFonts w:ascii="Calibri" w:cs="Calibri" w:eastAsia="Calibri" w:hAnsi="Calibri"/>
+          <w:b/>
+          <w:bCs/>
+          <w:color w:val="1F3864"/>
+          <w:sz w:val="21"/>
+          <w:szCs w:val="21"/>
+        </w:rPr>
+        <w:t xml:space="preserve">3.   CORE MANAGEMENT SERVICES</w:t>
+      </w:r>
+    </w:p>
+    <w:p>
+      <w:pPr>
+        <w:spacing w:after="100" w:line="252"/>
+      </w:pPr>
+      <w:r>
+        <w:rPr>
+          <w:rFonts w:ascii="Calibri" w:cs="Calibri" w:eastAsia="Calibri" w:hAnsi="Calibri"/>
+          <w:sz w:val="21"/>
+          <w:szCs w:val="21"/>
+        </w:rPr>
+        <w:t xml:space="preserve">For the management fee set out in section 5, the Manager will provide the following services (the </w:t>
+      </w:r>
+      <w:r>
+        <w:rPr>
+          <w:rFonts w:ascii="Calibri" w:cs="Calibri" w:eastAsia="Calibri" w:hAnsi="Calibri"/>
+          <w:b/>
+          <w:bCs/>
+          <w:sz w:val="21"/>
+          <w:szCs w:val="21"/>
+        </w:rPr>
+        <w:t xml:space="preserve">"Core Services"</w:t>
+      </w:r>
+      <w:r>
+        <w:rPr>
+          <w:rFonts w:ascii="Calibri" w:cs="Calibri" w:eastAsia="Calibri" w:hAnsi="Calibri"/>
+          <w:sz w:val="21"/>
+          <w:szCs w:val="21"/>
+        </w:rPr>
+        <w:t xml:space="preserve">):</w:t>
+      </w:r>
+    </w:p>
+    <w:p>
+      <w:pPr>
+        <w:keepNext/>
+        <w:spacing w:after="60" w:before="120"/>
+      </w:pPr>
+      <w:r>
+        <w:rPr>
+          <w:rFonts w:ascii="Calibri" w:cs="Calibri" w:eastAsia="Calibri" w:hAnsi="Calibri"/>
+          <w:b/>
+          <w:bCs/>
+          <w:color w:val="1F3864"/>
+          <w:sz w:val="21"/>
+          <w:szCs w:val="21"/>
+        </w:rPr>
+        <w:t xml:space="preserve">Tenant management</w:t>
       </w:r>
     </w:p>
     <w:p>
       <w:pPr>
         <w:tabs>
-          <w:tab w:val="left" w:pos="1160"/>
+          <w:tab w:val="left" w:pos="1040"/>
         </w:tabs>
-        <w:spacing w:after="60" w:line="259"/>
-        <w:ind w:left="1160" w:hanging="440"/>
-      </w:pPr>
-      <w:r>
-        <w:rPr>
-          <w:rFonts w:ascii="Calibri" w:cs="Calibri" w:eastAsia="Calibri" w:hAnsi="Calibri"/>
-          <w:sz w:val="21"/>
-          <w:szCs w:val="21"/>
-        </w:rPr>
-        <w:t xml:space="preserve">(a)</w:t>
+        <w:spacing w:after="40" w:line="259"/>
+        <w:ind w:left="1040" w:hanging="200"/>
+      </w:pPr>
+      <w:r>
+        <w:rPr>
+          <w:rFonts w:ascii="Calibri" w:cs="Calibri" w:eastAsia="Calibri" w:hAnsi="Calibri"/>
+          <w:sz w:val="21"/>
+          <w:szCs w:val="21"/>
+        </w:rPr>
+        <w:t xml:space="preserve">–</w:t>
       </w:r>
       <w:r>
         <w:rPr>
@@ -4187,37 +4048,27 @@
       <w:r>
         <w:rPr>
           <w:rFonts w:ascii="Calibri" w:cs="Calibri" w:eastAsia="Calibri" w:hAnsi="Calibri"/>
-          <w:b/>
-          <w:bCs/>
-          <w:sz w:val="21"/>
-          <w:szCs w:val="21"/>
-        </w:rPr>
-        <w:t xml:space="preserve">Renewal for a new term:</w:t>
-      </w:r>
-      <w:r>
-        <w:rPr>
-          <w:rFonts w:ascii="Calibri" w:cs="Calibri" w:eastAsia="Calibri" w:hAnsi="Calibri"/>
-          <w:sz w:val="21"/>
-          <w:szCs w:val="21"/>
-        </w:rPr>
-        <w:t xml:space="preserve"> this Agreement starts a new twelve (12) month Initial Term on the Commencement Date. The first-year discount under section 5.7 and the early termination charge under section 2.8 apply as for a new client, despite the earlier management, and section 2.11 does not apply.</w:t>
+          <w:sz w:val="21"/>
+          <w:szCs w:val="21"/>
+        </w:rPr>
+        <w:t xml:space="preserve">Acting as the point of contact for tenants and handling day-to-day tenancy communications.</w:t>
       </w:r>
     </w:p>
     <w:p>
       <w:pPr>
         <w:tabs>
-          <w:tab w:val="left" w:pos="1160"/>
+          <w:tab w:val="left" w:pos="1040"/>
         </w:tabs>
-        <w:spacing w:after="60" w:line="259"/>
-        <w:ind w:left="1160" w:hanging="440"/>
-      </w:pPr>
-      <w:r>
-        <w:rPr>
-          <w:rFonts w:ascii="Calibri" w:cs="Calibri" w:eastAsia="Calibri" w:hAnsi="Calibri"/>
-          <w:sz w:val="21"/>
-          <w:szCs w:val="21"/>
-        </w:rPr>
-        <w:t xml:space="preserve">(b)</w:t>
+        <w:spacing w:after="40" w:line="259"/>
+        <w:ind w:left="1040" w:hanging="200"/>
+      </w:pPr>
+      <w:r>
+        <w:rPr>
+          <w:rFonts w:ascii="Calibri" w:cs="Calibri" w:eastAsia="Calibri" w:hAnsi="Calibri"/>
+          <w:sz w:val="21"/>
+          <w:szCs w:val="21"/>
+        </w:rPr>
+        <w:t xml:space="preserve">–</w:t>
       </w:r>
       <w:r>
         <w:rPr>
@@ -4230,34 +4081,719 @@
       <w:r>
         <w:rPr>
           <w:rFonts w:ascii="Calibri" w:cs="Calibri" w:eastAsia="Calibri" w:hAnsi="Calibri"/>
-          <w:b/>
-          <w:bCs/>
-          <w:sz w:val="21"/>
-          <w:szCs w:val="21"/>
-        </w:rPr>
-        <w:t xml:space="preserve">Continuing month to month:</w:t>
-      </w:r>
-      <w:r>
-        <w:rPr>
-          <w:rFonts w:ascii="Calibri" w:cs="Calibri" w:eastAsia="Calibri" w:hAnsi="Calibri"/>
-          <w:sz w:val="21"/>
-          <w:szCs w:val="21"/>
-        </w:rPr>
-        <w:t xml:space="preserve"> no new Initial Term applies. Where the Manager has managed the Property for twelve (12) months or more as at the Commencement Date, this Agreement runs month to month from the Commencement Date, the Landlord may end it on sixty (60) days’ written notice under section 2.3, and no early termination charge under section 2.8 is payable. Optional services already provided for twelve (12) months or more likewise continue month to month; an optional service newly added on or after the Commencement Date carries its own minimum term under section 6.2. Where the Manager has managed the Property for less than twelve (12) months, section 2.11 applies.</w:t>
+          <w:sz w:val="21"/>
+          <w:szCs w:val="21"/>
+        </w:rPr>
+        <w:t xml:space="preserve">Administering leases, renewals, rent increases permitted by law, and lease enforcement.</w:t>
+      </w:r>
+    </w:p>
+    <w:p>
+      <w:pPr>
+        <w:tabs>
+          <w:tab w:val="left" w:pos="1040"/>
+        </w:tabs>
+        <w:spacing w:after="40" w:line="259"/>
+        <w:ind w:left="1040" w:hanging="200"/>
+      </w:pPr>
+      <w:r>
+        <w:rPr>
+          <w:rFonts w:ascii="Calibri" w:cs="Calibri" w:eastAsia="Calibri" w:hAnsi="Calibri"/>
+          <w:sz w:val="21"/>
+          <w:szCs w:val="21"/>
+        </w:rPr>
+        <w:t xml:space="preserve">–</w:t>
+      </w:r>
+      <w:r>
+        <w:rPr>
+          <w:rFonts w:ascii="Calibri" w:cs="Calibri" w:eastAsia="Calibri" w:hAnsi="Calibri"/>
+          <w:sz w:val="21"/>
+          <w:szCs w:val="21"/>
+        </w:rPr>
+        <w:t xml:space="preserve">	</w:t>
+      </w:r>
+      <w:r>
+        <w:rPr>
+          <w:rFonts w:ascii="Calibri" w:cs="Calibri" w:eastAsia="Calibri" w:hAnsi="Calibri"/>
+          <w:sz w:val="21"/>
+          <w:szCs w:val="21"/>
+        </w:rPr>
+        <w:t xml:space="preserve">Coordinating move-ins and move-outs, key handling, and move-in / move-out condition checks.</w:t>
+      </w:r>
+    </w:p>
+    <w:p>
+      <w:pPr>
+        <w:tabs>
+          <w:tab w:val="left" w:pos="1040"/>
+        </w:tabs>
+        <w:spacing w:after="40" w:line="259"/>
+        <w:ind w:left="1040" w:hanging="200"/>
+      </w:pPr>
+      <w:r>
+        <w:rPr>
+          <w:rFonts w:ascii="Calibri" w:cs="Calibri" w:eastAsia="Calibri" w:hAnsi="Calibri"/>
+          <w:sz w:val="21"/>
+          <w:szCs w:val="21"/>
+        </w:rPr>
+        <w:t xml:space="preserve">–</w:t>
+      </w:r>
+      <w:r>
+        <w:rPr>
+          <w:rFonts w:ascii="Calibri" w:cs="Calibri" w:eastAsia="Calibri" w:hAnsi="Calibri"/>
+          <w:sz w:val="21"/>
+          <w:szCs w:val="21"/>
+        </w:rPr>
+        <w:t xml:space="preserve">	</w:t>
+      </w:r>
+      <w:r>
+        <w:rPr>
+          <w:rFonts w:ascii="Calibri" w:cs="Calibri" w:eastAsia="Calibri" w:hAnsi="Calibri"/>
+          <w:sz w:val="21"/>
+          <w:szCs w:val="21"/>
+        </w:rPr>
+        <w:t xml:space="preserve">Handling tenant complaints and disputes between occupants.</w:t>
+      </w:r>
+    </w:p>
+    <w:p>
+      <w:pPr>
+        <w:keepNext/>
+        <w:spacing w:after="60" w:before="120"/>
+      </w:pPr>
+      <w:r>
+        <w:rPr>
+          <w:rFonts w:ascii="Calibri" w:cs="Calibri" w:eastAsia="Calibri" w:hAnsi="Calibri"/>
+          <w:b/>
+          <w:bCs/>
+          <w:color w:val="1F3864"/>
+          <w:sz w:val="21"/>
+          <w:szCs w:val="21"/>
+        </w:rPr>
+        <w:t xml:space="preserve">Rent collection and accounting</w:t>
+      </w:r>
+    </w:p>
+    <w:p>
+      <w:pPr>
+        <w:tabs>
+          <w:tab w:val="left" w:pos="1040"/>
+        </w:tabs>
+        <w:spacing w:after="40" w:line="259"/>
+        <w:ind w:left="1040" w:hanging="200"/>
+      </w:pPr>
+      <w:r>
+        <w:rPr>
+          <w:rFonts w:ascii="Calibri" w:cs="Calibri" w:eastAsia="Calibri" w:hAnsi="Calibri"/>
+          <w:sz w:val="21"/>
+          <w:szCs w:val="21"/>
+        </w:rPr>
+        <w:t xml:space="preserve">–</w:t>
+      </w:r>
+      <w:r>
+        <w:rPr>
+          <w:rFonts w:ascii="Calibri" w:cs="Calibri" w:eastAsia="Calibri" w:hAnsi="Calibri"/>
+          <w:sz w:val="21"/>
+          <w:szCs w:val="21"/>
+        </w:rPr>
+        <w:t xml:space="preserve">	</w:t>
+      </w:r>
+      <w:r>
+        <w:rPr>
+          <w:rFonts w:ascii="Calibri" w:cs="Calibri" w:eastAsia="Calibri" w:hAnsi="Calibri"/>
+          <w:sz w:val="21"/>
+          <w:szCs w:val="21"/>
+        </w:rPr>
+        <w:t xml:space="preserve">Collecting rent and permitted deposits, and following up on arrears.</w:t>
+      </w:r>
+    </w:p>
+    <w:p>
+      <w:pPr>
+        <w:tabs>
+          <w:tab w:val="left" w:pos="1040"/>
+        </w:tabs>
+        <w:spacing w:after="40" w:line="259"/>
+        <w:ind w:left="1040" w:hanging="200"/>
+      </w:pPr>
+      <w:r>
+        <w:rPr>
+          <w:rFonts w:ascii="Calibri" w:cs="Calibri" w:eastAsia="Calibri" w:hAnsi="Calibri"/>
+          <w:sz w:val="21"/>
+          <w:szCs w:val="21"/>
+        </w:rPr>
+        <w:t xml:space="preserve">–</w:t>
+      </w:r>
+      <w:r>
+        <w:rPr>
+          <w:rFonts w:ascii="Calibri" w:cs="Calibri" w:eastAsia="Calibri" w:hAnsi="Calibri"/>
+          <w:sz w:val="21"/>
+          <w:szCs w:val="21"/>
+        </w:rPr>
+        <w:t xml:space="preserve">	</w:t>
+      </w:r>
+      <w:r>
+        <w:rPr>
+          <w:rFonts w:ascii="Calibri" w:cs="Calibri" w:eastAsia="Calibri" w:hAnsi="Calibri"/>
+          <w:sz w:val="21"/>
+          <w:szCs w:val="21"/>
+        </w:rPr>
+        <w:t xml:space="preserve">Maintaining rent ledgers and records of receipts and disbursements for the Property.</w:t>
+      </w:r>
+    </w:p>
+    <w:p>
+      <w:pPr>
+        <w:tabs>
+          <w:tab w:val="left" w:pos="1040"/>
+        </w:tabs>
+        <w:spacing w:after="40" w:line="259"/>
+        <w:ind w:left="1040" w:hanging="200"/>
+      </w:pPr>
+      <w:r>
+        <w:rPr>
+          <w:rFonts w:ascii="Calibri" w:cs="Calibri" w:eastAsia="Calibri" w:hAnsi="Calibri"/>
+          <w:sz w:val="21"/>
+          <w:szCs w:val="21"/>
+        </w:rPr>
+        <w:t xml:space="preserve">–</w:t>
+      </w:r>
+      <w:r>
+        <w:rPr>
+          <w:rFonts w:ascii="Calibri" w:cs="Calibri" w:eastAsia="Calibri" w:hAnsi="Calibri"/>
+          <w:sz w:val="21"/>
+          <w:szCs w:val="21"/>
+        </w:rPr>
+        <w:t xml:space="preserve">	</w:t>
+      </w:r>
+      <w:r>
+        <w:rPr>
+          <w:rFonts w:ascii="Calibri" w:cs="Calibri" w:eastAsia="Calibri" w:hAnsi="Calibri"/>
+          <w:sz w:val="21"/>
+          <w:szCs w:val="21"/>
+        </w:rPr>
+        <w:t xml:space="preserve">Providing the Landlord with a monthly statement showing rent collected, expenses deducted and the net amount remitted.</w:t>
+      </w:r>
+    </w:p>
+    <w:p>
+      <w:pPr>
+        <w:keepNext/>
+        <w:spacing w:after="60" w:before="120"/>
+      </w:pPr>
+      <w:r>
+        <w:rPr>
+          <w:rFonts w:ascii="Calibri" w:cs="Calibri" w:eastAsia="Calibri" w:hAnsi="Calibri"/>
+          <w:b/>
+          <w:bCs/>
+          <w:color w:val="1F3864"/>
+          <w:sz w:val="21"/>
+          <w:szCs w:val="21"/>
+        </w:rPr>
+        <w:t xml:space="preserve">Maintenance coordination</w:t>
+      </w:r>
+    </w:p>
+    <w:p>
+      <w:pPr>
+        <w:tabs>
+          <w:tab w:val="left" w:pos="1040"/>
+        </w:tabs>
+        <w:spacing w:after="40" w:line="259"/>
+        <w:ind w:left="1040" w:hanging="200"/>
+      </w:pPr>
+      <w:r>
+        <w:rPr>
+          <w:rFonts w:ascii="Calibri" w:cs="Calibri" w:eastAsia="Calibri" w:hAnsi="Calibri"/>
+          <w:sz w:val="21"/>
+          <w:szCs w:val="21"/>
+        </w:rPr>
+        <w:t xml:space="preserve">–</w:t>
+      </w:r>
+      <w:r>
+        <w:rPr>
+          <w:rFonts w:ascii="Calibri" w:cs="Calibri" w:eastAsia="Calibri" w:hAnsi="Calibri"/>
+          <w:sz w:val="21"/>
+          <w:szCs w:val="21"/>
+        </w:rPr>
+        <w:t xml:space="preserve">	</w:t>
+      </w:r>
+      <w:r>
+        <w:rPr>
+          <w:rFonts w:ascii="Calibri" w:cs="Calibri" w:eastAsia="Calibri" w:hAnsi="Calibri"/>
+          <w:sz w:val="21"/>
+          <w:szCs w:val="21"/>
+        </w:rPr>
+        <w:t xml:space="preserve">Receiving and triaging maintenance requests from tenants.</w:t>
+      </w:r>
+    </w:p>
+    <w:p>
+      <w:pPr>
+        <w:tabs>
+          <w:tab w:val="left" w:pos="1040"/>
+        </w:tabs>
+        <w:spacing w:after="40" w:line="259"/>
+        <w:ind w:left="1040" w:hanging="200"/>
+      </w:pPr>
+      <w:r>
+        <w:rPr>
+          <w:rFonts w:ascii="Calibri" w:cs="Calibri" w:eastAsia="Calibri" w:hAnsi="Calibri"/>
+          <w:sz w:val="21"/>
+          <w:szCs w:val="21"/>
+        </w:rPr>
+        <w:t xml:space="preserve">–</w:t>
+      </w:r>
+      <w:r>
+        <w:rPr>
+          <w:rFonts w:ascii="Calibri" w:cs="Calibri" w:eastAsia="Calibri" w:hAnsi="Calibri"/>
+          <w:sz w:val="21"/>
+          <w:szCs w:val="21"/>
+        </w:rPr>
+        <w:t xml:space="preserve">	</w:t>
+      </w:r>
+      <w:r>
+        <w:rPr>
+          <w:rFonts w:ascii="Calibri" w:cs="Calibri" w:eastAsia="Calibri" w:hAnsi="Calibri"/>
+          <w:sz w:val="21"/>
+          <w:szCs w:val="21"/>
+        </w:rPr>
+        <w:t xml:space="preserve">Dispatching and coordinating third-party trades and vendors, and authorizing work within the maintenance budget in section 9.</w:t>
+      </w:r>
+    </w:p>
+    <w:p>
+      <w:pPr>
+        <w:tabs>
+          <w:tab w:val="left" w:pos="1040"/>
+        </w:tabs>
+        <w:spacing w:after="40" w:line="259"/>
+        <w:ind w:left="1040" w:hanging="200"/>
+      </w:pPr>
+      <w:r>
+        <w:rPr>
+          <w:rFonts w:ascii="Calibri" w:cs="Calibri" w:eastAsia="Calibri" w:hAnsi="Calibri"/>
+          <w:sz w:val="21"/>
+          <w:szCs w:val="21"/>
+        </w:rPr>
+        <w:t xml:space="preserve">–</w:t>
+      </w:r>
+      <w:r>
+        <w:rPr>
+          <w:rFonts w:ascii="Calibri" w:cs="Calibri" w:eastAsia="Calibri" w:hAnsi="Calibri"/>
+          <w:sz w:val="21"/>
+          <w:szCs w:val="21"/>
+        </w:rPr>
+        <w:t xml:space="preserve">	</w:t>
+      </w:r>
+      <w:r>
+        <w:rPr>
+          <w:rFonts w:ascii="Calibri" w:cs="Calibri" w:eastAsia="Calibri" w:hAnsi="Calibri"/>
+          <w:sz w:val="21"/>
+          <w:szCs w:val="21"/>
+        </w:rPr>
+        <w:t xml:space="preserve">Obtaining quotes and seeking Landlord approval for work above the maintenance budget threshold.</w:t>
+      </w:r>
+    </w:p>
+    <w:p>
+      <w:pPr>
+        <w:tabs>
+          <w:tab w:val="left" w:pos="1040"/>
+        </w:tabs>
+        <w:spacing w:after="40" w:line="259"/>
+        <w:ind w:left="1040" w:hanging="200"/>
+      </w:pPr>
+      <w:r>
+        <w:rPr>
+          <w:rFonts w:ascii="Calibri" w:cs="Calibri" w:eastAsia="Calibri" w:hAnsi="Calibri"/>
+          <w:sz w:val="21"/>
+          <w:szCs w:val="21"/>
+        </w:rPr>
+        <w:t xml:space="preserve">–</w:t>
+      </w:r>
+      <w:r>
+        <w:rPr>
+          <w:rFonts w:ascii="Calibri" w:cs="Calibri" w:eastAsia="Calibri" w:hAnsi="Calibri"/>
+          <w:sz w:val="21"/>
+          <w:szCs w:val="21"/>
+        </w:rPr>
+        <w:t xml:space="preserve">	</w:t>
+      </w:r>
+      <w:r>
+        <w:rPr>
+          <w:rFonts w:ascii="Calibri" w:cs="Calibri" w:eastAsia="Calibri" w:hAnsi="Calibri"/>
+          <w:sz w:val="21"/>
+          <w:szCs w:val="21"/>
+        </w:rPr>
+        <w:t xml:space="preserve">Arranging work through independent contractors. The Manager does not carry out repairs or optional services itself.</w:t>
+      </w:r>
+    </w:p>
+    <w:p>
+      <w:pPr>
+        <w:keepNext/>
+        <w:spacing w:after="60" w:before="120"/>
+      </w:pPr>
+      <w:r>
+        <w:rPr>
+          <w:rFonts w:ascii="Calibri" w:cs="Calibri" w:eastAsia="Calibri" w:hAnsi="Calibri"/>
+          <w:b/>
+          <w:bCs/>
+          <w:color w:val="1F3864"/>
+          <w:sz w:val="21"/>
+          <w:szCs w:val="21"/>
+        </w:rPr>
+        <w:t xml:space="preserve">Inspections and reporting</w:t>
+      </w:r>
+    </w:p>
+    <w:p>
+      <w:pPr>
+        <w:tabs>
+          <w:tab w:val="left" w:pos="1040"/>
+        </w:tabs>
+        <w:spacing w:after="40" w:line="259"/>
+        <w:ind w:left="1040" w:hanging="200"/>
+      </w:pPr>
+      <w:r>
+        <w:rPr>
+          <w:rFonts w:ascii="Calibri" w:cs="Calibri" w:eastAsia="Calibri" w:hAnsi="Calibri"/>
+          <w:sz w:val="21"/>
+          <w:szCs w:val="21"/>
+        </w:rPr>
+        <w:t xml:space="preserve">–</w:t>
+      </w:r>
+      <w:r>
+        <w:rPr>
+          <w:rFonts w:ascii="Calibri" w:cs="Calibri" w:eastAsia="Calibri" w:hAnsi="Calibri"/>
+          <w:sz w:val="21"/>
+          <w:szCs w:val="21"/>
+        </w:rPr>
+        <w:t xml:space="preserve">	</w:t>
+      </w:r>
+      <w:r>
+        <w:rPr>
+          <w:rFonts w:ascii="Calibri" w:cs="Calibri" w:eastAsia="Calibri" w:hAnsi="Calibri"/>
+          <w:sz w:val="21"/>
+          <w:szCs w:val="21"/>
+        </w:rPr>
+        <w:t xml:space="preserve">Periodic physical check-ups of the Property, as reasonably required by the Manager.</w:t>
+      </w:r>
+    </w:p>
+    <w:p>
+      <w:pPr>
+        <w:tabs>
+          <w:tab w:val="left" w:pos="1040"/>
+        </w:tabs>
+        <w:spacing w:after="40" w:line="259"/>
+        <w:ind w:left="1040" w:hanging="200"/>
+      </w:pPr>
+      <w:r>
+        <w:rPr>
+          <w:rFonts w:ascii="Calibri" w:cs="Calibri" w:eastAsia="Calibri" w:hAnsi="Calibri"/>
+          <w:sz w:val="21"/>
+          <w:szCs w:val="21"/>
+        </w:rPr>
+        <w:t xml:space="preserve">–</w:t>
+      </w:r>
+      <w:r>
+        <w:rPr>
+          <w:rFonts w:ascii="Calibri" w:cs="Calibri" w:eastAsia="Calibri" w:hAnsi="Calibri"/>
+          <w:sz w:val="21"/>
+          <w:szCs w:val="21"/>
+        </w:rPr>
+        <w:t xml:space="preserve">	</w:t>
+      </w:r>
+      <w:r>
+        <w:rPr>
+          <w:rFonts w:ascii="Calibri" w:cs="Calibri" w:eastAsia="Calibri" w:hAnsi="Calibri"/>
+          <w:sz w:val="21"/>
+          <w:szCs w:val="21"/>
+        </w:rPr>
+        <w:t xml:space="preserve">One (1) thorough written condition report on the Property per calendar year, provided to the Landlord.</w:t>
+      </w:r>
+    </w:p>
+    <w:p>
+      <w:pPr>
+        <w:keepNext/>
+        <w:spacing w:after="60" w:before="120"/>
+      </w:pPr>
+      <w:r>
+        <w:rPr>
+          <w:rFonts w:ascii="Calibri" w:cs="Calibri" w:eastAsia="Calibri" w:hAnsi="Calibri"/>
+          <w:b/>
+          <w:bCs/>
+          <w:color w:val="1F3864"/>
+          <w:sz w:val="21"/>
+          <w:szCs w:val="21"/>
+        </w:rPr>
+        <w:t xml:space="preserve">Tenancy notices</w:t>
+      </w:r>
+    </w:p>
+    <w:p>
+      <w:pPr>
+        <w:tabs>
+          <w:tab w:val="left" w:pos="1040"/>
+        </w:tabs>
+        <w:spacing w:after="40" w:line="259"/>
+        <w:ind w:left="1040" w:hanging="200"/>
+      </w:pPr>
+      <w:r>
+        <w:rPr>
+          <w:rFonts w:ascii="Calibri" w:cs="Calibri" w:eastAsia="Calibri" w:hAnsi="Calibri"/>
+          <w:sz w:val="21"/>
+          <w:szCs w:val="21"/>
+        </w:rPr>
+        <w:t xml:space="preserve">–</w:t>
+      </w:r>
+      <w:r>
+        <w:rPr>
+          <w:rFonts w:ascii="Calibri" w:cs="Calibri" w:eastAsia="Calibri" w:hAnsi="Calibri"/>
+          <w:sz w:val="21"/>
+          <w:szCs w:val="21"/>
+        </w:rPr>
+        <w:t xml:space="preserve">	</w:t>
+      </w:r>
+      <w:r>
+        <w:rPr>
+          <w:rFonts w:ascii="Calibri" w:cs="Calibri" w:eastAsia="Calibri" w:hAnsi="Calibri"/>
+          <w:sz w:val="21"/>
+          <w:szCs w:val="21"/>
+        </w:rPr>
+        <w:t xml:space="preserve">Preparing notices under the Residential Tenancies Act, 2006 for the Landlord’s signature, serving them, and providing a Certificate of Service, as set out in section 11.</w:t>
+      </w:r>
+    </w:p>
+    <w:p>
+      <w:pPr>
+        <w:keepNext/>
+        <w:spacing w:after="120" w:before="200"/>
+      </w:pPr>
+      <w:r>
+        <w:rPr>
+          <w:rFonts w:ascii="Calibri" w:cs="Calibri" w:eastAsia="Calibri" w:hAnsi="Calibri"/>
+          <w:b/>
+          <w:bCs/>
+          <w:color w:val="1F3864"/>
+          <w:sz w:val="21"/>
+          <w:szCs w:val="21"/>
+        </w:rPr>
+        <w:t xml:space="preserve">4.   SERVICES NOT INCLUDED</w:t>
       </w:r>
     </w:p>
     <w:p>
       <w:pPr>
         <w:spacing w:after="100" w:line="252"/>
-        <w:ind w:left="720"/>
-      </w:pPr>
-      <w:r>
-        <w:rPr>
-          <w:rFonts w:ascii="Calibri" w:cs="Calibri" w:eastAsia="Calibri" w:hAnsi="Calibri"/>
-          <w:sz w:val="21"/>
-          <w:szCs w:val="21"/>
-        </w:rPr>
-        <w:t xml:space="preserve">In either case, this Agreement replaces the earlier agreement from the Commencement Date, and the earlier agreement continues to apply until then. Amounts owing under the earlier agreement remain payable.</w:t>
+      </w:pPr>
+      <w:r>
+        <w:rPr>
+          <w:rFonts w:ascii="Calibri" w:cs="Calibri" w:eastAsia="Calibri" w:hAnsi="Calibri"/>
+          <w:sz w:val="21"/>
+          <w:szCs w:val="21"/>
+        </w:rPr>
+        <w:t xml:space="preserve">The following are not included in the management fee and are provided only if selected and paid for under Schedule A, or arranged separately in writing:</w:t>
+      </w:r>
+    </w:p>
+    <w:p>
+      <w:pPr>
+        <w:tabs>
+          <w:tab w:val="left" w:pos="1040"/>
+        </w:tabs>
+        <w:spacing w:after="40" w:line="259"/>
+        <w:ind w:left="1040" w:hanging="200"/>
+      </w:pPr>
+      <w:r>
+        <w:rPr>
+          <w:rFonts w:ascii="Calibri" w:cs="Calibri" w:eastAsia="Calibri" w:hAnsi="Calibri"/>
+          <w:sz w:val="21"/>
+          <w:szCs w:val="21"/>
+        </w:rPr>
+        <w:t xml:space="preserve">–</w:t>
+      </w:r>
+      <w:r>
+        <w:rPr>
+          <w:rFonts w:ascii="Calibri" w:cs="Calibri" w:eastAsia="Calibri" w:hAnsi="Calibri"/>
+          <w:sz w:val="21"/>
+          <w:szCs w:val="21"/>
+        </w:rPr>
+        <w:t xml:space="preserve">	</w:t>
+      </w:r>
+      <w:r>
+        <w:rPr>
+          <w:rFonts w:ascii="Calibri" w:cs="Calibri" w:eastAsia="Calibri" w:hAnsi="Calibri"/>
+          <w:sz w:val="21"/>
+          <w:szCs w:val="21"/>
+        </w:rPr>
+        <w:t xml:space="preserve">Any optional service in Schedule A that is not selected.</w:t>
+      </w:r>
+    </w:p>
+    <w:p>
+      <w:pPr>
+        <w:tabs>
+          <w:tab w:val="left" w:pos="1040"/>
+        </w:tabs>
+        <w:spacing w:after="40" w:line="259"/>
+        <w:ind w:left="1040" w:hanging="200"/>
+      </w:pPr>
+      <w:r>
+        <w:rPr>
+          <w:rFonts w:ascii="Calibri" w:cs="Calibri" w:eastAsia="Calibri" w:hAnsi="Calibri"/>
+          <w:sz w:val="21"/>
+          <w:szCs w:val="21"/>
+        </w:rPr>
+        <w:t xml:space="preserve">–</w:t>
+      </w:r>
+      <w:r>
+        <w:rPr>
+          <w:rFonts w:ascii="Calibri" w:cs="Calibri" w:eastAsia="Calibri" w:hAnsi="Calibri"/>
+          <w:sz w:val="21"/>
+          <w:szCs w:val="21"/>
+        </w:rPr>
+        <w:t xml:space="preserve">	</w:t>
+      </w:r>
+      <w:r>
+        <w:rPr>
+          <w:rFonts w:ascii="Calibri" w:cs="Calibri" w:eastAsia="Calibri" w:hAnsi="Calibri"/>
+          <w:sz w:val="21"/>
+          <w:szCs w:val="21"/>
+        </w:rPr>
+        <w:t xml:space="preserve">Leasing and tenant placement (see Schedule A, Part 3).</w:t>
+      </w:r>
+    </w:p>
+    <w:p>
+      <w:pPr>
+        <w:tabs>
+          <w:tab w:val="left" w:pos="1040"/>
+        </w:tabs>
+        <w:spacing w:after="40" w:line="259"/>
+        <w:ind w:left="1040" w:hanging="200"/>
+      </w:pPr>
+      <w:r>
+        <w:rPr>
+          <w:rFonts w:ascii="Calibri" w:cs="Calibri" w:eastAsia="Calibri" w:hAnsi="Calibri"/>
+          <w:sz w:val="21"/>
+          <w:szCs w:val="21"/>
+        </w:rPr>
+        <w:t xml:space="preserve">–</w:t>
+      </w:r>
+      <w:r>
+        <w:rPr>
+          <w:rFonts w:ascii="Calibri" w:cs="Calibri" w:eastAsia="Calibri" w:hAnsi="Calibri"/>
+          <w:sz w:val="21"/>
+          <w:szCs w:val="21"/>
+        </w:rPr>
+        <w:t xml:space="preserve">	</w:t>
+      </w:r>
+      <w:r>
+        <w:rPr>
+          <w:rFonts w:ascii="Calibri" w:cs="Calibri" w:eastAsia="Calibri" w:hAnsi="Calibri"/>
+          <w:sz w:val="21"/>
+          <w:szCs w:val="21"/>
+        </w:rPr>
+        <w:t xml:space="preserve">Representation, filing or attendance at the Landlord and Tenant Board (see section 11).</w:t>
+      </w:r>
+    </w:p>
+    <w:p>
+      <w:pPr>
+        <w:tabs>
+          <w:tab w:val="left" w:pos="1040"/>
+        </w:tabs>
+        <w:spacing w:after="40" w:line="259"/>
+        <w:ind w:left="1040" w:hanging="200"/>
+      </w:pPr>
+      <w:r>
+        <w:rPr>
+          <w:rFonts w:ascii="Calibri" w:cs="Calibri" w:eastAsia="Calibri" w:hAnsi="Calibri"/>
+          <w:sz w:val="21"/>
+          <w:szCs w:val="21"/>
+        </w:rPr>
+        <w:t xml:space="preserve">–</w:t>
+      </w:r>
+      <w:r>
+        <w:rPr>
+          <w:rFonts w:ascii="Calibri" w:cs="Calibri" w:eastAsia="Calibri" w:hAnsi="Calibri"/>
+          <w:sz w:val="21"/>
+          <w:szCs w:val="21"/>
+        </w:rPr>
+        <w:t xml:space="preserve">	</w:t>
+      </w:r>
+      <w:r>
+        <w:rPr>
+          <w:rFonts w:ascii="Calibri" w:cs="Calibri" w:eastAsia="Calibri" w:hAnsi="Calibri"/>
+          <w:sz w:val="21"/>
+          <w:szCs w:val="21"/>
+        </w:rPr>
+        <w:t xml:space="preserve">Renovations, capital projects, project management of major works, and the cost of any repairs, materials or trades.</w:t>
+      </w:r>
+    </w:p>
+    <w:p>
+      <w:pPr>
+        <w:tabs>
+          <w:tab w:val="left" w:pos="1040"/>
+        </w:tabs>
+        <w:spacing w:after="40" w:line="259"/>
+        <w:ind w:left="1040" w:hanging="200"/>
+      </w:pPr>
+      <w:r>
+        <w:rPr>
+          <w:rFonts w:ascii="Calibri" w:cs="Calibri" w:eastAsia="Calibri" w:hAnsi="Calibri"/>
+          <w:sz w:val="21"/>
+          <w:szCs w:val="21"/>
+        </w:rPr>
+        <w:t xml:space="preserve">–</w:t>
+      </w:r>
+      <w:r>
+        <w:rPr>
+          <w:rFonts w:ascii="Calibri" w:cs="Calibri" w:eastAsia="Calibri" w:hAnsi="Calibri"/>
+          <w:sz w:val="21"/>
+          <w:szCs w:val="21"/>
+        </w:rPr>
+        <w:t xml:space="preserve">	</w:t>
+      </w:r>
+      <w:r>
+        <w:rPr>
+          <w:rFonts w:ascii="Calibri" w:cs="Calibri" w:eastAsia="Calibri" w:hAnsi="Calibri"/>
+          <w:sz w:val="21"/>
+          <w:szCs w:val="21"/>
+        </w:rPr>
+        <w:t xml:space="preserve">Legal, accounting, insurance, mortgage, property tax and utility obligations of the Landlord.</w:t>
+      </w:r>
+    </w:p>
+    <w:p>
+      <w:pPr>
+        <w:tabs>
+          <w:tab w:val="left" w:pos="1040"/>
+        </w:tabs>
+        <w:spacing w:after="40" w:line="259"/>
+        <w:ind w:left="1040" w:hanging="200"/>
+      </w:pPr>
+      <w:r>
+        <w:rPr>
+          <w:rFonts w:ascii="Calibri" w:cs="Calibri" w:eastAsia="Calibri" w:hAnsi="Calibri"/>
+          <w:sz w:val="21"/>
+          <w:szCs w:val="21"/>
+        </w:rPr>
+        <w:t xml:space="preserve">–</w:t>
+      </w:r>
+      <w:r>
+        <w:rPr>
+          <w:rFonts w:ascii="Calibri" w:cs="Calibri" w:eastAsia="Calibri" w:hAnsi="Calibri"/>
+          <w:sz w:val="21"/>
+          <w:szCs w:val="21"/>
+        </w:rPr>
+        <w:t xml:space="preserve">	</w:t>
+      </w:r>
+      <w:r>
+        <w:rPr>
+          <w:rFonts w:ascii="Calibri" w:cs="Calibri" w:eastAsia="Calibri" w:hAnsi="Calibri"/>
+          <w:sz w:val="21"/>
+          <w:szCs w:val="21"/>
+        </w:rPr>
+        <w:t xml:space="preserve">Payment of the Landlord’s expenses out of the Manager’s own funds.</w:t>
+      </w:r>
+    </w:p>
+    <w:p>
+      <w:pPr>
+        <w:keepNext/>
+        <w:spacing w:after="120" w:before="200"/>
+      </w:pPr>
+      <w:r>
+        <w:rPr>
+          <w:rFonts w:ascii="Calibri" w:cs="Calibri" w:eastAsia="Calibri" w:hAnsi="Calibri"/>
+          <w:b/>
+          <w:bCs/>
+          <w:color w:val="1F3864"/>
+          <w:sz w:val="21"/>
+          <w:szCs w:val="21"/>
+        </w:rPr>
+        <w:t xml:space="preserve">5.   MANAGEMENT FEE</w:t>
       </w:r>
     </w:p>
     <w:p>
@@ -4276,7 +4812,7 @@
           <w:sz w:val="21"/>
           <w:szCs w:val="21"/>
         </w:rPr>
-        <w:t xml:space="preserve">2.11</w:t>
+        <w:t xml:space="preserve">5.1</w:t>
       </w:r>
       <w:r>
         <w:rPr>
@@ -4289,860 +4825,10 @@
       <w:r>
         <w:rPr>
           <w:rFonts w:ascii="Calibri" w:cs="Calibri" w:eastAsia="Calibri" w:hAnsi="Calibri"/>
-          <w:b/>
-          <w:bCs/>
-          <w:sz w:val="21"/>
-          <w:szCs w:val="21"/>
-        </w:rPr>
-        <w:t xml:space="preserve">Month to month, managed for less than twelve months.</w:t>
-      </w:r>
-      <w:r>
-        <w:rPr>
-          <w:rFonts w:ascii="Calibri" w:cs="Calibri" w:eastAsia="Calibri" w:hAnsi="Calibri"/>
-          <w:sz w:val="21"/>
-          <w:szCs w:val="21"/>
-        </w:rPr>
-        <w:t xml:space="preserve"> Where page 1 shows an existing landlord continuing month to month and the Manager has managed the Property for less than twelve (12) months as at the Commencement Date, the Initial Term ends twelve (12) months after the date shown as “Managed since” on page 1, and not twelve months after the Commencement Date. Signing this Agreement does not restart or extend the original twelve-month commitment.</w:t>
-      </w:r>
-    </w:p>
-    <w:p>
-      <w:pPr>
-        <w:keepNext/>
-        <w:spacing w:after="120" w:before="200"/>
-      </w:pPr>
-      <w:r>
-        <w:rPr>
-          <w:rFonts w:ascii="Calibri" w:cs="Calibri" w:eastAsia="Calibri" w:hAnsi="Calibri"/>
-          <w:b/>
-          <w:bCs/>
-          <w:color w:val="1F3864"/>
-          <w:sz w:val="21"/>
-          <w:szCs w:val="21"/>
-        </w:rPr>
-        <w:t xml:space="preserve">3.   CORE MANAGEMENT SERVICES</w:t>
-      </w:r>
-    </w:p>
-    <w:p>
-      <w:pPr>
-        <w:spacing w:after="100" w:line="252"/>
-      </w:pPr>
-      <w:r>
-        <w:rPr>
-          <w:rFonts w:ascii="Calibri" w:cs="Calibri" w:eastAsia="Calibri" w:hAnsi="Calibri"/>
-          <w:sz w:val="21"/>
-          <w:szCs w:val="21"/>
-        </w:rPr>
-        <w:t xml:space="preserve">For the management fee set out in section 5, the Manager will provide the following services (the </w:t>
-      </w:r>
-      <w:r>
-        <w:rPr>
-          <w:rFonts w:ascii="Calibri" w:cs="Calibri" w:eastAsia="Calibri" w:hAnsi="Calibri"/>
-          <w:b/>
-          <w:bCs/>
-          <w:sz w:val="21"/>
-          <w:szCs w:val="21"/>
-        </w:rPr>
-        <w:t xml:space="preserve">"Core Services"</w:t>
-      </w:r>
-      <w:r>
-        <w:rPr>
-          <w:rFonts w:ascii="Calibri" w:cs="Calibri" w:eastAsia="Calibri" w:hAnsi="Calibri"/>
-          <w:sz w:val="21"/>
-          <w:szCs w:val="21"/>
-        </w:rPr>
-        <w:t xml:space="preserve">):</w:t>
-      </w:r>
-    </w:p>
-    <w:p>
-      <w:pPr>
-        <w:keepNext/>
-        <w:spacing w:after="60" w:before="120"/>
-      </w:pPr>
-      <w:r>
-        <w:rPr>
-          <w:rFonts w:ascii="Calibri" w:cs="Calibri" w:eastAsia="Calibri" w:hAnsi="Calibri"/>
-          <w:b/>
-          <w:bCs/>
-          <w:color w:val="1F3864"/>
-          <w:sz w:val="21"/>
-          <w:szCs w:val="21"/>
-        </w:rPr>
-        <w:t xml:space="preserve">Tenant management</w:t>
-      </w:r>
-    </w:p>
-    <w:p>
-      <w:pPr>
-        <w:tabs>
-          <w:tab w:val="left" w:pos="1040"/>
-        </w:tabs>
-        <w:spacing w:after="40" w:line="259"/>
-        <w:ind w:left="1040" w:hanging="200"/>
-      </w:pPr>
-      <w:r>
-        <w:rPr>
-          <w:rFonts w:ascii="Calibri" w:cs="Calibri" w:eastAsia="Calibri" w:hAnsi="Calibri"/>
-          <w:sz w:val="21"/>
-          <w:szCs w:val="21"/>
-        </w:rPr>
-        <w:t xml:space="preserve">–</w:t>
-      </w:r>
-      <w:r>
-        <w:rPr>
-          <w:rFonts w:ascii="Calibri" w:cs="Calibri" w:eastAsia="Calibri" w:hAnsi="Calibri"/>
-          <w:sz w:val="21"/>
-          <w:szCs w:val="21"/>
-        </w:rPr>
-        <w:t xml:space="preserve">	</w:t>
-      </w:r>
-      <w:r>
-        <w:rPr>
-          <w:rFonts w:ascii="Calibri" w:cs="Calibri" w:eastAsia="Calibri" w:hAnsi="Calibri"/>
-          <w:sz w:val="21"/>
-          <w:szCs w:val="21"/>
-        </w:rPr>
-        <w:t xml:space="preserve">Acting as the point of contact for tenants and handling day-to-day tenancy communications.</w:t>
-      </w:r>
-    </w:p>
-    <w:p>
-      <w:pPr>
-        <w:tabs>
-          <w:tab w:val="left" w:pos="1040"/>
-        </w:tabs>
-        <w:spacing w:after="40" w:line="259"/>
-        <w:ind w:left="1040" w:hanging="200"/>
-      </w:pPr>
-      <w:r>
-        <w:rPr>
-          <w:rFonts w:ascii="Calibri" w:cs="Calibri" w:eastAsia="Calibri" w:hAnsi="Calibri"/>
-          <w:sz w:val="21"/>
-          <w:szCs w:val="21"/>
-        </w:rPr>
-        <w:t xml:space="preserve">–</w:t>
-      </w:r>
-      <w:r>
-        <w:rPr>
-          <w:rFonts w:ascii="Calibri" w:cs="Calibri" w:eastAsia="Calibri" w:hAnsi="Calibri"/>
-          <w:sz w:val="21"/>
-          <w:szCs w:val="21"/>
-        </w:rPr>
-        <w:t xml:space="preserve">	</w:t>
-      </w:r>
-      <w:r>
-        <w:rPr>
-          <w:rFonts w:ascii="Calibri" w:cs="Calibri" w:eastAsia="Calibri" w:hAnsi="Calibri"/>
-          <w:sz w:val="21"/>
-          <w:szCs w:val="21"/>
-        </w:rPr>
-        <w:t xml:space="preserve">Administering leases, renewals, rent increases permitted by law, and lease enforcement.</w:t>
-      </w:r>
-    </w:p>
-    <w:p>
-      <w:pPr>
-        <w:tabs>
-          <w:tab w:val="left" w:pos="1040"/>
-        </w:tabs>
-        <w:spacing w:after="40" w:line="259"/>
-        <w:ind w:left="1040" w:hanging="200"/>
-      </w:pPr>
-      <w:r>
-        <w:rPr>
-          <w:rFonts w:ascii="Calibri" w:cs="Calibri" w:eastAsia="Calibri" w:hAnsi="Calibri"/>
-          <w:sz w:val="21"/>
-          <w:szCs w:val="21"/>
-        </w:rPr>
-        <w:t xml:space="preserve">–</w:t>
-      </w:r>
-      <w:r>
-        <w:rPr>
-          <w:rFonts w:ascii="Calibri" w:cs="Calibri" w:eastAsia="Calibri" w:hAnsi="Calibri"/>
-          <w:sz w:val="21"/>
-          <w:szCs w:val="21"/>
-        </w:rPr>
-        <w:t xml:space="preserve">	</w:t>
-      </w:r>
-      <w:r>
-        <w:rPr>
-          <w:rFonts w:ascii="Calibri" w:cs="Calibri" w:eastAsia="Calibri" w:hAnsi="Calibri"/>
-          <w:sz w:val="21"/>
-          <w:szCs w:val="21"/>
-        </w:rPr>
-        <w:t xml:space="preserve">Coordinating move-ins and move-outs, key handling, and move-in / move-out condition checks.</w:t>
-      </w:r>
-    </w:p>
-    <w:p>
-      <w:pPr>
-        <w:tabs>
-          <w:tab w:val="left" w:pos="1040"/>
-        </w:tabs>
-        <w:spacing w:after="40" w:line="259"/>
-        <w:ind w:left="1040" w:hanging="200"/>
-      </w:pPr>
-      <w:r>
-        <w:rPr>
-          <w:rFonts w:ascii="Calibri" w:cs="Calibri" w:eastAsia="Calibri" w:hAnsi="Calibri"/>
-          <w:sz w:val="21"/>
-          <w:szCs w:val="21"/>
-        </w:rPr>
-        <w:t xml:space="preserve">–</w:t>
-      </w:r>
-      <w:r>
-        <w:rPr>
-          <w:rFonts w:ascii="Calibri" w:cs="Calibri" w:eastAsia="Calibri" w:hAnsi="Calibri"/>
-          <w:sz w:val="21"/>
-          <w:szCs w:val="21"/>
-        </w:rPr>
-        <w:t xml:space="preserve">	</w:t>
-      </w:r>
-      <w:r>
-        <w:rPr>
-          <w:rFonts w:ascii="Calibri" w:cs="Calibri" w:eastAsia="Calibri" w:hAnsi="Calibri"/>
-          <w:sz w:val="21"/>
-          <w:szCs w:val="21"/>
-        </w:rPr>
-        <w:t xml:space="preserve">Handling tenant complaints and disputes between occupants.</w:t>
-      </w:r>
-    </w:p>
-    <w:p>
-      <w:pPr>
-        <w:keepNext/>
-        <w:spacing w:after="60" w:before="120"/>
-      </w:pPr>
-      <w:r>
-        <w:rPr>
-          <w:rFonts w:ascii="Calibri" w:cs="Calibri" w:eastAsia="Calibri" w:hAnsi="Calibri"/>
-          <w:b/>
-          <w:bCs/>
-          <w:color w:val="1F3864"/>
-          <w:sz w:val="21"/>
-          <w:szCs w:val="21"/>
-        </w:rPr>
-        <w:t xml:space="preserve">Rent collection and accounting</w:t>
-      </w:r>
-    </w:p>
-    <w:p>
-      <w:pPr>
-        <w:tabs>
-          <w:tab w:val="left" w:pos="1040"/>
-        </w:tabs>
-        <w:spacing w:after="40" w:line="259"/>
-        <w:ind w:left="1040" w:hanging="200"/>
-      </w:pPr>
-      <w:r>
-        <w:rPr>
-          <w:rFonts w:ascii="Calibri" w:cs="Calibri" w:eastAsia="Calibri" w:hAnsi="Calibri"/>
-          <w:sz w:val="21"/>
-          <w:szCs w:val="21"/>
-        </w:rPr>
-        <w:t xml:space="preserve">–</w:t>
-      </w:r>
-      <w:r>
-        <w:rPr>
-          <w:rFonts w:ascii="Calibri" w:cs="Calibri" w:eastAsia="Calibri" w:hAnsi="Calibri"/>
-          <w:sz w:val="21"/>
-          <w:szCs w:val="21"/>
-        </w:rPr>
-        <w:t xml:space="preserve">	</w:t>
-      </w:r>
-      <w:r>
-        <w:rPr>
-          <w:rFonts w:ascii="Calibri" w:cs="Calibri" w:eastAsia="Calibri" w:hAnsi="Calibri"/>
-          <w:sz w:val="21"/>
-          <w:szCs w:val="21"/>
-        </w:rPr>
-        <w:t xml:space="preserve">Collecting rent and permitted deposits, and following up on arrears.</w:t>
-      </w:r>
-    </w:p>
-    <w:p>
-      <w:pPr>
-        <w:tabs>
-          <w:tab w:val="left" w:pos="1040"/>
-        </w:tabs>
-        <w:spacing w:after="40" w:line="259"/>
-        <w:ind w:left="1040" w:hanging="200"/>
-      </w:pPr>
-      <w:r>
-        <w:rPr>
-          <w:rFonts w:ascii="Calibri" w:cs="Calibri" w:eastAsia="Calibri" w:hAnsi="Calibri"/>
-          <w:sz w:val="21"/>
-          <w:szCs w:val="21"/>
-        </w:rPr>
-        <w:t xml:space="preserve">–</w:t>
-      </w:r>
-      <w:r>
-        <w:rPr>
-          <w:rFonts w:ascii="Calibri" w:cs="Calibri" w:eastAsia="Calibri" w:hAnsi="Calibri"/>
-          <w:sz w:val="21"/>
-          <w:szCs w:val="21"/>
-        </w:rPr>
-        <w:t xml:space="preserve">	</w:t>
-      </w:r>
-      <w:r>
-        <w:rPr>
-          <w:rFonts w:ascii="Calibri" w:cs="Calibri" w:eastAsia="Calibri" w:hAnsi="Calibri"/>
-          <w:sz w:val="21"/>
-          <w:szCs w:val="21"/>
-        </w:rPr>
-        <w:t xml:space="preserve">Maintaining rent ledgers and records of receipts and disbursements for the Property.</w:t>
-      </w:r>
-    </w:p>
-    <w:p>
-      <w:pPr>
-        <w:tabs>
-          <w:tab w:val="left" w:pos="1040"/>
-        </w:tabs>
-        <w:spacing w:after="40" w:line="259"/>
-        <w:ind w:left="1040" w:hanging="200"/>
-      </w:pPr>
-      <w:r>
-        <w:rPr>
-          <w:rFonts w:ascii="Calibri" w:cs="Calibri" w:eastAsia="Calibri" w:hAnsi="Calibri"/>
-          <w:sz w:val="21"/>
-          <w:szCs w:val="21"/>
-        </w:rPr>
-        <w:t xml:space="preserve">–</w:t>
-      </w:r>
-      <w:r>
-        <w:rPr>
-          <w:rFonts w:ascii="Calibri" w:cs="Calibri" w:eastAsia="Calibri" w:hAnsi="Calibri"/>
-          <w:sz w:val="21"/>
-          <w:szCs w:val="21"/>
-        </w:rPr>
-        <w:t xml:space="preserve">	</w:t>
-      </w:r>
-      <w:r>
-        <w:rPr>
-          <w:rFonts w:ascii="Calibri" w:cs="Calibri" w:eastAsia="Calibri" w:hAnsi="Calibri"/>
-          <w:sz w:val="21"/>
-          <w:szCs w:val="21"/>
-        </w:rPr>
-        <w:t xml:space="preserve">Providing the Landlord with a monthly statement showing rent collected, expenses deducted and the net amount remitted.</w:t>
-      </w:r>
-    </w:p>
-    <w:p>
-      <w:pPr>
-        <w:keepNext/>
-        <w:spacing w:after="60" w:before="120"/>
-      </w:pPr>
-      <w:r>
-        <w:rPr>
-          <w:rFonts w:ascii="Calibri" w:cs="Calibri" w:eastAsia="Calibri" w:hAnsi="Calibri"/>
-          <w:b/>
-          <w:bCs/>
-          <w:color w:val="1F3864"/>
-          <w:sz w:val="21"/>
-          <w:szCs w:val="21"/>
-        </w:rPr>
-        <w:t xml:space="preserve">Maintenance coordination</w:t>
-      </w:r>
-    </w:p>
-    <w:p>
-      <w:pPr>
-        <w:tabs>
-          <w:tab w:val="left" w:pos="1040"/>
-        </w:tabs>
-        <w:spacing w:after="40" w:line="259"/>
-        <w:ind w:left="1040" w:hanging="200"/>
-      </w:pPr>
-      <w:r>
-        <w:rPr>
-          <w:rFonts w:ascii="Calibri" w:cs="Calibri" w:eastAsia="Calibri" w:hAnsi="Calibri"/>
-          <w:sz w:val="21"/>
-          <w:szCs w:val="21"/>
-        </w:rPr>
-        <w:t xml:space="preserve">–</w:t>
-      </w:r>
-      <w:r>
-        <w:rPr>
-          <w:rFonts w:ascii="Calibri" w:cs="Calibri" w:eastAsia="Calibri" w:hAnsi="Calibri"/>
-          <w:sz w:val="21"/>
-          <w:szCs w:val="21"/>
-        </w:rPr>
-        <w:t xml:space="preserve">	</w:t>
-      </w:r>
-      <w:r>
-        <w:rPr>
-          <w:rFonts w:ascii="Calibri" w:cs="Calibri" w:eastAsia="Calibri" w:hAnsi="Calibri"/>
-          <w:sz w:val="21"/>
-          <w:szCs w:val="21"/>
-        </w:rPr>
-        <w:t xml:space="preserve">Receiving and triaging maintenance requests from tenants.</w:t>
-      </w:r>
-    </w:p>
-    <w:p>
-      <w:pPr>
-        <w:tabs>
-          <w:tab w:val="left" w:pos="1040"/>
-        </w:tabs>
-        <w:spacing w:after="40" w:line="259"/>
-        <w:ind w:left="1040" w:hanging="200"/>
-      </w:pPr>
-      <w:r>
-        <w:rPr>
-          <w:rFonts w:ascii="Calibri" w:cs="Calibri" w:eastAsia="Calibri" w:hAnsi="Calibri"/>
-          <w:sz w:val="21"/>
-          <w:szCs w:val="21"/>
-        </w:rPr>
-        <w:t xml:space="preserve">–</w:t>
-      </w:r>
-      <w:r>
-        <w:rPr>
-          <w:rFonts w:ascii="Calibri" w:cs="Calibri" w:eastAsia="Calibri" w:hAnsi="Calibri"/>
-          <w:sz w:val="21"/>
-          <w:szCs w:val="21"/>
-        </w:rPr>
-        <w:t xml:space="preserve">	</w:t>
-      </w:r>
-      <w:r>
-        <w:rPr>
-          <w:rFonts w:ascii="Calibri" w:cs="Calibri" w:eastAsia="Calibri" w:hAnsi="Calibri"/>
-          <w:sz w:val="21"/>
-          <w:szCs w:val="21"/>
-        </w:rPr>
-        <w:t xml:space="preserve">Dispatching and coordinating third-party trades and vendors, and authorizing work within the maintenance budget in section 9.</w:t>
-      </w:r>
-    </w:p>
-    <w:p>
-      <w:pPr>
-        <w:tabs>
-          <w:tab w:val="left" w:pos="1040"/>
-        </w:tabs>
-        <w:spacing w:after="40" w:line="259"/>
-        <w:ind w:left="1040" w:hanging="200"/>
-      </w:pPr>
-      <w:r>
-        <w:rPr>
-          <w:rFonts w:ascii="Calibri" w:cs="Calibri" w:eastAsia="Calibri" w:hAnsi="Calibri"/>
-          <w:sz w:val="21"/>
-          <w:szCs w:val="21"/>
-        </w:rPr>
-        <w:t xml:space="preserve">–</w:t>
-      </w:r>
-      <w:r>
-        <w:rPr>
-          <w:rFonts w:ascii="Calibri" w:cs="Calibri" w:eastAsia="Calibri" w:hAnsi="Calibri"/>
-          <w:sz w:val="21"/>
-          <w:szCs w:val="21"/>
-        </w:rPr>
-        <w:t xml:space="preserve">	</w:t>
-      </w:r>
-      <w:r>
-        <w:rPr>
-          <w:rFonts w:ascii="Calibri" w:cs="Calibri" w:eastAsia="Calibri" w:hAnsi="Calibri"/>
-          <w:sz w:val="21"/>
-          <w:szCs w:val="21"/>
-        </w:rPr>
-        <w:t xml:space="preserve">Obtaining quotes and seeking Landlord approval for work above the maintenance budget threshold.</w:t>
-      </w:r>
-    </w:p>
-    <w:p>
-      <w:pPr>
-        <w:tabs>
-          <w:tab w:val="left" w:pos="1040"/>
-        </w:tabs>
-        <w:spacing w:after="40" w:line="259"/>
-        <w:ind w:left="1040" w:hanging="200"/>
-      </w:pPr>
-      <w:r>
-        <w:rPr>
-          <w:rFonts w:ascii="Calibri" w:cs="Calibri" w:eastAsia="Calibri" w:hAnsi="Calibri"/>
-          <w:sz w:val="21"/>
-          <w:szCs w:val="21"/>
-        </w:rPr>
-        <w:t xml:space="preserve">–</w:t>
-      </w:r>
-      <w:r>
-        <w:rPr>
-          <w:rFonts w:ascii="Calibri" w:cs="Calibri" w:eastAsia="Calibri" w:hAnsi="Calibri"/>
-          <w:sz w:val="21"/>
-          <w:szCs w:val="21"/>
-        </w:rPr>
-        <w:t xml:space="preserve">	</w:t>
-      </w:r>
-      <w:r>
-        <w:rPr>
-          <w:rFonts w:ascii="Calibri" w:cs="Calibri" w:eastAsia="Calibri" w:hAnsi="Calibri"/>
-          <w:sz w:val="21"/>
-          <w:szCs w:val="21"/>
-        </w:rPr>
-        <w:t xml:space="preserve">Arranging work through independent contractors. The Manager does not carry out repairs or optional services itself.</w:t>
-      </w:r>
-    </w:p>
-    <w:p>
-      <w:pPr>
-        <w:keepNext/>
-        <w:spacing w:after="60" w:before="120"/>
-      </w:pPr>
-      <w:r>
-        <w:rPr>
-          <w:rFonts w:ascii="Calibri" w:cs="Calibri" w:eastAsia="Calibri" w:hAnsi="Calibri"/>
-          <w:b/>
-          <w:bCs/>
-          <w:color w:val="1F3864"/>
-          <w:sz w:val="21"/>
-          <w:szCs w:val="21"/>
-        </w:rPr>
-        <w:t xml:space="preserve">Inspections and reporting</w:t>
-      </w:r>
-    </w:p>
-    <w:p>
-      <w:pPr>
-        <w:tabs>
-          <w:tab w:val="left" w:pos="1040"/>
-        </w:tabs>
-        <w:spacing w:after="40" w:line="259"/>
-        <w:ind w:left="1040" w:hanging="200"/>
-      </w:pPr>
-      <w:r>
-        <w:rPr>
-          <w:rFonts w:ascii="Calibri" w:cs="Calibri" w:eastAsia="Calibri" w:hAnsi="Calibri"/>
-          <w:sz w:val="21"/>
-          <w:szCs w:val="21"/>
-        </w:rPr>
-        <w:t xml:space="preserve">–</w:t>
-      </w:r>
-      <w:r>
-        <w:rPr>
-          <w:rFonts w:ascii="Calibri" w:cs="Calibri" w:eastAsia="Calibri" w:hAnsi="Calibri"/>
-          <w:sz w:val="21"/>
-          <w:szCs w:val="21"/>
-        </w:rPr>
-        <w:t xml:space="preserve">	</w:t>
-      </w:r>
-      <w:r>
-        <w:rPr>
-          <w:rFonts w:ascii="Calibri" w:cs="Calibri" w:eastAsia="Calibri" w:hAnsi="Calibri"/>
-          <w:sz w:val="21"/>
-          <w:szCs w:val="21"/>
-        </w:rPr>
-        <w:t xml:space="preserve">Periodic physical check-ups of the Property, as reasonably required by the Manager.</w:t>
-      </w:r>
-    </w:p>
-    <w:p>
-      <w:pPr>
-        <w:tabs>
-          <w:tab w:val="left" w:pos="1040"/>
-        </w:tabs>
-        <w:spacing w:after="40" w:line="259"/>
-        <w:ind w:left="1040" w:hanging="200"/>
-      </w:pPr>
-      <w:r>
-        <w:rPr>
-          <w:rFonts w:ascii="Calibri" w:cs="Calibri" w:eastAsia="Calibri" w:hAnsi="Calibri"/>
-          <w:sz w:val="21"/>
-          <w:szCs w:val="21"/>
-        </w:rPr>
-        <w:t xml:space="preserve">–</w:t>
-      </w:r>
-      <w:r>
-        <w:rPr>
-          <w:rFonts w:ascii="Calibri" w:cs="Calibri" w:eastAsia="Calibri" w:hAnsi="Calibri"/>
-          <w:sz w:val="21"/>
-          <w:szCs w:val="21"/>
-        </w:rPr>
-        <w:t xml:space="preserve">	</w:t>
-      </w:r>
-      <w:r>
-        <w:rPr>
-          <w:rFonts w:ascii="Calibri" w:cs="Calibri" w:eastAsia="Calibri" w:hAnsi="Calibri"/>
-          <w:sz w:val="21"/>
-          <w:szCs w:val="21"/>
-        </w:rPr>
-        <w:t xml:space="preserve">One (1) thorough written condition report on the Property per calendar year, provided to the Landlord.</w:t>
-      </w:r>
-    </w:p>
-    <w:p>
-      <w:pPr>
-        <w:keepNext/>
-        <w:spacing w:after="60" w:before="120"/>
-      </w:pPr>
-      <w:r>
-        <w:rPr>
-          <w:rFonts w:ascii="Calibri" w:cs="Calibri" w:eastAsia="Calibri" w:hAnsi="Calibri"/>
-          <w:b/>
-          <w:bCs/>
-          <w:color w:val="1F3864"/>
-          <w:sz w:val="21"/>
-          <w:szCs w:val="21"/>
-        </w:rPr>
-        <w:t xml:space="preserve">Tenancy notices</w:t>
-      </w:r>
-    </w:p>
-    <w:p>
-      <w:pPr>
-        <w:tabs>
-          <w:tab w:val="left" w:pos="1040"/>
-        </w:tabs>
-        <w:spacing w:after="40" w:line="259"/>
-        <w:ind w:left="1040" w:hanging="200"/>
-      </w:pPr>
-      <w:r>
-        <w:rPr>
-          <w:rFonts w:ascii="Calibri" w:cs="Calibri" w:eastAsia="Calibri" w:hAnsi="Calibri"/>
-          <w:sz w:val="21"/>
-          <w:szCs w:val="21"/>
-        </w:rPr>
-        <w:t xml:space="preserve">–</w:t>
-      </w:r>
-      <w:r>
-        <w:rPr>
-          <w:rFonts w:ascii="Calibri" w:cs="Calibri" w:eastAsia="Calibri" w:hAnsi="Calibri"/>
-          <w:sz w:val="21"/>
-          <w:szCs w:val="21"/>
-        </w:rPr>
-        <w:t xml:space="preserve">	</w:t>
-      </w:r>
-      <w:r>
-        <w:rPr>
-          <w:rFonts w:ascii="Calibri" w:cs="Calibri" w:eastAsia="Calibri" w:hAnsi="Calibri"/>
-          <w:sz w:val="21"/>
-          <w:szCs w:val="21"/>
-        </w:rPr>
-        <w:t xml:space="preserve">Preparing notices under the Residential Tenancies Act, 2006 for the Landlord’s signature, serving them, and providing a Certificate of Service, as set out in section 11.</w:t>
-      </w:r>
-    </w:p>
-    <w:p>
-      <w:pPr>
-        <w:keepNext/>
-        <w:spacing w:after="120" w:before="200"/>
-      </w:pPr>
-      <w:r>
-        <w:rPr>
-          <w:rFonts w:ascii="Calibri" w:cs="Calibri" w:eastAsia="Calibri" w:hAnsi="Calibri"/>
-          <w:b/>
-          <w:bCs/>
-          <w:color w:val="1F3864"/>
-          <w:sz w:val="21"/>
-          <w:szCs w:val="21"/>
-        </w:rPr>
-        <w:t xml:space="preserve">4.   SERVICES NOT INCLUDED</w:t>
-      </w:r>
-    </w:p>
-    <w:p>
-      <w:pPr>
-        <w:spacing w:after="100" w:line="252"/>
-      </w:pPr>
-      <w:r>
-        <w:rPr>
-          <w:rFonts w:ascii="Calibri" w:cs="Calibri" w:eastAsia="Calibri" w:hAnsi="Calibri"/>
-          <w:sz w:val="21"/>
-          <w:szCs w:val="21"/>
-        </w:rPr>
-        <w:t xml:space="preserve">The following are not included in the management fee and are provided only if selected and paid for under Schedule A, or arranged separately in writing:</w:t>
-      </w:r>
-    </w:p>
-    <w:p>
-      <w:pPr>
-        <w:tabs>
-          <w:tab w:val="left" w:pos="1040"/>
-        </w:tabs>
-        <w:spacing w:after="40" w:line="259"/>
-        <w:ind w:left="1040" w:hanging="200"/>
-      </w:pPr>
-      <w:r>
-        <w:rPr>
-          <w:rFonts w:ascii="Calibri" w:cs="Calibri" w:eastAsia="Calibri" w:hAnsi="Calibri"/>
-          <w:sz w:val="21"/>
-          <w:szCs w:val="21"/>
-        </w:rPr>
-        <w:t xml:space="preserve">–</w:t>
-      </w:r>
-      <w:r>
-        <w:rPr>
-          <w:rFonts w:ascii="Calibri" w:cs="Calibri" w:eastAsia="Calibri" w:hAnsi="Calibri"/>
-          <w:sz w:val="21"/>
-          <w:szCs w:val="21"/>
-        </w:rPr>
-        <w:t xml:space="preserve">	</w:t>
-      </w:r>
-      <w:r>
-        <w:rPr>
-          <w:rFonts w:ascii="Calibri" w:cs="Calibri" w:eastAsia="Calibri" w:hAnsi="Calibri"/>
-          <w:sz w:val="21"/>
-          <w:szCs w:val="21"/>
-        </w:rPr>
-        <w:t xml:space="preserve">Any optional service in Schedule A that is not selected.</w:t>
-      </w:r>
-    </w:p>
-    <w:p>
-      <w:pPr>
-        <w:tabs>
-          <w:tab w:val="left" w:pos="1040"/>
-        </w:tabs>
-        <w:spacing w:after="40" w:line="259"/>
-        <w:ind w:left="1040" w:hanging="200"/>
-      </w:pPr>
-      <w:r>
-        <w:rPr>
-          <w:rFonts w:ascii="Calibri" w:cs="Calibri" w:eastAsia="Calibri" w:hAnsi="Calibri"/>
-          <w:sz w:val="21"/>
-          <w:szCs w:val="21"/>
-        </w:rPr>
-        <w:t xml:space="preserve">–</w:t>
-      </w:r>
-      <w:r>
-        <w:rPr>
-          <w:rFonts w:ascii="Calibri" w:cs="Calibri" w:eastAsia="Calibri" w:hAnsi="Calibri"/>
-          <w:sz w:val="21"/>
-          <w:szCs w:val="21"/>
-        </w:rPr>
-        <w:t xml:space="preserve">	</w:t>
-      </w:r>
-      <w:r>
-        <w:rPr>
-          <w:rFonts w:ascii="Calibri" w:cs="Calibri" w:eastAsia="Calibri" w:hAnsi="Calibri"/>
-          <w:sz w:val="21"/>
-          <w:szCs w:val="21"/>
-        </w:rPr>
-        <w:t xml:space="preserve">Leasing and tenant placement (see Schedule A, Part 3).</w:t>
-      </w:r>
-    </w:p>
-    <w:p>
-      <w:pPr>
-        <w:tabs>
-          <w:tab w:val="left" w:pos="1040"/>
-        </w:tabs>
-        <w:spacing w:after="40" w:line="259"/>
-        <w:ind w:left="1040" w:hanging="200"/>
-      </w:pPr>
-      <w:r>
-        <w:rPr>
-          <w:rFonts w:ascii="Calibri" w:cs="Calibri" w:eastAsia="Calibri" w:hAnsi="Calibri"/>
-          <w:sz w:val="21"/>
-          <w:szCs w:val="21"/>
-        </w:rPr>
-        <w:t xml:space="preserve">–</w:t>
-      </w:r>
-      <w:r>
-        <w:rPr>
-          <w:rFonts w:ascii="Calibri" w:cs="Calibri" w:eastAsia="Calibri" w:hAnsi="Calibri"/>
-          <w:sz w:val="21"/>
-          <w:szCs w:val="21"/>
-        </w:rPr>
-        <w:t xml:space="preserve">	</w:t>
-      </w:r>
-      <w:r>
-        <w:rPr>
-          <w:rFonts w:ascii="Calibri" w:cs="Calibri" w:eastAsia="Calibri" w:hAnsi="Calibri"/>
-          <w:sz w:val="21"/>
-          <w:szCs w:val="21"/>
-        </w:rPr>
-        <w:t xml:space="preserve">Representation, filing or attendance at the Landlord and Tenant Board (see section 11).</w:t>
-      </w:r>
-    </w:p>
-    <w:p>
-      <w:pPr>
-        <w:tabs>
-          <w:tab w:val="left" w:pos="1040"/>
-        </w:tabs>
-        <w:spacing w:after="40" w:line="259"/>
-        <w:ind w:left="1040" w:hanging="200"/>
-      </w:pPr>
-      <w:r>
-        <w:rPr>
-          <w:rFonts w:ascii="Calibri" w:cs="Calibri" w:eastAsia="Calibri" w:hAnsi="Calibri"/>
-          <w:sz w:val="21"/>
-          <w:szCs w:val="21"/>
-        </w:rPr>
-        <w:t xml:space="preserve">–</w:t>
-      </w:r>
-      <w:r>
-        <w:rPr>
-          <w:rFonts w:ascii="Calibri" w:cs="Calibri" w:eastAsia="Calibri" w:hAnsi="Calibri"/>
-          <w:sz w:val="21"/>
-          <w:szCs w:val="21"/>
-        </w:rPr>
-        <w:t xml:space="preserve">	</w:t>
-      </w:r>
-      <w:r>
-        <w:rPr>
-          <w:rFonts w:ascii="Calibri" w:cs="Calibri" w:eastAsia="Calibri" w:hAnsi="Calibri"/>
-          <w:sz w:val="21"/>
-          <w:szCs w:val="21"/>
-        </w:rPr>
-        <w:t xml:space="preserve">Renovations, capital projects, project management of major works, and the cost of any repairs, materials or trades.</w:t>
-      </w:r>
-    </w:p>
-    <w:p>
-      <w:pPr>
-        <w:tabs>
-          <w:tab w:val="left" w:pos="1040"/>
-        </w:tabs>
-        <w:spacing w:after="40" w:line="259"/>
-        <w:ind w:left="1040" w:hanging="200"/>
-      </w:pPr>
-      <w:r>
-        <w:rPr>
-          <w:rFonts w:ascii="Calibri" w:cs="Calibri" w:eastAsia="Calibri" w:hAnsi="Calibri"/>
-          <w:sz w:val="21"/>
-          <w:szCs w:val="21"/>
-        </w:rPr>
-        <w:t xml:space="preserve">–</w:t>
-      </w:r>
-      <w:r>
-        <w:rPr>
-          <w:rFonts w:ascii="Calibri" w:cs="Calibri" w:eastAsia="Calibri" w:hAnsi="Calibri"/>
-          <w:sz w:val="21"/>
-          <w:szCs w:val="21"/>
-        </w:rPr>
-        <w:t xml:space="preserve">	</w:t>
-      </w:r>
-      <w:r>
-        <w:rPr>
-          <w:rFonts w:ascii="Calibri" w:cs="Calibri" w:eastAsia="Calibri" w:hAnsi="Calibri"/>
-          <w:sz w:val="21"/>
-          <w:szCs w:val="21"/>
-        </w:rPr>
-        <w:t xml:space="preserve">Legal, accounting, insurance, mortgage, property tax and utility obligations of the Landlord.</w:t>
-      </w:r>
-    </w:p>
-    <w:p>
-      <w:pPr>
-        <w:tabs>
-          <w:tab w:val="left" w:pos="1040"/>
-        </w:tabs>
-        <w:spacing w:after="40" w:line="259"/>
-        <w:ind w:left="1040" w:hanging="200"/>
-      </w:pPr>
-      <w:r>
-        <w:rPr>
-          <w:rFonts w:ascii="Calibri" w:cs="Calibri" w:eastAsia="Calibri" w:hAnsi="Calibri"/>
-          <w:sz w:val="21"/>
-          <w:szCs w:val="21"/>
-        </w:rPr>
-        <w:t xml:space="preserve">–</w:t>
-      </w:r>
-      <w:r>
-        <w:rPr>
-          <w:rFonts w:ascii="Calibri" w:cs="Calibri" w:eastAsia="Calibri" w:hAnsi="Calibri"/>
-          <w:sz w:val="21"/>
-          <w:szCs w:val="21"/>
-        </w:rPr>
-        <w:t xml:space="preserve">	</w:t>
-      </w:r>
-      <w:r>
-        <w:rPr>
-          <w:rFonts w:ascii="Calibri" w:cs="Calibri" w:eastAsia="Calibri" w:hAnsi="Calibri"/>
-          <w:sz w:val="21"/>
-          <w:szCs w:val="21"/>
-        </w:rPr>
-        <w:t xml:space="preserve">Payment of the Landlord’s expenses out of the Manager’s own funds.</w:t>
-      </w:r>
-    </w:p>
-    <w:p>
-      <w:pPr>
-        <w:keepNext/>
-        <w:spacing w:after="120" w:before="200"/>
-      </w:pPr>
-      <w:r>
-        <w:rPr>
-          <w:rFonts w:ascii="Calibri" w:cs="Calibri" w:eastAsia="Calibri" w:hAnsi="Calibri"/>
-          <w:b/>
-          <w:bCs/>
-          <w:color w:val="1F3864"/>
-          <w:sz w:val="21"/>
-          <w:szCs w:val="21"/>
-        </w:rPr>
-        <w:t xml:space="preserve">5.   MANAGEMENT FEE</w:t>
+          <w:sz w:val="21"/>
+          <w:szCs w:val="21"/>
+        </w:rPr>
+        <w:t xml:space="preserve">The base management fee is $175.00 per month for the Property, which includes the first Lease at the Property.</w:t>
       </w:r>
     </w:p>
     <w:p>
@@ -5161,7 +4847,7 @@
           <w:sz w:val="21"/>
           <w:szCs w:val="21"/>
         </w:rPr>
-        <w:t xml:space="preserve">5.1</w:t>
+        <w:t xml:space="preserve">5.2</w:t>
       </w:r>
       <w:r>
         <w:rPr>
@@ -5177,7 +4863,7 @@
           <w:sz w:val="21"/>
           <w:szCs w:val="21"/>
         </w:rPr>
-        <w:t xml:space="preserve">The base management fee is $175.00 per month for the Property, which includes the first Lease at the Property.</w:t>
+        <w:t xml:space="preserve">For each additional Lease at the Property beyond the first, the Landlord shall pay an additional $25.00 per month.</w:t>
       </w:r>
     </w:p>
     <w:p>
@@ -5196,7 +4882,7 @@
           <w:sz w:val="21"/>
           <w:szCs w:val="21"/>
         </w:rPr>
-        <w:t xml:space="preserve">5.2</w:t>
+        <w:t xml:space="preserve">5.3</w:t>
       </w:r>
       <w:r>
         <w:rPr>
@@ -5212,7 +4898,7 @@
           <w:sz w:val="21"/>
           <w:szCs w:val="21"/>
         </w:rPr>
-        <w:t xml:space="preserve">For each additional Lease at the Property beyond the first, the Landlord shall pay an additional $25.00 per month.</w:t>
+        <w:t xml:space="preserve">Example: a room-rental home with seven (7) bedrooms rented on seven (7) individual Leases is charged $175.00 for the Property and the first Lease, plus 6 × $25.00 for the remaining six Leases, for a total of $325.00 per month.</w:t>
       </w:r>
     </w:p>
     <w:p>
@@ -5231,7 +4917,7 @@
           <w:sz w:val="21"/>
           <w:szCs w:val="21"/>
         </w:rPr>
-        <w:t xml:space="preserve">5.3</w:t>
+        <w:t xml:space="preserve">5.4</w:t>
       </w:r>
       <w:r>
         <w:rPr>
@@ -5247,7 +4933,7 @@
           <w:sz w:val="21"/>
           <w:szCs w:val="21"/>
         </w:rPr>
-        <w:t xml:space="preserve">Example: a room-rental home with seven (7) bedrooms rented on seven (7) individual Leases is charged $175.00 for the Property and the first Lease, plus 6 × $25.00 for the remaining six Leases, for a total of $325.00 per month.</w:t>
+        <w:t xml:space="preserve">The management fee is a fixed monthly amount based on the number of Leases anticipated at the Property as recorded on page 2. It is payable in full each month whether or not every room or unit is rented, including while a unit is vacant, between tenants or under repair, or after a Lease has ended or been broken. There is no reduction, proration or suspension for vacancy or loss of rent, except as the Manager waives under section 5.9.</w:t>
       </w:r>
     </w:p>
     <w:p>
@@ -5266,7 +4952,7 @@
           <w:sz w:val="21"/>
           <w:szCs w:val="21"/>
         </w:rPr>
-        <w:t xml:space="preserve">5.4</w:t>
+        <w:t xml:space="preserve">5.5</w:t>
       </w:r>
       <w:r>
         <w:rPr>
@@ -5282,7 +4968,7 @@
           <w:sz w:val="21"/>
           <w:szCs w:val="21"/>
         </w:rPr>
-        <w:t xml:space="preserve">The management fee is a fixed monthly amount based on the number of Leases anticipated at the Property as recorded on page 2. It is payable in full each month whether or not every room or unit is rented, including while a unit is vacant, between tenants or under repair, or after a Lease has ended or been broken. There is no reduction, proration or suspension for vacancy or loss of rent, except as the Manager waives under section 5.9.</w:t>
+        <w:t xml:space="preserve">The management fee and all Schedule A fees are payable monthly in advance and are deducted from rent collected under section 8. If rent collected in a month is insufficient, the balance is payable by the Landlord on invoice.</w:t>
       </w:r>
     </w:p>
     <w:p>
@@ -5301,7 +4987,7 @@
           <w:sz w:val="21"/>
           <w:szCs w:val="21"/>
         </w:rPr>
-        <w:t xml:space="preserve">5.5</w:t>
+        <w:t xml:space="preserve">5.6</w:t>
       </w:r>
       <w:r>
         <w:rPr>
@@ -5317,7 +5003,7 @@
           <w:sz w:val="21"/>
           <w:szCs w:val="21"/>
         </w:rPr>
-        <w:t xml:space="preserve">The management fee and all Schedule A fees are payable monthly in advance and are deducted from rent collected under section 8. If rent collected in a month is insufficient, the balance is payable by the Landlord on invoice.</w:t>
+        <w:t xml:space="preserve">All fees in this Agreement are exclusive of HST. HST at 13% is added to all fees. Manager’s HST registration number: 72502 0143 RT0001.</w:t>
       </w:r>
     </w:p>
     <w:p>
@@ -5336,41 +5022,6 @@
           <w:sz w:val="21"/>
           <w:szCs w:val="21"/>
         </w:rPr>
-        <w:t xml:space="preserve">5.6</w:t>
-      </w:r>
-      <w:r>
-        <w:rPr>
-          <w:rFonts w:ascii="Calibri" w:cs="Calibri" w:eastAsia="Calibri" w:hAnsi="Calibri"/>
-          <w:sz w:val="21"/>
-          <w:szCs w:val="21"/>
-        </w:rPr>
-        <w:t xml:space="preserve">	</w:t>
-      </w:r>
-      <w:r>
-        <w:rPr>
-          <w:rFonts w:ascii="Calibri" w:cs="Calibri" w:eastAsia="Calibri" w:hAnsi="Calibri"/>
-          <w:sz w:val="21"/>
-          <w:szCs w:val="21"/>
-        </w:rPr>
-        <w:t xml:space="preserve">All fees in this Agreement are exclusive of HST. HST at 13% is added to all fees. Manager’s HST registration number: 72502 0143 RT0001.</w:t>
-      </w:r>
-    </w:p>
-    <w:p>
-      <w:pPr>
-        <w:tabs>
-          <w:tab w:val="left" w:pos="720"/>
-        </w:tabs>
-        <w:spacing w:after="100" w:line="252"/>
-        <w:ind w:left="720" w:hanging="720"/>
-      </w:pPr>
-      <w:r>
-        <w:rPr>
-          <w:rFonts w:ascii="Calibri" w:cs="Calibri" w:eastAsia="Calibri" w:hAnsi="Calibri"/>
-          <w:b/>
-          <w:bCs/>
-          <w:sz w:val="21"/>
-          <w:szCs w:val="21"/>
-        </w:rPr>
         <w:t xml:space="preserve">5.7</w:t>
       </w:r>
       <w:r>
@@ -5431,7 +5082,7 @@
           <w:sz w:val="21"/>
           <w:szCs w:val="21"/>
         </w:rPr>
-        <w:t xml:space="preserve">______________ per month for the twelve (12) months following the Commencement Date. This includes an existing landlord renewing for a new term under section 2.10(a). The discount ends automatically after those twelve months without further notice, does not apply to Schedule A optional service fees, and ends early if this Agreement ends.</w:t>
+        <w:t xml:space="preserve">______________ per month for the twelve (12) months following the Commencement Date. This includes an existing landlord renewing under section 2.10. The discount ends automatically after those twelve months without further notice, does not apply to Schedule A optional service fees, and ends early if this Agreement ends.</w:t>
       </w:r>
     </w:p>
     <w:p>

</xml_diff>

<commit_message>
Contract: new engagement or re-signing (new 12-month term at the agreed renewal rate); landlords who don't re-sign continue month to month at standard rates with no discount
Co-Authored-By: Claude Opus 5.5 <noreply@anthropic.com>
Claude-Session: https://claude.ai/code/session_01USozer2zpKfGeBovA7GUQw
</commit_message>
<xml_diff>
--- a/docs/contracts/IRep_Property_Management_Contract.docx
+++ b/docs/contracts/IRep_Property_Management_Contract.docx
@@ -100,6 +100,210 @@
         <w:t xml:space="preserve">) between the parties identified below.</w:t>
       </w:r>
     </w:p>
+    <w:tbl>
+      <w:tblPr>
+        <w:tblW w:type="dxa" w:w="9360"/>
+        <w:tblBorders>
+          <w:top w:val="single" w:color="auto" w:sz="4"/>
+          <w:left w:val="single" w:color="auto" w:sz="4"/>
+          <w:bottom w:val="single" w:color="auto" w:sz="4"/>
+          <w:right w:val="single" w:color="auto" w:sz="4"/>
+          <w:insideH w:val="single" w:color="auto" w:sz="4"/>
+          <w:insideV w:val="single" w:color="auto" w:sz="4"/>
+        </w:tblBorders>
+        <w:tblLayout w:type="fixed"/>
+      </w:tblPr>
+      <w:tblGrid>
+        <w:gridCol w:w="2340"/>
+        <w:gridCol w:w="7020"/>
+      </w:tblGrid>
+      <w:tr>
+        <w:trPr>
+          <w:cantSplit/>
+          <w:trHeight w:val="680" w:hRule="atLeast"/>
+        </w:trPr>
+        <w:tc>
+          <w:tcPr>
+            <w:tcW w:type="dxa" w:w="2340"/>
+            <w:tcBorders>
+              <w:top w:val="single" w:color="BFC9D9" w:sz="4"/>
+              <w:left w:val="single" w:color="BFC9D9" w:sz="4"/>
+              <w:bottom w:val="single" w:color="BFC9D9" w:sz="4"/>
+              <w:right w:val="single" w:color="BFC9D9" w:sz="4"/>
+            </w:tcBorders>
+            <w:shd w:fill="F3F5F9" w:color="auto" w:val="clear"/>
+            <w:tcMar>
+              <w:top w:type="dxa" w:w="60"/>
+              <w:left w:type="dxa" w:w="120"/>
+              <w:bottom w:type="dxa" w:w="60"/>
+              <w:right w:type="dxa" w:w="120"/>
+            </w:tcMar>
+            <w:vAlign w:val="top"/>
+          </w:tcPr>
+          <w:p>
+            <w:pPr>
+              <w:spacing w:after="0" w:line="240"/>
+            </w:pPr>
+            <w:r>
+              <w:rPr>
+                <w:rFonts w:ascii="Calibri" w:cs="Calibri" w:eastAsia="Calibri" w:hAnsi="Calibri"/>
+                <w:sz w:val="21"/>
+                <w:szCs w:val="21"/>
+              </w:rPr>
+              <w:t xml:space="preserve">Engagement type</w:t>
+            </w:r>
+          </w:p>
+        </w:tc>
+        <w:tc>
+          <w:tcPr>
+            <w:tcW w:type="dxa" w:w="7020"/>
+            <w:tcBorders>
+              <w:top w:val="single" w:color="BFC9D9" w:sz="4"/>
+              <w:left w:val="single" w:color="BFC9D9" w:sz="4"/>
+              <w:bottom w:val="single" w:color="BFC9D9" w:sz="4"/>
+              <w:right w:val="single" w:color="BFC9D9" w:sz="4"/>
+            </w:tcBorders>
+            <w:tcMar>
+              <w:top w:type="dxa" w:w="60"/>
+              <w:left w:type="dxa" w:w="120"/>
+              <w:bottom w:type="dxa" w:w="60"/>
+              <w:right w:type="dxa" w:w="120"/>
+            </w:tcMar>
+            <w:vAlign w:val="top"/>
+          </w:tcPr>
+          <w:p>
+            <w:pPr>
+              <w:spacing w:after="40" w:line="240"/>
+              <w:ind w:left="380"/>
+            </w:pPr>
+            <w:r>
+              <w:rPr>
+                <w:rFonts w:ascii="Calibri" w:cs="Calibri" w:eastAsia="Calibri" w:hAnsi="Calibri"/>
+                <w:color w:val="FFFFFF"/>
+                <w:sz w:val="2"/>
+                <w:szCs w:val="2"/>
+              </w:rPr>
+              <w:t xml:space="preserve">/pmeng1/</w:t>
+            </w:r>
+            <w:r>
+              <w:rPr>
+                <w:rFonts w:ascii="Calibri" w:cs="Calibri" w:eastAsia="Calibri" w:hAnsi="Calibri"/>
+                <w:sz w:val="21"/>
+                <w:szCs w:val="21"/>
+              </w:rPr>
+              <w:t xml:space="preserve">New engagement: a landlord we don’t currently manage (s. 2.1)</w:t>
+            </w:r>
+          </w:p>
+          <w:p>
+            <w:pPr>
+              <w:spacing w:after="40" w:line="240"/>
+              <w:ind w:left="380"/>
+            </w:pPr>
+            <w:r>
+              <w:rPr>
+                <w:rFonts w:ascii="Calibri" w:cs="Calibri" w:eastAsia="Calibri" w:hAnsi="Calibri"/>
+                <w:color w:val="FFFFFF"/>
+                <w:sz w:val="2"/>
+                <w:szCs w:val="2"/>
+              </w:rPr>
+              <w:t xml:space="preserve">/pmeng2/</w:t>
+            </w:r>
+            <w:r>
+              <w:rPr>
+                <w:rFonts w:ascii="Calibri" w:cs="Calibri" w:eastAsia="Calibri" w:hAnsi="Calibri"/>
+                <w:sz w:val="21"/>
+                <w:szCs w:val="21"/>
+              </w:rPr>
+              <w:t xml:space="preserve">Re-signing: an existing landlord, new 12-month term (s. 2.10)</w:t>
+            </w:r>
+          </w:p>
+        </w:tc>
+      </w:tr>
+      <w:tr>
+        <w:trPr>
+          <w:cantSplit/>
+          <w:trHeight w:val="520" w:hRule="atLeast"/>
+        </w:trPr>
+        <w:tc>
+          <w:tcPr>
+            <w:tcW w:type="dxa" w:w="2340"/>
+            <w:tcBorders>
+              <w:top w:val="single" w:color="BFC9D9" w:sz="4"/>
+              <w:left w:val="single" w:color="BFC9D9" w:sz="4"/>
+              <w:bottom w:val="single" w:color="BFC9D9" w:sz="4"/>
+              <w:right w:val="single" w:color="BFC9D9" w:sz="4"/>
+            </w:tcBorders>
+            <w:shd w:fill="F3F5F9" w:color="auto" w:val="clear"/>
+            <w:tcMar>
+              <w:top w:type="dxa" w:w="60"/>
+              <w:left w:type="dxa" w:w="120"/>
+              <w:bottom w:type="dxa" w:w="60"/>
+              <w:right w:type="dxa" w:w="120"/>
+            </w:tcMar>
+            <w:vAlign w:val="top"/>
+          </w:tcPr>
+          <w:p>
+            <w:pPr>
+              <w:spacing w:after="0" w:line="240"/>
+            </w:pPr>
+            <w:r>
+              <w:rPr>
+                <w:rFonts w:ascii="Calibri" w:cs="Calibri" w:eastAsia="Calibri" w:hAnsi="Calibri"/>
+                <w:sz w:val="21"/>
+                <w:szCs w:val="21"/>
+              </w:rPr>
+              <w:t xml:space="preserve">Managed since</w:t>
+            </w:r>
+          </w:p>
+        </w:tc>
+        <w:tc>
+          <w:tcPr>
+            <w:tcW w:type="dxa" w:w="7020"/>
+            <w:tcBorders>
+              <w:top w:val="single" w:color="BFC9D9" w:sz="4"/>
+              <w:left w:val="single" w:color="BFC9D9" w:sz="4"/>
+              <w:bottom w:val="single" w:color="BFC9D9" w:sz="4"/>
+              <w:right w:val="single" w:color="BFC9D9" w:sz="4"/>
+            </w:tcBorders>
+            <w:tcMar>
+              <w:top w:type="dxa" w:w="60"/>
+              <w:left w:type="dxa" w:w="120"/>
+              <w:bottom w:type="dxa" w:w="60"/>
+              <w:right w:type="dxa" w:w="120"/>
+            </w:tcMar>
+            <w:vAlign w:val="top"/>
+          </w:tcPr>
+          <w:p>
+            <w:pPr>
+              <w:spacing w:after="0" w:line="240"/>
+            </w:pPr>
+            <w:r>
+              <w:rPr>
+                <w:rFonts w:ascii="Calibri" w:cs="Calibri" w:eastAsia="Calibri" w:hAnsi="Calibri"/>
+                <w:color w:val="FFFFFF"/>
+                <w:sz w:val="2"/>
+                <w:szCs w:val="2"/>
+              </w:rPr>
+              <w:t xml:space="preserve">/pmfms/</w:t>
+            </w:r>
+          </w:p>
+          <w:p>
+            <w:pPr>
+              <w:spacing w:after="0" w:line="240"/>
+            </w:pPr>
+            <w:r>
+              <w:rPr>
+                <w:rFonts w:ascii="Calibri" w:cs="Calibri" w:eastAsia="Calibri" w:hAnsi="Calibri"/>
+                <w:color w:val="595959"/>
+                <w:sz w:val="15"/>
+                <w:szCs w:val="15"/>
+              </w:rPr>
+              <w:t xml:space="preserve">Complete when re-signing: the date the Manager began managing the Property.</w:t>
+            </w:r>
+          </w:p>
+        </w:tc>
+      </w:tr>
+    </w:tbl>
     <w:p>
       <w:pPr>
         <w:keepNext/>
@@ -3194,10 +3398,20 @@
       <w:r>
         <w:rPr>
           <w:rFonts w:ascii="Calibri" w:cs="Calibri" w:eastAsia="Calibri" w:hAnsi="Calibri"/>
-          <w:sz w:val="21"/>
-          <w:szCs w:val="21"/>
-        </w:rPr>
-        <w:t xml:space="preserve">At the end of the Initial Term this Agreement continues automatically on a month-to-month basis on the same terms until terminated in accordance with this section.</w:t>
+          <w:b/>
+          <w:bCs/>
+          <w:sz w:val="21"/>
+          <w:szCs w:val="21"/>
+        </w:rPr>
+        <w:t xml:space="preserve">After the Initial Term.</w:t>
+      </w:r>
+      <w:r>
+        <w:rPr>
+          <w:rFonts w:ascii="Calibri" w:cs="Calibri" w:eastAsia="Calibri" w:hAnsi="Calibri"/>
+          <w:sz w:val="21"/>
+          <w:szCs w:val="21"/>
+        </w:rPr>
+        <w:t xml:space="preserve"> At the end of the Initial Term, the Landlord may re-sign for a new twelve (12) month term at the rates agreed with the Manager. If the Landlord does not re-sign, this Agreement continues automatically on a month-to-month basis on the same terms, except that the management fee and all Schedule A fees are charged at the Manager’s standard rates in effect at that time, as notified to the Landlord in writing, and no discount applies.</w:t>
       </w:r>
     </w:p>
     <w:p>
@@ -3945,15 +4159,15 @@
           <w:sz w:val="21"/>
           <w:szCs w:val="21"/>
         </w:rPr>
-        <w:t xml:space="preserve">Existing landlords renewing.</w:t>
-      </w:r>
-      <w:r>
-        <w:rPr>
-          <w:rFonts w:ascii="Calibri" w:cs="Calibri" w:eastAsia="Calibri" w:hAnsi="Calibri"/>
-          <w:sz w:val="21"/>
-          <w:szCs w:val="21"/>
-        </w:rPr>
-        <w:t xml:space="preserve"> Where the Manager has managed the Property under an earlier agreement, this Agreement is a renewal for a new twelve (12) month Initial Term starting on the Commencement Date. The first-year discount under section 5.7 (if any) and the early termination charge under section 2.8 apply as for a new client, despite the earlier management. This Agreement replaces the earlier agreement from the Commencement Date, and the earlier agreement continues to apply until then. Amounts owing under the earlier agreement remain payable.</w:t>
+        <w:t xml:space="preserve">Re-signing an existing landlord.</w:t>
+      </w:r>
+      <w:r>
+        <w:rPr>
+          <w:rFonts w:ascii="Calibri" w:cs="Calibri" w:eastAsia="Calibri" w:hAnsi="Calibri"/>
+          <w:sz w:val="21"/>
+          <w:szCs w:val="21"/>
+        </w:rPr>
+        <w:t xml:space="preserve"> Where page 1 shows a re-signing, the Landlord is an existing client of the Manager re-signing for a new twelve (12) month term, which is the Initial Term of this Agreement and begins on the Commencement Date. A re-signing is not a new engagement: the fees are those in Schedule A, at the rates agreed with the Manager before renewal, and any discount under section 5.7 is the renewal rate so agreed. The early termination charge under section 2.8 applies. This Agreement replaces the earlier agreement from the Commencement Date, and the earlier agreement continues to apply until then. Amounts owing under the earlier agreement remain payable.</w:t>
       </w:r>
     </w:p>
     <w:p>
@@ -5040,7 +5254,7 @@
           <w:sz w:val="21"/>
           <w:szCs w:val="21"/>
         </w:rPr>
-        <w:t xml:space="preserve">First-year discount (if applicable).</w:t>
+        <w:t xml:space="preserve">Discount (if applicable).</w:t>
       </w:r>
       <w:r>
         <w:rPr>
@@ -5082,7 +5296,7 @@
           <w:sz w:val="21"/>
           <w:szCs w:val="21"/>
         </w:rPr>
-        <w:t xml:space="preserve">______________ per month for the twelve (12) months following the Commencement Date. This includes an existing landlord renewing under section 2.10. The discount ends automatically after those twelve months without further notice, does not apply to Schedule A optional service fees, and ends early if this Agreement ends.</w:t>
+        <w:t xml:space="preserve">______________ per month for the twelve (12) months following the Commencement Date: for a new engagement, as a first-year promotion; for a re-signing under section 2.10, as the renewal rate agreed with the Manager. The discount ends automatically after those twelve months without further notice, does not apply to Schedule A optional service fees, does not apply to any month-to-month continuation under section 2.2, and ends early if this Agreement ends.</w:t>
       </w:r>
     </w:p>
     <w:p>
@@ -11135,7 +11349,7 @@
                 <w:sz w:val="21"/>
                 <w:szCs w:val="21"/>
               </w:rPr>
-              <w:t xml:space="preserve">Less first-year discount, if any (section 5.7)</w:t>
+              <w:t xml:space="preserve">Less discount, if any (section 5.7)</w:t>
             </w:r>
           </w:p>
         </w:tc>

</xml_diff>

<commit_message>
Contract page 1: managed-since note in the label
Co-Authored-By: Claude Opus 5.5 <noreply@anthropic.com>
Claude-Session: https://claude.ai/code/session_01USozer2zpKfGeBovA7GUQw
</commit_message>
<xml_diff>
--- a/docs/contracts/IRep_Property_Management_Contract.docx
+++ b/docs/contracts/IRep_Property_Management_Contract.docx
@@ -222,7 +222,7 @@
       <w:tr>
         <w:trPr>
           <w:cantSplit/>
-          <w:trHeight w:val="520" w:hRule="atLeast"/>
+          <w:trHeight w:val="480" w:hRule="atLeast"/>
         </w:trPr>
         <w:tc>
           <w:tcPr>
@@ -252,7 +252,16 @@
                 <w:sz w:val="21"/>
                 <w:szCs w:val="21"/>
               </w:rPr>
-              <w:t xml:space="preserve">Managed since</w:t>
+              <w:t xml:space="preserve">Managed since </w:t>
+            </w:r>
+            <w:r>
+              <w:rPr>
+                <w:rFonts w:ascii="Calibri" w:cs="Calibri" w:eastAsia="Calibri" w:hAnsi="Calibri"/>
+                <w:color w:val="595959"/>
+                <w:sz w:val="15"/>
+                <w:szCs w:val="15"/>
+              </w:rPr>
+              <w:t xml:space="preserve">(re-signing only)</w:t>
             </w:r>
           </w:p>
         </w:tc>
@@ -285,20 +294,6 @@
                 <w:szCs w:val="2"/>
               </w:rPr>
               <w:t xml:space="preserve">/pmfms/</w:t>
-            </w:r>
-          </w:p>
-          <w:p>
-            <w:pPr>
-              <w:spacing w:after="0" w:line="240"/>
-            </w:pPr>
-            <w:r>
-              <w:rPr>
-                <w:rFonts w:ascii="Calibri" w:cs="Calibri" w:eastAsia="Calibri" w:hAnsi="Calibri"/>
-                <w:color w:val="595959"/>
-                <w:sz w:val="15"/>
-                <w:szCs w:val="15"/>
-              </w:rPr>
-              <w:t xml:space="preserve">Complete when re-signing: the date the Manager began managing the Property.</w:t>
             </w:r>
           </w:p>
         </w:tc>

</xml_diff>